<commit_message>
slidegen and sow work
</commit_message>
<xml_diff>
--- a/chatgpt/ts-eng-asst/dist/sellside-engagement-letter.docx
+++ b/chatgpt/ts-eng-asst/dist/sellside-engagement-letter.docx
@@ -328,7 +328,8 @@
       <w:r>
         <w:rPr>
           <w:rStyle w:val="CommentReference"/>
-          <w:rFonts w:ascii="Times New Roman" w:hAnsi="Times New Roman"/>
+          <w:rFonts w:asciiTheme="minorHAnsi" w:hAnsiTheme="minorHAnsi" w:cstheme="minorHAnsi"/>
+          <w:sz w:val="20"/>
         </w:rPr>
         <w:commentReference w:id="1"/>
       </w:r>
@@ -351,266 +352,300 @@
           <w:rFonts w:asciiTheme="minorHAnsi" w:hAnsiTheme="minorHAnsi" w:cstheme="minorHAnsi"/>
           <w:sz w:val="20"/>
         </w:rPr>
-        <w:t xml:space="preserve"> (“</w:t>
-      </w:r>
-      <w:r>
+        <w:t xml:space="preserve"> </w:t>
+      </w:r>
+      <w:r>
+        <w:rPr>
+          <w:rFonts w:asciiTheme="minorHAnsi" w:hAnsiTheme="minorHAnsi" w:cstheme="minorHAnsi"/>
+          <w:sz w:val="20"/>
+        </w:rPr>
+        <w:t>{{PROJECT_CODE_NAME}}</w:t>
+      </w:r>
+      <w:r>
+        <w:rPr>
+          <w:rFonts w:asciiTheme="minorHAnsi" w:hAnsiTheme="minorHAnsi" w:cstheme="minorHAnsi"/>
+          <w:sz w:val="20"/>
+        </w:rPr>
+        <w:t xml:space="preserve">. </w:t>
+      </w:r>
+      <w:r>
+        <w:rPr>
+          <w:rFonts w:asciiTheme="minorHAnsi" w:hAnsiTheme="minorHAnsi" w:cstheme="minorHAnsi"/>
+          <w:sz w:val="20"/>
+        </w:rPr>
+        <w:t xml:space="preserve">The following describes the objectives of our engagement and the nature of the </w:t>
+      </w:r>
+      <w:r>
+        <w:rPr>
+          <w:rFonts w:asciiTheme="minorHAnsi" w:hAnsiTheme="minorHAnsi" w:cstheme="minorHAnsi"/>
+          <w:sz w:val="20"/>
+        </w:rPr>
+        <w:t>services we will provide.</w:t>
+      </w:r>
+    </w:p>
+    <w:p>
+      <w:pPr>
+        <w:pStyle w:val="BodyText"/>
+        <w:spacing w:line="260" w:lineRule="exact"/>
+        <w:jc w:val="both"/>
         <w:rPr>
           <w:rFonts w:asciiTheme="minorHAnsi" w:hAnsiTheme="minorHAnsi" w:cstheme="minorHAnsi"/>
           <w:b/>
           <w:bCs/>
           <w:sz w:val="20"/>
         </w:rPr>
-        <w:t>Project XYZ</w:t>
-      </w:r>
-      <w:r>
-        <w:rPr>
-          <w:rFonts w:asciiTheme="minorHAnsi" w:hAnsiTheme="minorHAnsi" w:cstheme="minorHAnsi"/>
-          <w:sz w:val="20"/>
-        </w:rPr>
-        <w:t xml:space="preserve">”). </w:t>
-      </w:r>
-      <w:r>
-        <w:rPr>
-          <w:rFonts w:asciiTheme="minorHAnsi" w:hAnsiTheme="minorHAnsi" w:cstheme="minorHAnsi"/>
-          <w:sz w:val="20"/>
-        </w:rPr>
-        <w:t xml:space="preserve">The following describes the objectives of our engagement and the nature of the </w:t>
-      </w:r>
-      <w:r>
-        <w:rPr>
-          <w:rFonts w:asciiTheme="minorHAnsi" w:hAnsiTheme="minorHAnsi" w:cstheme="minorHAnsi"/>
-          <w:sz w:val="20"/>
-        </w:rPr>
-        <w:t>services we will provide.</w:t>
-      </w:r>
-    </w:p>
-    <w:p>
-      <w:pPr>
-        <w:pStyle w:val="BodyText"/>
-        <w:spacing w:line="260" w:lineRule="exact"/>
-        <w:jc w:val="both"/>
+      </w:pPr>
+      <w:r>
         <w:rPr>
           <w:rFonts w:asciiTheme="minorHAnsi" w:hAnsiTheme="minorHAnsi" w:cstheme="minorHAnsi"/>
           <w:b/>
           <w:bCs/>
           <w:sz w:val="20"/>
         </w:rPr>
-      </w:pPr>
-      <w:r>
+        <w:t>Objective</w:t>
+      </w:r>
+    </w:p>
+    <w:p>
+      <w:pPr>
+        <w:pStyle w:val="BodyText"/>
+        <w:spacing w:line="260" w:lineRule="exact"/>
+        <w:jc w:val="both"/>
+        <w:rPr>
+          <w:rFonts w:asciiTheme="minorHAnsi" w:hAnsiTheme="minorHAnsi" w:cstheme="minorHAnsi"/>
+          <w:sz w:val="20"/>
+        </w:rPr>
+      </w:pPr>
+      <w:r>
+        <w:rPr>
+          <w:rFonts w:asciiTheme="minorHAnsi" w:hAnsiTheme="minorHAnsi" w:cstheme="minorHAnsi"/>
+          <w:sz w:val="20"/>
+        </w:rPr>
+        <w:t xml:space="preserve">Our objective is to assist you as you evaluate potential strategic alternatives relating to Project </w:t>
+      </w:r>
+      <w:bookmarkStart w:id="2" w:name="OLE_LINK8"/>
+      <w:r>
+        <w:rPr>
+          <w:rFonts w:asciiTheme="minorHAnsi" w:hAnsiTheme="minorHAnsi" w:cstheme="minorHAnsi"/>
+          <w:sz w:val="20"/>
+        </w:rPr>
+        <w:t>{{PROJECT_CODE_NAME}}</w:t>
+      </w:r>
+      <w:r>
+        <w:rPr>
+          <w:rFonts w:asciiTheme="minorHAnsi" w:hAnsiTheme="minorHAnsi" w:cstheme="minorHAnsi"/>
+          <w:sz w:val="20"/>
+        </w:rPr>
+        <w:t xml:space="preserve">. </w:t>
+      </w:r>
+      <w:bookmarkEnd w:id="2"/>
+      <w:r>
+        <w:rPr>
+          <w:rFonts w:asciiTheme="minorHAnsi" w:hAnsiTheme="minorHAnsi" w:cstheme="minorHAnsi"/>
+          <w:sz w:val="20"/>
+        </w:rPr>
+        <w:t xml:space="preserve">In this regard, we will read certain financial and other information to be provided by </w:t>
+      </w:r>
+      <w:r>
+        <w:rPr>
+          <w:rFonts w:asciiTheme="minorHAnsi" w:hAnsiTheme="minorHAnsi" w:cstheme="minorHAnsi"/>
+          <w:sz w:val="20"/>
+        </w:rPr>
+        <w:t>{{CHOICE_CLIENT_OR_TARGET}}</w:t>
+      </w:r>
+      <w:r>
+        <w:rPr>
+          <w:rFonts w:asciiTheme="minorHAnsi" w:hAnsiTheme="minorHAnsi" w:cstheme="minorHAnsi"/>
+          <w:sz w:val="20"/>
+        </w:rPr>
+        <w:t xml:space="preserve">, apply certain analytical tools to the information provided, and perform such other procedures requested directed toward those business activities and related financial data you have identified as important to your proposed project. The engagement team providing services to you under this engagement letter will provide you with an objective assessment of </w:t>
+      </w:r>
+      <w:r>
+        <w:rPr>
+          <w:rFonts w:asciiTheme="minorHAnsi" w:hAnsiTheme="minorHAnsi" w:cstheme="minorHAnsi"/>
+          <w:sz w:val="20"/>
+        </w:rPr>
+        <w:t xml:space="preserve">the underlying financial performance of </w:t>
+      </w:r>
+      <w:r>
+        <w:rPr>
+          <w:rFonts w:asciiTheme="minorHAnsi" w:hAnsiTheme="minorHAnsi" w:cstheme="minorHAnsi"/>
+          <w:sz w:val="20"/>
+        </w:rPr>
+        <w:t>{{CHOICE_CLIENT_OR_TARGET}}</w:t>
+      </w:r>
+      <w:r>
+        <w:rPr>
+          <w:rFonts w:asciiTheme="minorHAnsi" w:hAnsiTheme="minorHAnsi" w:cstheme="minorHAnsi"/>
+          <w:sz w:val="20"/>
+        </w:rPr>
+        <w:t xml:space="preserve"> (i.e. including both positive and negative considerations identified) and deliverables will reflect that assessment based upon the results of the procedures performed and the knowledge and experience of the KPMG team members serving you on this engagement.</w:t>
+      </w:r>
+    </w:p>
+    <w:p>
+      <w:pPr>
+        <w:pStyle w:val="BodyText"/>
+        <w:spacing w:line="260" w:lineRule="exact"/>
+        <w:jc w:val="both"/>
         <w:rPr>
           <w:rFonts w:asciiTheme="minorHAnsi" w:hAnsiTheme="minorHAnsi" w:cstheme="minorHAnsi"/>
           <w:b/>
           <w:bCs/>
           <w:sz w:val="20"/>
         </w:rPr>
-        <w:t>Objective</w:t>
-      </w:r>
-    </w:p>
-    <w:p>
-      <w:pPr>
-        <w:pStyle w:val="BodyText"/>
-        <w:spacing w:line="260" w:lineRule="exact"/>
-        <w:jc w:val="both"/>
-        <w:rPr>
-          <w:rFonts w:asciiTheme="minorHAnsi" w:hAnsiTheme="minorHAnsi" w:cstheme="minorHAnsi"/>
-          <w:sz w:val="20"/>
-        </w:rPr>
-      </w:pPr>
-      <w:r>
-        <w:rPr>
-          <w:rFonts w:asciiTheme="minorHAnsi" w:hAnsiTheme="minorHAnsi" w:cstheme="minorHAnsi"/>
-          <w:sz w:val="20"/>
-        </w:rPr>
-        <w:t xml:space="preserve">Our objective is to assist you as you evaluate potential strategic alternatives relating to Project </w:t>
-      </w:r>
-      <w:r>
-        <w:rPr>
-          <w:rFonts w:asciiTheme="minorHAnsi" w:hAnsiTheme="minorHAnsi" w:cstheme="minorHAnsi"/>
-          <w:sz w:val="20"/>
-        </w:rPr>
-        <w:t>{{PROJECT_CODE_NAME}}</w:t>
-      </w:r>
-      <w:r>
-        <w:rPr>
-          <w:rFonts w:asciiTheme="minorHAnsi" w:hAnsiTheme="minorHAnsi" w:cstheme="minorHAnsi"/>
-          <w:sz w:val="20"/>
-        </w:rPr>
-        <w:t xml:space="preserve">. In this regard, we will read certain financial and other information to be provided by </w:t>
-      </w:r>
-      <w:r>
-        <w:rPr>
-          <w:rFonts w:asciiTheme="minorHAnsi" w:hAnsiTheme="minorHAnsi" w:cstheme="minorHAnsi"/>
-          <w:sz w:val="20"/>
-        </w:rPr>
-        <w:t>{{CHOICE_CLIENT_OR_TARGET}}</w:t>
-      </w:r>
-      <w:r>
-        <w:rPr>
-          <w:rFonts w:asciiTheme="minorHAnsi" w:hAnsiTheme="minorHAnsi" w:cstheme="minorHAnsi"/>
-          <w:sz w:val="20"/>
-        </w:rPr>
-        <w:t xml:space="preserve">, apply certain analytical tools to the information provided, and perform such other procedures requested directed toward those business activities and related financial data you have identified as important to your proposed project. The engagement team providing services to you under this engagement letter will provide you with an objective assessment of </w:t>
-      </w:r>
-      <w:r>
-        <w:rPr>
-          <w:rFonts w:asciiTheme="minorHAnsi" w:hAnsiTheme="minorHAnsi" w:cstheme="minorHAnsi"/>
-          <w:sz w:val="20"/>
-        </w:rPr>
-        <w:t xml:space="preserve">the underlying financial performance of </w:t>
-      </w:r>
-      <w:r>
-        <w:rPr>
-          <w:rFonts w:asciiTheme="minorHAnsi" w:hAnsiTheme="minorHAnsi" w:cstheme="minorHAnsi"/>
-          <w:sz w:val="20"/>
-        </w:rPr>
-        <w:t>{{CHOICE_CLIENT_OR_TARGET}}</w:t>
-      </w:r>
-      <w:r>
-        <w:rPr>
-          <w:rFonts w:asciiTheme="minorHAnsi" w:hAnsiTheme="minorHAnsi" w:cstheme="minorHAnsi"/>
-          <w:sz w:val="20"/>
-        </w:rPr>
-        <w:t xml:space="preserve"> (i.e. including both positive and negative considerations identified) and deliverables will reflect that assessment based upon the results of the procedures performed and the knowledge and experience of the KPMG team members serving you on this engagement.</w:t>
-      </w:r>
-    </w:p>
-    <w:p>
-      <w:pPr>
-        <w:pStyle w:val="BodyText"/>
-        <w:spacing w:line="260" w:lineRule="exact"/>
-        <w:jc w:val="both"/>
+      </w:pPr>
+      <w:r>
         <w:rPr>
           <w:rFonts w:asciiTheme="minorHAnsi" w:hAnsiTheme="minorHAnsi" w:cstheme="minorHAnsi"/>
           <w:b/>
           <w:bCs/>
           <w:sz w:val="20"/>
         </w:rPr>
-      </w:pPr>
-      <w:r>
+        <w:t>Nature of Engagement and Scope of Procedures</w:t>
+      </w:r>
+    </w:p>
+    <w:p>
+      <w:pPr>
+        <w:pStyle w:val="BodyText"/>
+        <w:spacing w:line="260" w:lineRule="exact"/>
+        <w:jc w:val="both"/>
+        <w:rPr>
+          <w:rFonts w:asciiTheme="minorHAnsi" w:hAnsiTheme="minorHAnsi" w:cstheme="minorHAnsi"/>
+          <w:sz w:val="20"/>
+        </w:rPr>
+      </w:pPr>
+      <w:r>
+        <w:rPr>
+          <w:rFonts w:asciiTheme="minorHAnsi" w:hAnsiTheme="minorHAnsi" w:cstheme="minorHAnsi"/>
+          <w:sz w:val="20"/>
+        </w:rPr>
+        <w:t>The nature of this engagement consists of providing professional due diligence services in connection with your proposed divestment of Target. Such services will include preparing analyses and providing our insight, observations, and recommendations in those areas you have identified as important to your proposed divestment decision.</w:t>
+      </w:r>
+    </w:p>
+    <w:p>
+      <w:pPr>
+        <w:pStyle w:val="BodyText"/>
+        <w:spacing w:line="260" w:lineRule="exact"/>
+        <w:jc w:val="both"/>
+        <w:rPr>
+          <w:rFonts w:asciiTheme="minorHAnsi" w:hAnsiTheme="minorHAnsi" w:cstheme="minorHAnsi"/>
+          <w:sz w:val="20"/>
+        </w:rPr>
+      </w:pPr>
+      <w:r>
+        <w:rPr>
+          <w:rFonts w:asciiTheme="minorHAnsi" w:hAnsiTheme="minorHAnsi" w:cstheme="minorHAnsi"/>
+          <w:sz w:val="20"/>
+        </w:rPr>
+        <w:t>The procedures we have discussed and agreed with you to perform are detailed in Appendix A. We plan to perform these procedures either virtually or at your office</w:t>
+      </w:r>
+      <w:r>
+        <w:rPr>
+          <w:rFonts w:asciiTheme="minorHAnsi" w:hAnsiTheme="minorHAnsi" w:cstheme="minorHAnsi"/>
+          <w:sz w:val="20"/>
+        </w:rPr>
+        <w:t>s</w:t>
+      </w:r>
+      <w:r>
+        <w:rPr>
+          <w:rFonts w:asciiTheme="minorHAnsi" w:hAnsiTheme="minorHAnsi" w:cstheme="minorHAnsi"/>
+          <w:sz w:val="20"/>
+        </w:rPr>
+        <w:t xml:space="preserve">. These procedures are limited in nature and extent to </w:t>
+      </w:r>
+      <w:r>
+        <w:rPr>
+          <w:rFonts w:asciiTheme="minorHAnsi" w:hAnsiTheme="minorHAnsi" w:cstheme="minorHAnsi"/>
+          <w:sz w:val="20"/>
+        </w:rPr>
+        <w:lastRenderedPageBreak/>
+        <w:t xml:space="preserve">those which you have determined will best meet your specific needs and as such will not necessarily disclose all significant matters about </w:t>
+      </w:r>
+      <w:r>
+        <w:rPr>
+          <w:rFonts w:asciiTheme="minorHAnsi" w:hAnsiTheme="minorHAnsi" w:cstheme="minorHAnsi"/>
+          <w:sz w:val="20"/>
+        </w:rPr>
+        <w:t>{{CHOICE_CLIENT_OR_TARGET}}</w:t>
+      </w:r>
+      <w:r>
+        <w:rPr>
+          <w:rFonts w:asciiTheme="minorHAnsi" w:hAnsiTheme="minorHAnsi" w:cstheme="minorHAnsi"/>
+          <w:sz w:val="20"/>
+        </w:rPr>
+        <w:t xml:space="preserve"> or reveal errors or instances of fraud.</w:t>
+      </w:r>
+    </w:p>
+    <w:p>
+      <w:pPr>
+        <w:pStyle w:val="BodyText"/>
+        <w:spacing w:line="260" w:lineRule="exact"/>
+        <w:jc w:val="both"/>
+        <w:rPr>
+          <w:rFonts w:asciiTheme="minorHAnsi" w:hAnsiTheme="minorHAnsi" w:cstheme="minorHAnsi"/>
+          <w:sz w:val="20"/>
+        </w:rPr>
+      </w:pPr>
+      <w:r>
+        <w:rPr>
+          <w:rFonts w:asciiTheme="minorHAnsi" w:hAnsiTheme="minorHAnsi" w:cstheme="minorHAnsi"/>
+          <w:sz w:val="20"/>
+        </w:rPr>
+        <w:t xml:space="preserve">The procedures we perform in this engagement will not constitute an audit, examination, or review in accordance with any standards such as those established by the Auditing and Assurance Standards Board in Canada, and we will not otherwise verify the information we obtain or present in our </w:t>
+      </w:r>
+      <w:r>
+        <w:rPr>
+          <w:rFonts w:asciiTheme="minorHAnsi" w:hAnsiTheme="minorHAnsi" w:cstheme="minorHAnsi"/>
+          <w:sz w:val="20"/>
+        </w:rPr>
+        <w:t>{{CHOICE_REPORT_BRANDING}}</w:t>
+      </w:r>
+      <w:r>
+        <w:rPr>
+          <w:rFonts w:asciiTheme="minorHAnsi" w:hAnsiTheme="minorHAnsi" w:cstheme="minorHAnsi"/>
+          <w:sz w:val="20"/>
+        </w:rPr>
+        <w:t xml:space="preserve"> deliverables. We will express no opinion or any other form of assurance on Target’s internal control over financial reporting nor on the information presented in our deliverables, and we will make no representations concerning the accuracy or completeness of the information provided to us.</w:t>
+      </w:r>
+    </w:p>
+    <w:p>
+      <w:pPr>
+        <w:pStyle w:val="BodyText"/>
+        <w:spacing w:line="260" w:lineRule="exact"/>
+        <w:jc w:val="both"/>
         <w:rPr>
           <w:rFonts w:asciiTheme="minorHAnsi" w:hAnsiTheme="minorHAnsi" w:cstheme="minorHAnsi"/>
           <w:b/>
           <w:bCs/>
           <w:sz w:val="20"/>
         </w:rPr>
-        <w:t>Nature of Engagement and Scope of Procedures</w:t>
-      </w:r>
-    </w:p>
-    <w:p>
-      <w:pPr>
-        <w:pStyle w:val="BodyText"/>
-        <w:spacing w:line="260" w:lineRule="exact"/>
-        <w:jc w:val="both"/>
-        <w:rPr>
-          <w:rFonts w:asciiTheme="minorHAnsi" w:hAnsiTheme="minorHAnsi" w:cstheme="minorHAnsi"/>
-          <w:sz w:val="20"/>
-        </w:rPr>
-      </w:pPr>
-      <w:r>
-        <w:rPr>
-          <w:rFonts w:asciiTheme="minorHAnsi" w:hAnsiTheme="minorHAnsi" w:cstheme="minorHAnsi"/>
-          <w:sz w:val="20"/>
-        </w:rPr>
-        <w:t>The nature of this engagement consists of providing professional due diligence services in connection with your proposed divestment of Target. Such services will include preparing analyses and providing our insight, observations, and recommendations in those areas you have identified as important to your proposed divestment decision.</w:t>
-      </w:r>
-    </w:p>
-    <w:p>
-      <w:pPr>
-        <w:pStyle w:val="BodyText"/>
-        <w:spacing w:line="260" w:lineRule="exact"/>
-        <w:jc w:val="both"/>
-        <w:rPr>
-          <w:rFonts w:asciiTheme="minorHAnsi" w:hAnsiTheme="minorHAnsi" w:cstheme="minorHAnsi"/>
-          <w:sz w:val="20"/>
-        </w:rPr>
-      </w:pPr>
-      <w:r>
-        <w:rPr>
-          <w:rFonts w:asciiTheme="minorHAnsi" w:hAnsiTheme="minorHAnsi" w:cstheme="minorHAnsi"/>
-          <w:sz w:val="20"/>
-        </w:rPr>
-        <w:t>The procedures we have discussed and agreed with you to perform are detailed in Appendix A. We plan to perform these procedures either virtually or at your office</w:t>
-      </w:r>
-      <w:r>
-        <w:rPr>
-          <w:rFonts w:asciiTheme="minorHAnsi" w:hAnsiTheme="minorHAnsi" w:cstheme="minorHAnsi"/>
-          <w:sz w:val="20"/>
-        </w:rPr>
-        <w:t>s</w:t>
-      </w:r>
-      <w:r>
-        <w:rPr>
-          <w:rFonts w:asciiTheme="minorHAnsi" w:hAnsiTheme="minorHAnsi" w:cstheme="minorHAnsi"/>
-          <w:sz w:val="20"/>
-        </w:rPr>
-        <w:t xml:space="preserve">. These procedures are limited in nature and extent to </w:t>
-      </w:r>
-      <w:r>
-        <w:rPr>
-          <w:rFonts w:asciiTheme="minorHAnsi" w:hAnsiTheme="minorHAnsi" w:cstheme="minorHAnsi"/>
-          <w:sz w:val="20"/>
-        </w:rPr>
-        <w:lastRenderedPageBreak/>
-        <w:t xml:space="preserve">those which you have determined will best meet your specific needs and as such will not necessarily disclose all significant matters about </w:t>
-      </w:r>
-      <w:r>
-        <w:rPr>
-          <w:rFonts w:asciiTheme="minorHAnsi" w:hAnsiTheme="minorHAnsi" w:cstheme="minorHAnsi"/>
-          <w:sz w:val="20"/>
-        </w:rPr>
-        <w:t>{{CHOICE_CLIENT_OR_TARGET}}</w:t>
-      </w:r>
-      <w:r>
-        <w:rPr>
-          <w:rFonts w:asciiTheme="minorHAnsi" w:hAnsiTheme="minorHAnsi" w:cstheme="minorHAnsi"/>
-          <w:sz w:val="20"/>
-        </w:rPr>
-        <w:t xml:space="preserve"> or reveal errors or instances of fraud.</w:t>
-      </w:r>
-    </w:p>
-    <w:p>
-      <w:pPr>
-        <w:pStyle w:val="BodyText"/>
-        <w:spacing w:line="260" w:lineRule="exact"/>
-        <w:jc w:val="both"/>
-        <w:rPr>
-          <w:rFonts w:asciiTheme="minorHAnsi" w:hAnsiTheme="minorHAnsi" w:cstheme="minorHAnsi"/>
-          <w:sz w:val="20"/>
-        </w:rPr>
-      </w:pPr>
-      <w:r>
-        <w:rPr>
-          <w:rFonts w:asciiTheme="minorHAnsi" w:hAnsiTheme="minorHAnsi" w:cstheme="minorHAnsi"/>
-          <w:sz w:val="20"/>
-        </w:rPr>
-        <w:t xml:space="preserve">The procedures we perform in this engagement will not constitute an audit, examination, or review in accordance with any standards such as those established by the Auditing and Assurance Standards Board in Canada, and we will not otherwise verify the information we obtain or present in our </w:t>
-      </w:r>
-      <w:r>
-        <w:rPr>
-          <w:rFonts w:asciiTheme="minorHAnsi" w:hAnsiTheme="minorHAnsi" w:cstheme="minorHAnsi"/>
-          <w:sz w:val="20"/>
-        </w:rPr>
-        <w:t>{{CHOICE_REPORT_BRANDING}}</w:t>
-      </w:r>
-      <w:r>
-        <w:rPr>
-          <w:rFonts w:asciiTheme="minorHAnsi" w:hAnsiTheme="minorHAnsi" w:cstheme="minorHAnsi"/>
-          <w:sz w:val="20"/>
-        </w:rPr>
-        <w:t xml:space="preserve"> deliverables. We will express no opinion or any other form of assurance on Target’s internal control over financial reporting nor on the information presented in our deliverables, and we will make no representations concerning the accuracy or completeness of the information provided to us.</w:t>
-      </w:r>
-    </w:p>
-    <w:p>
-      <w:pPr>
-        <w:pStyle w:val="BodyText"/>
-        <w:spacing w:line="260" w:lineRule="exact"/>
-        <w:jc w:val="both"/>
+      </w:pPr>
+      <w:r>
         <w:rPr>
           <w:rFonts w:asciiTheme="minorHAnsi" w:hAnsiTheme="minorHAnsi" w:cstheme="minorHAnsi"/>
           <w:b/>
           <w:bCs/>
           <w:sz w:val="20"/>
         </w:rPr>
-      </w:pPr>
+        <w:t>Terms and Conditions</w:t>
+      </w:r>
+    </w:p>
+    <w:p>
+      <w:pPr>
+        <w:pStyle w:val="BodyText"/>
+        <w:spacing w:line="260" w:lineRule="exact"/>
+        <w:jc w:val="both"/>
+        <w:rPr>
+          <w:rFonts w:asciiTheme="minorHAnsi" w:hAnsiTheme="minorHAnsi" w:cstheme="minorHAnsi"/>
+          <w:sz w:val="20"/>
+        </w:rPr>
+      </w:pPr>
+      <w:r>
+        <w:rPr>
+          <w:rFonts w:asciiTheme="minorHAnsi" w:hAnsiTheme="minorHAnsi" w:cstheme="minorHAnsi"/>
+          <w:sz w:val="20"/>
+        </w:rPr>
+        <w:t>Our engagement is subject to the Terms and Conditions for Advisory and Tax Services (“</w:t>
+      </w:r>
       <w:r>
         <w:rPr>
           <w:rFonts w:asciiTheme="minorHAnsi" w:hAnsiTheme="minorHAnsi" w:cstheme="minorHAnsi"/>
@@ -618,7 +653,14 @@
           <w:bCs/>
           <w:sz w:val="20"/>
         </w:rPr>
-        <w:t>Terms and Conditions</w:t>
+        <w:t>Standard Terms and Conditions</w:t>
+      </w:r>
+      <w:r>
+        <w:rPr>
+          <w:rFonts w:asciiTheme="minorHAnsi" w:hAnsiTheme="minorHAnsi" w:cstheme="minorHAnsi"/>
+          <w:sz w:val="20"/>
+        </w:rPr>
+        <w:t>”) attached as Appendix B incorporated herein by reference. Any work already performed on this engagement prior to the date of this engagement letter is also governed by the terms and conditions of this engagement letter.</w:t>
       </w:r>
     </w:p>
     <w:p>
@@ -636,55 +678,62 @@
           <w:rFonts w:asciiTheme="minorHAnsi" w:hAnsiTheme="minorHAnsi" w:cstheme="minorHAnsi"/>
           <w:sz w:val="20"/>
         </w:rPr>
-        <w:t>Our engagement is subject to the Terms and Conditions for Advisory and Tax Services (“</w:t>
-      </w:r>
-      <w:r>
+        <w:t>You hereby authorize us to discuss this engagement and review our deliverables with your parent company [GUIDANCE: do not include third parties here, it is intended that you only list shareholders and advisors] and your other advisors and representatives involved in Project {{PROJECT_CODE_NAME}}.</w:t>
+      </w:r>
+    </w:p>
+    <w:p>
+      <w:pPr>
+        <w:pStyle w:val="BodyText"/>
+        <w:spacing w:line="260" w:lineRule="exact"/>
+        <w:jc w:val="both"/>
         <w:rPr>
           <w:rFonts w:asciiTheme="minorHAnsi" w:hAnsiTheme="minorHAnsi" w:cstheme="minorHAnsi"/>
           <w:b/>
           <w:bCs/>
           <w:sz w:val="20"/>
         </w:rPr>
-        <w:t>Standard Terms and Conditions</w:t>
-      </w:r>
-      <w:r>
-        <w:rPr>
-          <w:rFonts w:asciiTheme="minorHAnsi" w:hAnsiTheme="minorHAnsi" w:cstheme="minorHAnsi"/>
-          <w:sz w:val="20"/>
-        </w:rPr>
-        <w:t>”) attached as Appendix B incorporated herein by reference. Any work already performed on this engagement prior to the date of this engagement letter is also governed by the terms and conditions of this engagement letter.</w:t>
-      </w:r>
-    </w:p>
-    <w:p>
-      <w:pPr>
-        <w:pStyle w:val="BodyText"/>
-        <w:spacing w:line="260" w:lineRule="exact"/>
-        <w:jc w:val="both"/>
-        <w:rPr>
-          <w:rFonts w:asciiTheme="minorHAnsi" w:hAnsiTheme="minorHAnsi" w:cstheme="minorHAnsi"/>
-          <w:sz w:val="20"/>
-        </w:rPr>
-      </w:pPr>
-      <w:r>
-        <w:rPr>
-          <w:rFonts w:asciiTheme="minorHAnsi" w:hAnsiTheme="minorHAnsi" w:cstheme="minorHAnsi"/>
-          <w:sz w:val="20"/>
-        </w:rPr>
-        <w:t>You hereby authorize us to discuss this engagement and review our deliverables with your parent company [GUIDANCE: do not include third parties here, it is intended that you only list shareholders and advisors] and your other advisors and representatives involved in Project {{PROJECT_CODE_NAME}}.</w:t>
-      </w:r>
-    </w:p>
-    <w:p>
-      <w:pPr>
-        <w:pStyle w:val="BodyText"/>
-        <w:spacing w:line="260" w:lineRule="exact"/>
-        <w:jc w:val="both"/>
+      </w:pPr>
+      <w:r>
         <w:rPr>
           <w:rFonts w:asciiTheme="minorHAnsi" w:hAnsiTheme="minorHAnsi" w:cstheme="minorHAnsi"/>
           <w:b/>
           <w:bCs/>
           <w:sz w:val="20"/>
         </w:rPr>
-      </w:pPr>
+        <w:t>Reporting</w:t>
+      </w:r>
+    </w:p>
+    <w:p>
+      <w:pPr>
+        <w:pStyle w:val="BodyText"/>
+        <w:spacing w:line="260" w:lineRule="exact"/>
+        <w:jc w:val="both"/>
+        <w:rPr>
+          <w:rFonts w:asciiTheme="minorHAnsi" w:hAnsiTheme="minorHAnsi" w:cstheme="minorHAnsi"/>
+          <w:sz w:val="20"/>
+        </w:rPr>
+      </w:pPr>
+      <w:r>
+        <w:rPr>
+          <w:rFonts w:asciiTheme="minorHAnsi" w:hAnsiTheme="minorHAnsi" w:cstheme="minorHAnsi"/>
+          <w:sz w:val="20"/>
+        </w:rPr>
+        <w:t xml:space="preserve">We will communicate the status of our work to you throughout our engagement. We will present our findings to you in </w:t>
+      </w:r>
+      <w:r>
+        <w:rPr>
+          <w:rFonts w:asciiTheme="minorHAnsi" w:hAnsiTheme="minorHAnsi" w:cstheme="minorHAnsi"/>
+          <w:sz w:val="20"/>
+        </w:rPr>
+        <w:t>{{CHOICE_REPORT_FORMAT}}</w:t>
+      </w:r>
+      <w:r>
+        <w:rPr>
+          <w:rFonts w:asciiTheme="minorHAnsi" w:hAnsiTheme="minorHAnsi" w:cstheme="minorHAnsi"/>
+          <w:sz w:val="20"/>
+        </w:rPr>
+        <w:t xml:space="preserve"> (“</w:t>
+      </w:r>
       <w:r>
         <w:rPr>
           <w:rFonts w:asciiTheme="minorHAnsi" w:hAnsiTheme="minorHAnsi" w:cstheme="minorHAnsi"/>
@@ -692,7 +741,21 @@
           <w:bCs/>
           <w:sz w:val="20"/>
         </w:rPr>
-        <w:t>Reporting</w:t>
+        <w:t>our report</w:t>
+      </w:r>
+      <w:r>
+        <w:rPr>
+          <w:rFonts w:asciiTheme="minorHAnsi" w:hAnsiTheme="minorHAnsi" w:cstheme="minorHAnsi"/>
+          <w:sz w:val="20"/>
+        </w:rPr>
+        <w:t xml:space="preserve">”) </w:t>
+      </w:r>
+      <w:r>
+        <w:rPr>
+          <w:rFonts w:asciiTheme="minorHAnsi" w:hAnsiTheme="minorHAnsi" w:cstheme="minorHAnsi"/>
+          <w:sz w:val="20"/>
+        </w:rPr>
+        <w:t>at the completion of our engagement, based on the results of performing the work described in Appendix A.</w:t>
       </w:r>
     </w:p>
     <w:p>
@@ -710,44 +773,63 @@
           <w:rFonts w:asciiTheme="minorHAnsi" w:hAnsiTheme="minorHAnsi" w:cstheme="minorHAnsi"/>
           <w:sz w:val="20"/>
         </w:rPr>
-        <w:t xml:space="preserve">We will communicate the status of our work to you throughout our engagement. We will present our findings to you in </w:t>
-      </w:r>
-      <w:r>
-        <w:rPr>
-          <w:rFonts w:asciiTheme="minorHAnsi" w:hAnsiTheme="minorHAnsi" w:cstheme="minorHAnsi"/>
-          <w:sz w:val="20"/>
-        </w:rPr>
-        <w:t>{{CHOICE_REPORT_FORMAT}}</w:t>
-      </w:r>
-      <w:r>
-        <w:rPr>
-          <w:rFonts w:asciiTheme="minorHAnsi" w:hAnsiTheme="minorHAnsi" w:cstheme="minorHAnsi"/>
-          <w:sz w:val="20"/>
-        </w:rPr>
-        <w:t xml:space="preserve"> (“</w:t>
-      </w:r>
-      <w:r>
-        <w:rPr>
-          <w:rFonts w:asciiTheme="minorHAnsi" w:hAnsiTheme="minorHAnsi" w:cstheme="minorHAnsi"/>
-          <w:b/>
-          <w:bCs/>
-          <w:sz w:val="20"/>
-        </w:rPr>
-        <w:t>our report</w:t>
-      </w:r>
-      <w:r>
-        <w:rPr>
-          <w:rFonts w:asciiTheme="minorHAnsi" w:hAnsiTheme="minorHAnsi" w:cstheme="minorHAnsi"/>
-          <w:sz w:val="20"/>
-        </w:rPr>
-        <w:t xml:space="preserve">”) </w:t>
-      </w:r>
-      <w:r>
-        <w:rPr>
-          <w:rFonts w:asciiTheme="minorHAnsi" w:hAnsiTheme="minorHAnsi" w:cstheme="minorHAnsi"/>
-          <w:sz w:val="20"/>
-        </w:rPr>
-        <w:t>at the completion of our engagement, based on the results of performing the work described in Appendix A.</w:t>
+        <w:t xml:space="preserve">We will discuss with </w:t>
+      </w:r>
+      <w:r>
+        <w:rPr>
+          <w:rFonts w:asciiTheme="minorHAnsi" w:hAnsiTheme="minorHAnsi" w:cstheme="minorHAnsi"/>
+          <w:sz w:val="20"/>
+        </w:rPr>
+        <w:t>{{CHOICE_CLIENT_OR_TARGET}}</w:t>
+      </w:r>
+      <w:r>
+        <w:rPr>
+          <w:rFonts w:asciiTheme="minorHAnsi" w:hAnsiTheme="minorHAnsi" w:cstheme="minorHAnsi"/>
+          <w:sz w:val="20"/>
+        </w:rPr>
+        <w:t xml:space="preserve"> personnel a draft of our report to confirm its factual accuracy. We will request a confirmation signed by an officer of </w:t>
+      </w:r>
+      <w:r>
+        <w:rPr>
+          <w:rFonts w:asciiTheme="minorHAnsi" w:hAnsiTheme="minorHAnsi" w:cstheme="minorHAnsi"/>
+          <w:sz w:val="20"/>
+        </w:rPr>
+        <w:t>{{CHOICE_CLIENT_OR_TARGET}}</w:t>
+      </w:r>
+      <w:r>
+        <w:rPr>
+          <w:rFonts w:asciiTheme="minorHAnsi" w:hAnsiTheme="minorHAnsi" w:cstheme="minorHAnsi"/>
+          <w:sz w:val="20"/>
+        </w:rPr>
+        <w:t>, in the form attached as Appendix D</w:t>
+      </w:r>
+      <w:r>
+        <w:rPr>
+          <w:rFonts w:asciiTheme="minorHAnsi" w:hAnsiTheme="minorHAnsi" w:cstheme="minorHAnsi"/>
+          <w:sz w:val="20"/>
+        </w:rPr>
+        <w:t>,</w:t>
+      </w:r>
+      <w:r>
+        <w:rPr>
+          <w:rFonts w:asciiTheme="minorHAnsi" w:hAnsiTheme="minorHAnsi" w:cstheme="minorHAnsi"/>
+          <w:sz w:val="20"/>
+        </w:rPr>
+        <w:t xml:space="preserve"> confirming the factual accuracy of the draft report. Subsequently, we will issue </w:t>
+      </w:r>
+      <w:r>
+        <w:rPr>
+          <w:rFonts w:asciiTheme="minorHAnsi" w:hAnsiTheme="minorHAnsi" w:cstheme="minorHAnsi"/>
+          <w:sz w:val="20"/>
+        </w:rPr>
+        <w:t>our</w:t>
+      </w:r>
+      <w:r>
+        <w:rPr>
+          <w:rFonts w:asciiTheme="minorHAnsi" w:hAnsiTheme="minorHAnsi" w:cstheme="minorHAnsi"/>
+          <w:sz w:val="20"/>
+        </w:rPr>
+        <w:t xml:space="preserve"> report to you, for your internal use. </w:t>
       </w:r>
     </w:p>
     <w:p>
@@ -765,80 +847,6 @@
           <w:rFonts w:asciiTheme="minorHAnsi" w:hAnsiTheme="minorHAnsi" w:cstheme="minorHAnsi"/>
           <w:sz w:val="20"/>
         </w:rPr>
-        <w:t xml:space="preserve">We will discuss with </w:t>
-      </w:r>
-      <w:r>
-        <w:rPr>
-          <w:rFonts w:asciiTheme="minorHAnsi" w:hAnsiTheme="minorHAnsi" w:cstheme="minorHAnsi"/>
-          <w:sz w:val="20"/>
-        </w:rPr>
-        <w:t>{{CHOICE_CLIENT_OR_TARGET}}</w:t>
-      </w:r>
-      <w:r>
-        <w:rPr>
-          <w:rFonts w:asciiTheme="minorHAnsi" w:hAnsiTheme="minorHAnsi" w:cstheme="minorHAnsi"/>
-          <w:sz w:val="20"/>
-        </w:rPr>
-        <w:t xml:space="preserve"> personnel a draft of our report to confirm its factual accuracy. We will request a confirmation signed by an officer of </w:t>
-      </w:r>
-      <w:r>
-        <w:rPr>
-          <w:rFonts w:asciiTheme="minorHAnsi" w:hAnsiTheme="minorHAnsi" w:cstheme="minorHAnsi"/>
-          <w:sz w:val="20"/>
-        </w:rPr>
-        <w:t>{{CHOICE_CLIENT_OR_TARGET}}</w:t>
-      </w:r>
-      <w:r>
-        <w:rPr>
-          <w:rFonts w:asciiTheme="minorHAnsi" w:hAnsiTheme="minorHAnsi" w:cstheme="minorHAnsi"/>
-          <w:sz w:val="20"/>
-        </w:rPr>
-        <w:t>, in the form attached as Appendix D</w:t>
-      </w:r>
-      <w:r>
-        <w:rPr>
-          <w:rFonts w:asciiTheme="minorHAnsi" w:hAnsiTheme="minorHAnsi" w:cstheme="minorHAnsi"/>
-          <w:sz w:val="20"/>
-        </w:rPr>
-        <w:t>,</w:t>
-      </w:r>
-      <w:r>
-        <w:rPr>
-          <w:rFonts w:asciiTheme="minorHAnsi" w:hAnsiTheme="minorHAnsi" w:cstheme="minorHAnsi"/>
-          <w:sz w:val="20"/>
-        </w:rPr>
-        <w:t xml:space="preserve"> confirming the factual accuracy of the draft report. Subsequently, we will issue </w:t>
-      </w:r>
-      <w:r>
-        <w:rPr>
-          <w:rFonts w:asciiTheme="minorHAnsi" w:hAnsiTheme="minorHAnsi" w:cstheme="minorHAnsi"/>
-          <w:sz w:val="20"/>
-        </w:rPr>
-        <w:t>our</w:t>
-      </w:r>
-      <w:r>
-        <w:rPr>
-          <w:rFonts w:asciiTheme="minorHAnsi" w:hAnsiTheme="minorHAnsi" w:cstheme="minorHAnsi"/>
-          <w:sz w:val="20"/>
-        </w:rPr>
-        <w:t xml:space="preserve"> report to you, for your internal use. </w:t>
-      </w:r>
-    </w:p>
-    <w:p>
-      <w:pPr>
-        <w:pStyle w:val="BodyText"/>
-        <w:spacing w:line="260" w:lineRule="exact"/>
-        <w:jc w:val="both"/>
-        <w:rPr>
-          <w:rFonts w:asciiTheme="minorHAnsi" w:hAnsiTheme="minorHAnsi" w:cstheme="minorHAnsi"/>
-          <w:sz w:val="20"/>
-        </w:rPr>
-      </w:pPr>
-      <w:r>
-        <w:rPr>
-          <w:rFonts w:asciiTheme="minorHAnsi" w:hAnsiTheme="minorHAnsi" w:cstheme="minorHAnsi"/>
-          <w:sz w:val="20"/>
-        </w:rPr>
         <w:t xml:space="preserve">Because of its special nature, our report is not suited for any purpose other than to assist you in your evaluation of Project </w:t>
       </w:r>
       <w:r>
@@ -867,23 +875,7 @@
           <w:rFonts w:asciiTheme="minorHAnsi" w:hAnsiTheme="minorHAnsi" w:cstheme="minorHAnsi"/>
           <w:sz w:val="20"/>
         </w:rPr>
-        <w:t xml:space="preserve">of the Standard Terms and Conditions. However, with our prior written permission, should you wish to circulate the report to other parties on a non-reliance basis and for informational purposes only, we will request that you (a) sign a release and indemnity in </w:t>
-      </w:r>
-      <w:proofErr w:type="spellStart"/>
-      <w:r>
-        <w:rPr>
-          <w:rFonts w:asciiTheme="minorHAnsi" w:hAnsiTheme="minorHAnsi" w:cstheme="minorHAnsi"/>
-          <w:sz w:val="20"/>
-        </w:rPr>
-        <w:t>favour</w:t>
-      </w:r>
-      <w:proofErr w:type="spellEnd"/>
-      <w:r>
-        <w:rPr>
-          <w:rFonts w:asciiTheme="minorHAnsi" w:hAnsiTheme="minorHAnsi" w:cstheme="minorHAnsi"/>
-          <w:sz w:val="20"/>
-        </w:rPr>
-        <w:t xml:space="preserve"> of KPMG (“Client Release Letter”) related to the distribution of the report, and (b) provide a written acknowledgment from the requesting party of the terms of the release of the report (“Third Party Access Letter”), each in the form respectively attached in Appendix C. The Client </w:t>
+        <w:t xml:space="preserve">of the Standard Terms and Conditions. However, with our prior written permission, should you wish to circulate the report to other parties on a non-reliance basis and for informational purposes only, we will request that you (a) sign a release and indemnity in favour of KPMG (“Client Release Letter”) related to the distribution of the report, and (b) provide a written acknowledgment from the requesting party of the terms of the release of the report (“Third Party Access Letter”), each in the form respectively attached in Appendix C. The Client </w:t>
       </w:r>
       <w:r>
         <w:rPr>
@@ -897,23 +889,7 @@
           <w:rFonts w:asciiTheme="minorHAnsi" w:hAnsiTheme="minorHAnsi" w:cstheme="minorHAnsi"/>
           <w:sz w:val="20"/>
         </w:rPr>
-        <w:t xml:space="preserve"> Letter and </w:t>
-      </w:r>
-      <w:proofErr w:type="gramStart"/>
-      <w:r>
-        <w:rPr>
-          <w:rFonts w:asciiTheme="minorHAnsi" w:hAnsiTheme="minorHAnsi" w:cstheme="minorHAnsi"/>
-          <w:sz w:val="20"/>
-        </w:rPr>
-        <w:t>Third Party</w:t>
-      </w:r>
-      <w:proofErr w:type="gramEnd"/>
-      <w:r>
-        <w:rPr>
-          <w:rFonts w:asciiTheme="minorHAnsi" w:hAnsiTheme="minorHAnsi" w:cstheme="minorHAnsi"/>
-          <w:sz w:val="20"/>
-        </w:rPr>
-        <w:t xml:space="preserve"> Access Letter must be returned to us prior to any release of the report.</w:t>
+        <w:t xml:space="preserve"> Letter and Third Party Access Letter must be returned to us prior to any release of the report.</w:t>
       </w:r>
     </w:p>
     <w:p>
@@ -1046,21 +1022,200 @@
           <w:sz w:val="20"/>
           <w:highlight w:val="yellow"/>
         </w:rPr>
-        <w:t xml:space="preserve">[GUIDANCE: This following section was introduced in </w:t>
-      </w:r>
-      <w:proofErr w:type="gramStart"/>
-      <w:r>
+        <w:t>[GUIDANCE: This following section was introduced in 2022 and it addresses the Mandatory Disclosure Regimes (“MDRs”) that are increasingly applicable around the world and may become applicable during a client engagement. This is for tax purposes so check with the tax partner and consider adding this paragraph where tax services may be provided under this EL. If no tax services will be provided under this EL, you may completely delete the following section.]</w:t>
+      </w:r>
+    </w:p>
+    <w:p>
+      <w:pPr>
+        <w:pStyle w:val="BodyText"/>
+        <w:spacing w:line="260" w:lineRule="exact"/>
+        <w:jc w:val="both"/>
+        <w:rPr>
+          <w:rFonts w:asciiTheme="minorHAnsi" w:hAnsiTheme="minorHAnsi" w:cstheme="minorHAnsi"/>
+          <w:b/>
+          <w:bCs/>
+          <w:sz w:val="20"/>
+        </w:rPr>
+      </w:pPr>
+      <w:r>
+        <w:rPr>
+          <w:rFonts w:asciiTheme="minorHAnsi" w:hAnsiTheme="minorHAnsi" w:cstheme="minorHAnsi"/>
+          <w:b/>
+          <w:bCs/>
+          <w:sz w:val="20"/>
+        </w:rPr>
+        <w:t>Potential Mandatory Disclosure Reporting</w:t>
+      </w:r>
+    </w:p>
+    <w:p>
+      <w:pPr>
+        <w:pStyle w:val="BodyText"/>
+        <w:spacing w:line="260" w:lineRule="exact"/>
+        <w:jc w:val="both"/>
+        <w:rPr>
+          <w:rFonts w:asciiTheme="minorHAnsi" w:hAnsiTheme="minorHAnsi" w:cstheme="minorHAnsi"/>
+          <w:sz w:val="20"/>
+        </w:rPr>
+      </w:pPr>
+      <w:r>
+        <w:rPr>
+          <w:rFonts w:asciiTheme="minorHAnsi" w:hAnsiTheme="minorHAnsi" w:cstheme="minorHAnsi"/>
+          <w:sz w:val="20"/>
+        </w:rPr>
+        <w:t>A growing number of countries are enacting Mandatory Disclosure Regimes (“</w:t>
+      </w:r>
+      <w:r>
+        <w:rPr>
+          <w:rFonts w:asciiTheme="minorHAnsi" w:hAnsiTheme="minorHAnsi" w:cstheme="minorHAnsi"/>
+          <w:b/>
+          <w:bCs/>
+          <w:sz w:val="20"/>
+        </w:rPr>
+        <w:t>MDRs</w:t>
+      </w:r>
+      <w:r>
+        <w:rPr>
+          <w:rFonts w:asciiTheme="minorHAnsi" w:hAnsiTheme="minorHAnsi" w:cstheme="minorHAnsi"/>
+          <w:sz w:val="20"/>
+        </w:rPr>
+        <w:t>”), which require advisors, like KPMG and non-Canadian firms within the KPMG network of independent member firms (“</w:t>
+      </w:r>
+      <w:r>
+        <w:rPr>
+          <w:rFonts w:asciiTheme="minorHAnsi" w:hAnsiTheme="minorHAnsi" w:cstheme="minorHAnsi"/>
+          <w:b/>
+          <w:bCs/>
+          <w:sz w:val="20"/>
+        </w:rPr>
+        <w:t>Member Firms</w:t>
+      </w:r>
+      <w:r>
+        <w:rPr>
+          <w:rFonts w:asciiTheme="minorHAnsi" w:hAnsiTheme="minorHAnsi" w:cstheme="minorHAnsi"/>
+          <w:sz w:val="20"/>
+        </w:rPr>
+        <w:t>”), to disclose qualifying arrangements to the relevant local taxing authorities. Non-compliance with MDRs may result in significant penalties.</w:t>
+      </w:r>
+    </w:p>
+    <w:p>
+      <w:pPr>
+        <w:pStyle w:val="BodyText"/>
+        <w:spacing w:line="260" w:lineRule="exact"/>
+        <w:jc w:val="both"/>
+        <w:rPr>
+          <w:rFonts w:asciiTheme="minorHAnsi" w:hAnsiTheme="minorHAnsi" w:cstheme="minorHAnsi"/>
+          <w:sz w:val="20"/>
+        </w:rPr>
+      </w:pPr>
+      <w:r>
+        <w:rPr>
+          <w:rFonts w:asciiTheme="minorHAnsi" w:hAnsiTheme="minorHAnsi" w:cstheme="minorHAnsi"/>
+          <w:sz w:val="20"/>
+        </w:rPr>
+        <w:t xml:space="preserve">Accordingly, Client hereby acknowledges that KPMG, Member Firms and/or Client may be required to disclose qualifying arrangements to the relevant taxing authorities. Unless prevented by law, KPMG will use good faith efforts to inform Client if KPMG is required to provide, or KPMG becomes aware that a Member Firm is required to provide, </w:t>
+      </w:r>
+      <w:r>
+        <w:rPr>
+          <w:rFonts w:asciiTheme="minorHAnsi" w:hAnsiTheme="minorHAnsi" w:cstheme="minorHAnsi"/>
+          <w:sz w:val="20"/>
+        </w:rPr>
+        <w:t>{{CHOICE_CLIENT_OR_TARGET_POSSESSIVE_2}}</w:t>
+      </w:r>
+      <w:r>
+        <w:rPr>
+          <w:rFonts w:asciiTheme="minorHAnsi" w:hAnsiTheme="minorHAnsi" w:cstheme="minorHAnsi"/>
+          <w:sz w:val="20"/>
+        </w:rPr>
+        <w:t xml:space="preserve"> information to relevant taxing authorities with respect to a qualifying arrangement covered by this engagement letter. Furthermore, when feasible, KPMG will consider reasonable input from </w:t>
+      </w:r>
+      <w:r>
+        <w:rPr>
+          <w:rFonts w:asciiTheme="minorHAnsi" w:hAnsiTheme="minorHAnsi" w:cstheme="minorHAnsi"/>
+          <w:sz w:val="20"/>
+        </w:rPr>
+        <w:t>{{CLIENT_AND_TARGET}}</w:t>
+      </w:r>
+      <w:r>
+        <w:rPr>
+          <w:rFonts w:asciiTheme="minorHAnsi" w:hAnsiTheme="minorHAnsi" w:cstheme="minorHAnsi"/>
+          <w:sz w:val="20"/>
+        </w:rPr>
+        <w:t xml:space="preserve"> </w:t>
+      </w:r>
+      <w:r>
+        <w:rPr>
+          <w:rFonts w:asciiTheme="minorHAnsi" w:hAnsiTheme="minorHAnsi" w:cstheme="minorHAnsi"/>
+          <w:sz w:val="20"/>
+        </w:rPr>
+        <w:t xml:space="preserve">in connection with a KPMG disclosure. Client will use good faith efforts to inform KPMG if </w:t>
+      </w:r>
+      <w:r>
+        <w:rPr>
+          <w:rFonts w:asciiTheme="minorHAnsi" w:hAnsiTheme="minorHAnsi" w:cstheme="minorHAnsi"/>
+          <w:sz w:val="20"/>
+        </w:rPr>
+        <w:t>{{CLIENT_OR_TARGET}}</w:t>
+      </w:r>
+      <w:r>
+        <w:rPr>
+          <w:rFonts w:asciiTheme="minorHAnsi" w:hAnsiTheme="minorHAnsi" w:cstheme="minorHAnsi"/>
+          <w:sz w:val="20"/>
+        </w:rPr>
+        <w:t xml:space="preserve"> is required to disclose a qualifying arrangement to relevant taxing authorities with respect to a qualifying arrangement covered by this engagement letter. Client is advised to consult with a tax or legal professional service provider proficient in such MDRs for assistance in this regard; for greater certainty, KPMG will not provide any advice with respect to the MDR disclosure requirements.</w:t>
+      </w:r>
+    </w:p>
+    <w:p>
+      <w:pPr>
+        <w:pStyle w:val="BodyText"/>
+        <w:spacing w:line="260" w:lineRule="exact"/>
+        <w:jc w:val="both"/>
+        <w:rPr>
+          <w:rFonts w:asciiTheme="minorHAnsi" w:hAnsiTheme="minorHAnsi" w:cstheme="minorHAnsi"/>
+          <w:sz w:val="20"/>
+        </w:rPr>
+      </w:pPr>
+      <w:r>
+        <w:rPr>
+          <w:rFonts w:asciiTheme="minorHAnsi" w:hAnsiTheme="minorHAnsi" w:cstheme="minorHAnsi"/>
+          <w:sz w:val="20"/>
+        </w:rPr>
+        <w:t xml:space="preserve">To the fullest extent permitted by law, KPMG is not liable to </w:t>
+      </w:r>
+      <w:r>
+        <w:rPr>
+          <w:rFonts w:asciiTheme="minorHAnsi" w:hAnsiTheme="minorHAnsi" w:cstheme="minorHAnsi"/>
+          <w:sz w:val="20"/>
+        </w:rPr>
+        <w:t>{{CLIENT_OR_TARGET}}</w:t>
+      </w:r>
+      <w:r>
+        <w:rPr>
+          <w:rFonts w:asciiTheme="minorHAnsi" w:hAnsiTheme="minorHAnsi" w:cstheme="minorHAnsi"/>
+          <w:sz w:val="20"/>
+        </w:rPr>
+        <w:t xml:space="preserve"> </w:t>
+      </w:r>
+      <w:r>
+        <w:rPr>
+          <w:rFonts w:asciiTheme="minorHAnsi" w:hAnsiTheme="minorHAnsi" w:cstheme="minorHAnsi"/>
+          <w:sz w:val="20"/>
+        </w:rPr>
+        <w:t>for any consequences, claims, penalties, fines, actions, proceedings, liabilities, costs, expenses, losses, or demands that may result or arise from or otherwise be connected with any disclosure under MDRs.</w:t>
+      </w:r>
+    </w:p>
+    <w:p>
+      <w:pPr>
+        <w:pStyle w:val="BodyText"/>
+        <w:spacing w:line="260" w:lineRule="exact"/>
+        <w:jc w:val="both"/>
         <w:rPr>
           <w:rFonts w:asciiTheme="minorHAnsi" w:hAnsiTheme="minorHAnsi" w:cstheme="minorHAnsi"/>
           <w:i/>
           <w:iCs/>
           <w:color w:val="FF0000"/>
           <w:sz w:val="20"/>
-          <w:highlight w:val="yellow"/>
-        </w:rPr>
-        <w:t>2022</w:t>
-      </w:r>
-      <w:proofErr w:type="gramEnd"/>
+        </w:rPr>
+      </w:pPr>
       <w:r>
         <w:rPr>
           <w:rFonts w:asciiTheme="minorHAnsi" w:hAnsiTheme="minorHAnsi" w:cstheme="minorHAnsi"/>
@@ -1070,7 +1225,7 @@
           <w:sz w:val="20"/>
           <w:highlight w:val="yellow"/>
         </w:rPr>
-        <w:t xml:space="preserve"> and it addresses the Mandatory Disclosure Regimes (“MDRs”) that are increasingly applicable around the world and may become applicable during a client engagement. This is for tax purposes so check with the tax partner and consider adding this paragraph where tax services may be provided under this EL. If no tax services will be provided under this EL, you may completely delete the following section.]</w:t>
+        <w:t>[GUIDANCE: Tax Risk Management recommends the inclusion of the following paragraph if KPMG might provide tax services to Client under this EL and Client conducts business or resides in Québec:</w:t>
       </w:r>
     </w:p>
     <w:p>
@@ -1078,21 +1233,70 @@
         <w:pStyle w:val="BodyText"/>
         <w:spacing w:line="260" w:lineRule="exact"/>
         <w:jc w:val="both"/>
+        <w:rPr>
+          <w:rFonts w:asciiTheme="minorHAnsi" w:hAnsiTheme="minorHAnsi" w:cstheme="minorHAnsi"/>
+          <w:sz w:val="20"/>
+        </w:rPr>
+      </w:pPr>
+      <w:r>
+        <w:rPr>
+          <w:rFonts w:asciiTheme="minorHAnsi" w:hAnsiTheme="minorHAnsi" w:cstheme="minorHAnsi"/>
+          <w:sz w:val="20"/>
+        </w:rPr>
+        <w:t xml:space="preserve">If </w:t>
+      </w:r>
+      <w:r>
+        <w:rPr>
+          <w:rFonts w:asciiTheme="minorHAnsi" w:hAnsiTheme="minorHAnsi" w:cstheme="minorHAnsi"/>
+          <w:sz w:val="20"/>
+        </w:rPr>
+        <w:t>{{CLIENT_OR_TARGET}}</w:t>
+      </w:r>
+      <w:r>
+        <w:rPr>
+          <w:rFonts w:asciiTheme="minorHAnsi" w:hAnsiTheme="minorHAnsi" w:cstheme="minorHAnsi"/>
+          <w:sz w:val="20"/>
+        </w:rPr>
+        <w:t xml:space="preserve"> </w:t>
+      </w:r>
+      <w:r>
+        <w:rPr>
+          <w:rFonts w:asciiTheme="minorHAnsi" w:hAnsiTheme="minorHAnsi" w:cstheme="minorHAnsi"/>
+          <w:sz w:val="20"/>
+        </w:rPr>
+        <w:t xml:space="preserve">carries on business or resides in Québec, KPMG wishes to advise you that Québec introduced legislation that prohibits a taxpayer who has carried out a transaction, or series of transactions, that is subject to a Revenu Québec final assessment based on the general anti-avoidance rule, from being able to obtain authorization from the </w:t>
+      </w:r>
+      <w:r>
+        <w:rPr>
+          <w:rFonts w:asciiTheme="minorHAnsi" w:hAnsiTheme="minorHAnsi" w:cstheme="minorHAnsi"/>
+          <w:i/>
+          <w:iCs/>
+          <w:sz w:val="20"/>
+        </w:rPr>
+        <w:t>Autorité des marchés publics</w:t>
+      </w:r>
+      <w:r>
+        <w:rPr>
+          <w:rFonts w:asciiTheme="minorHAnsi" w:hAnsiTheme="minorHAnsi" w:cstheme="minorHAnsi"/>
+          <w:sz w:val="20"/>
+        </w:rPr>
+        <w:t xml:space="preserve"> (“</w:t>
+      </w:r>
+      <w:r>
         <w:rPr>
           <w:rFonts w:asciiTheme="minorHAnsi" w:hAnsiTheme="minorHAnsi" w:cstheme="minorHAnsi"/>
           <w:b/>
           <w:bCs/>
           <w:sz w:val="20"/>
         </w:rPr>
-      </w:pPr>
-      <w:r>
-        <w:rPr>
-          <w:rFonts w:asciiTheme="minorHAnsi" w:hAnsiTheme="minorHAnsi" w:cstheme="minorHAnsi"/>
-          <w:b/>
-          <w:bCs/>
-          <w:sz w:val="20"/>
-        </w:rPr>
-        <w:t>Potential Mandatory Disclosure Reporting</w:t>
+        <w:t>AMP</w:t>
+      </w:r>
+      <w:r>
+        <w:rPr>
+          <w:rFonts w:asciiTheme="minorHAnsi" w:hAnsiTheme="minorHAnsi" w:cstheme="minorHAnsi"/>
+          <w:sz w:val="20"/>
+        </w:rPr>
+        <w:t>”) to bid for or obtain public contracts. The taxpayer will be listed in the Register of Enterprises Ineligible for Public Contracts for a period of five years from the time the name is entered on the list.</w:t>
       </w:r>
     </w:p>
     <w:p>
@@ -1102,185 +1306,175 @@
         <w:jc w:val="both"/>
         <w:rPr>
           <w:rFonts w:asciiTheme="minorHAnsi" w:hAnsiTheme="minorHAnsi" w:cstheme="minorHAnsi"/>
-          <w:sz w:val="20"/>
-        </w:rPr>
-      </w:pPr>
-      <w:r>
-        <w:rPr>
-          <w:rFonts w:asciiTheme="minorHAnsi" w:hAnsiTheme="minorHAnsi" w:cstheme="minorHAnsi"/>
-          <w:sz w:val="20"/>
-        </w:rPr>
-        <w:t>A growing number of countries are enacting Mandatory Disclosure Regimes (“</w:t>
-      </w:r>
-      <w:r>
-        <w:rPr>
-          <w:rFonts w:asciiTheme="minorHAnsi" w:hAnsiTheme="minorHAnsi" w:cstheme="minorHAnsi"/>
-          <w:b/>
-          <w:bCs/>
-          <w:sz w:val="20"/>
-        </w:rPr>
-        <w:t>MDRs</w:t>
-      </w:r>
-      <w:r>
-        <w:rPr>
-          <w:rFonts w:asciiTheme="minorHAnsi" w:hAnsiTheme="minorHAnsi" w:cstheme="minorHAnsi"/>
-          <w:sz w:val="20"/>
-        </w:rPr>
-        <w:t>”), which require advisors, like KPMG and non-Canadian firms within the KPMG network of independent member firms (“</w:t>
-      </w:r>
-      <w:r>
-        <w:rPr>
-          <w:rFonts w:asciiTheme="minorHAnsi" w:hAnsiTheme="minorHAnsi" w:cstheme="minorHAnsi"/>
-          <w:b/>
-          <w:bCs/>
-          <w:sz w:val="20"/>
-        </w:rPr>
-        <w:t>Member Firms</w:t>
-      </w:r>
-      <w:r>
-        <w:rPr>
-          <w:rFonts w:asciiTheme="minorHAnsi" w:hAnsiTheme="minorHAnsi" w:cstheme="minorHAnsi"/>
-          <w:sz w:val="20"/>
-        </w:rPr>
-        <w:t>”), to disclose qualifying arrangements to the relevant local taxing authorities. Non-compliance with MDRs may result in significant penalties.</w:t>
-      </w:r>
-    </w:p>
-    <w:p>
-      <w:pPr>
-        <w:pStyle w:val="BodyText"/>
-        <w:spacing w:line="260" w:lineRule="exact"/>
-        <w:jc w:val="both"/>
-        <w:rPr>
-          <w:rFonts w:asciiTheme="minorHAnsi" w:hAnsiTheme="minorHAnsi" w:cstheme="minorHAnsi"/>
-          <w:sz w:val="20"/>
-        </w:rPr>
-      </w:pPr>
-      <w:r>
-        <w:rPr>
-          <w:rFonts w:asciiTheme="minorHAnsi" w:hAnsiTheme="minorHAnsi" w:cstheme="minorHAnsi"/>
-          <w:sz w:val="20"/>
-        </w:rPr>
-        <w:t xml:space="preserve">Accordingly, Client hereby acknowledges that KPMG, Member Firms and/or Client may be required to disclose qualifying arrangements to the relevant taxing authorities. Unless prevented by law, KPMG will use good faith efforts to inform Client if KPMG is required to provide, or KPMG becomes aware that a Member Firm is required to provide, </w:t>
-      </w:r>
-      <w:r>
-        <w:rPr>
-          <w:rFonts w:asciiTheme="minorHAnsi" w:hAnsiTheme="minorHAnsi" w:cstheme="minorHAnsi"/>
-          <w:sz w:val="20"/>
-        </w:rPr>
-        <w:t>{{CHOICE_CLIENT_OR_TARGET_POSSESSIVE_2}}</w:t>
-      </w:r>
-      <w:r>
-        <w:rPr>
-          <w:rFonts w:asciiTheme="minorHAnsi" w:hAnsiTheme="minorHAnsi" w:cstheme="minorHAnsi"/>
-          <w:sz w:val="20"/>
-        </w:rPr>
-        <w:t xml:space="preserve"> information to relevant taxing authorities with respect to a qualifying arrangement covered by this engagement letter. Furthermore, when feasible, KPMG will consider reasonable input from </w:t>
-      </w:r>
-      <w:r>
-        <w:rPr>
-          <w:rFonts w:asciiTheme="minorHAnsi" w:hAnsiTheme="minorHAnsi" w:cstheme="minorHAnsi"/>
-          <w:sz w:val="20"/>
-        </w:rPr>
-        <w:t>{{CLIENT_AND_TARGET}}</w:t>
-      </w:r>
-      <w:r>
-        <w:rPr>
-          <w:rFonts w:asciiTheme="minorHAnsi" w:hAnsiTheme="minorHAnsi" w:cstheme="minorHAnsi"/>
-          <w:sz w:val="20"/>
-        </w:rPr>
-        <w:t xml:space="preserve"> </w:t>
-      </w:r>
-      <w:r>
-        <w:rPr>
-          <w:rFonts w:asciiTheme="minorHAnsi" w:hAnsiTheme="minorHAnsi" w:cstheme="minorHAnsi"/>
-          <w:sz w:val="20"/>
-        </w:rPr>
-        <w:t xml:space="preserve">in connection with a KPMG disclosure. Client will use good faith efforts to inform KPMG if </w:t>
-      </w:r>
-      <w:r>
-        <w:rPr>
-          <w:rFonts w:asciiTheme="minorHAnsi" w:hAnsiTheme="minorHAnsi" w:cstheme="minorHAnsi"/>
-          <w:sz w:val="20"/>
-        </w:rPr>
-        <w:t>{{CLIENT_OR_TARGET}}</w:t>
-      </w:r>
-      <w:r>
-        <w:rPr>
-          <w:rFonts w:asciiTheme="minorHAnsi" w:hAnsiTheme="minorHAnsi" w:cstheme="minorHAnsi"/>
-          <w:sz w:val="20"/>
-        </w:rPr>
-        <w:t xml:space="preserve"> is required to disclose a qualifying arrangement to relevant taxing authorities with respect to a qualifying arrangement covered by this engagement letter. Client is advised to consult with a tax or legal professional service provider proficient in such MDRs for assistance in this regard; for greater certainty, KPMG will not provide any advice with respect to the MDR disclosure requirements.</w:t>
-      </w:r>
-    </w:p>
-    <w:p>
-      <w:pPr>
-        <w:pStyle w:val="BodyText"/>
-        <w:spacing w:line="260" w:lineRule="exact"/>
-        <w:jc w:val="both"/>
-        <w:rPr>
-          <w:rFonts w:asciiTheme="minorHAnsi" w:hAnsiTheme="minorHAnsi" w:cstheme="minorHAnsi"/>
-          <w:sz w:val="20"/>
-        </w:rPr>
-      </w:pPr>
-      <w:r>
-        <w:rPr>
-          <w:rFonts w:asciiTheme="minorHAnsi" w:hAnsiTheme="minorHAnsi" w:cstheme="minorHAnsi"/>
-          <w:sz w:val="20"/>
-        </w:rPr>
-        <w:t xml:space="preserve">To the fullest extent permitted by law, KPMG is not liable to </w:t>
-      </w:r>
-      <w:r>
-        <w:rPr>
-          <w:rFonts w:asciiTheme="minorHAnsi" w:hAnsiTheme="minorHAnsi" w:cstheme="minorHAnsi"/>
-          <w:sz w:val="20"/>
-        </w:rPr>
-        <w:t>{{CLIENT_OR_TARGET}}</w:t>
-      </w:r>
-      <w:r>
-        <w:rPr>
-          <w:rFonts w:asciiTheme="minorHAnsi" w:hAnsiTheme="minorHAnsi" w:cstheme="minorHAnsi"/>
-          <w:sz w:val="20"/>
-        </w:rPr>
-        <w:t xml:space="preserve"> </w:t>
-      </w:r>
-      <w:r>
-        <w:rPr>
-          <w:rFonts w:asciiTheme="minorHAnsi" w:hAnsiTheme="minorHAnsi" w:cstheme="minorHAnsi"/>
-          <w:sz w:val="20"/>
-        </w:rPr>
-        <w:t xml:space="preserve">for any consequences, claims, penalties, fines, actions, proceedings, liabilities, costs, expenses, losses, or demands that may result or arise from or otherwise </w:t>
-      </w:r>
-      <w:proofErr w:type="gramStart"/>
-      <w:r>
-        <w:rPr>
-          <w:rFonts w:asciiTheme="minorHAnsi" w:hAnsiTheme="minorHAnsi" w:cstheme="minorHAnsi"/>
-          <w:sz w:val="20"/>
-        </w:rPr>
-        <w:t>be connected with</w:t>
-      </w:r>
-      <w:proofErr w:type="gramEnd"/>
-      <w:r>
-        <w:rPr>
-          <w:rFonts w:asciiTheme="minorHAnsi" w:hAnsiTheme="minorHAnsi" w:cstheme="minorHAnsi"/>
-          <w:sz w:val="20"/>
-        </w:rPr>
-        <w:t xml:space="preserve"> any disclosure under MDRs.</w:t>
-      </w:r>
-    </w:p>
-    <w:p>
-      <w:pPr>
-        <w:pStyle w:val="BodyText"/>
-        <w:spacing w:line="260" w:lineRule="exact"/>
-        <w:jc w:val="both"/>
+          <w:i/>
+          <w:iCs/>
+          <w:sz w:val="20"/>
+        </w:rPr>
+      </w:pPr>
+      <w:r>
         <w:rPr>
           <w:rFonts w:asciiTheme="minorHAnsi" w:hAnsiTheme="minorHAnsi" w:cstheme="minorHAnsi"/>
           <w:i/>
           <w:iCs/>
           <w:color w:val="FF0000"/>
           <w:sz w:val="20"/>
-        </w:rPr>
-      </w:pPr>
-      <w:r>
+          <w:highlight w:val="yellow"/>
+        </w:rPr>
+        <w:t>[GUIDANCE: the following section is mandatory if the Client or Target are assurance clients (or potential future assurance clients in the near-term) of KPMG. If Client and Target are not assurance clients of KPMG, this section must be deleted since it is irrelevant.]</w:t>
+      </w:r>
+    </w:p>
+    <w:p>
+      <w:r>
+        <w:t>{{BLOCK_INDEPENDENCE_START}}</w:t>
+      </w:r>
+    </w:p>
+    <w:p>
+      <w:pPr>
+        <w:pStyle w:val="BodyText"/>
+        <w:keepNext/>
+        <w:spacing w:line="260" w:lineRule="exact"/>
+        <w:jc w:val="both"/>
+        <w:rPr>
+          <w:rFonts w:asciiTheme="minorHAnsi" w:hAnsiTheme="minorHAnsi" w:cstheme="minorHAnsi"/>
+          <w:b/>
+          <w:bCs/>
+          <w:sz w:val="20"/>
+        </w:rPr>
+      </w:pPr>
+      <w:r>
+        <w:rPr>
+          <w:rFonts w:asciiTheme="minorHAnsi" w:hAnsiTheme="minorHAnsi" w:cstheme="minorHAnsi"/>
+          <w:b/>
+          <w:bCs/>
+          <w:sz w:val="20"/>
+        </w:rPr>
+        <w:lastRenderedPageBreak/>
+        <w:t>Independence Considerations</w:t>
+      </w:r>
+    </w:p>
+    <w:p>
+      <w:pPr>
+        <w:pStyle w:val="BodyText"/>
+        <w:keepNext/>
+        <w:spacing w:line="260" w:lineRule="exact"/>
+        <w:jc w:val="both"/>
+        <w:rPr>
+          <w:rFonts w:asciiTheme="minorHAnsi" w:hAnsiTheme="minorHAnsi" w:cstheme="minorHAnsi"/>
+          <w:sz w:val="20"/>
+        </w:rPr>
+      </w:pPr>
+      <w:r>
+        <w:rPr>
+          <w:rFonts w:asciiTheme="minorHAnsi" w:hAnsiTheme="minorHAnsi" w:cstheme="minorHAnsi"/>
+          <w:sz w:val="20"/>
+        </w:rPr>
+        <w:t xml:space="preserve">As you are aware, Client is </w:t>
+      </w:r>
+      <w:r>
+        <w:rPr>
+          <w:rFonts w:asciiTheme="minorHAnsi" w:hAnsiTheme="minorHAnsi" w:cstheme="minorHAnsi"/>
+          <w:sz w:val="20"/>
+        </w:rPr>
+        <w:t>{{CHOICE_SEC_STATUS}}</w:t>
+      </w:r>
+      <w:r>
+        <w:rPr>
+          <w:rFonts w:asciiTheme="minorHAnsi" w:hAnsiTheme="minorHAnsi" w:cstheme="minorHAnsi"/>
+          <w:sz w:val="20"/>
+        </w:rPr>
+        <w:t xml:space="preserve"> of KPMG. Therefore, the scope of our work is subject to certain limitations in order to maintain our independence.</w:t>
+      </w:r>
+    </w:p>
+    <w:p>
+      <w:pPr>
+        <w:pStyle w:val="BodyText"/>
+        <w:spacing w:line="260" w:lineRule="exact"/>
+        <w:jc w:val="both"/>
+        <w:rPr>
+          <w:rFonts w:asciiTheme="minorHAnsi" w:hAnsiTheme="minorHAnsi" w:cstheme="minorHAnsi"/>
+          <w:sz w:val="20"/>
+        </w:rPr>
+      </w:pPr>
+      <w:r>
+        <w:rPr>
+          <w:rFonts w:asciiTheme="minorHAnsi" w:hAnsiTheme="minorHAnsi" w:cstheme="minorHAnsi"/>
+          <w:sz w:val="20"/>
+        </w:rPr>
+        <w:t xml:space="preserve">Our reporting will present our objective analysis and commentary based upon the information obtained and will not provide assurance on any projected financial information you may prepare with respect to </w:t>
+      </w:r>
+      <w:r>
+        <w:rPr>
+          <w:rFonts w:asciiTheme="minorHAnsi" w:hAnsiTheme="minorHAnsi" w:cstheme="minorHAnsi"/>
+          <w:sz w:val="20"/>
+        </w:rPr>
+        <w:t>{{CHOICE_CLIENT_OR_TARGET}}</w:t>
+      </w:r>
+      <w:r>
+        <w:rPr>
+          <w:rFonts w:asciiTheme="minorHAnsi" w:hAnsiTheme="minorHAnsi" w:cstheme="minorHAnsi"/>
+          <w:sz w:val="20"/>
+        </w:rPr>
+        <w:t>.</w:t>
+      </w:r>
+    </w:p>
+    <w:p>
+      <w:pPr>
+        <w:pStyle w:val="BodyText"/>
+        <w:spacing w:line="260" w:lineRule="exact"/>
+        <w:jc w:val="both"/>
+        <w:rPr>
+          <w:rFonts w:asciiTheme="minorHAnsi" w:hAnsiTheme="minorHAnsi" w:cstheme="minorHAnsi"/>
+          <w:sz w:val="20"/>
+        </w:rPr>
+      </w:pPr>
+      <w:r>
+        <w:rPr>
+          <w:rFonts w:asciiTheme="minorHAnsi" w:hAnsiTheme="minorHAnsi" w:cstheme="minorHAnsi"/>
+          <w:sz w:val="20"/>
+        </w:rPr>
+        <w:t xml:space="preserve">Based upon the nature of our work (and limitations with respect to maintaining our independence), our work will not extend to facilitating or leading your Project </w:t>
+      </w:r>
+      <w:r>
+        <w:rPr>
+          <w:rFonts w:asciiTheme="minorHAnsi" w:hAnsiTheme="minorHAnsi" w:cstheme="minorHAnsi"/>
+          <w:sz w:val="20"/>
+        </w:rPr>
+        <w:t>{{PROJECT_CODE_NAME}}</w:t>
+      </w:r>
+      <w:r>
+        <w:rPr>
+          <w:rFonts w:asciiTheme="minorHAnsi" w:hAnsiTheme="minorHAnsi" w:cstheme="minorHAnsi"/>
+          <w:sz w:val="20"/>
+        </w:rPr>
+        <w:t xml:space="preserve"> meetings or workshops, nor will we assist you in preparing</w:t>
+      </w:r>
+      <w:r>
+        <w:rPr>
+          <w:rFonts w:asciiTheme="minorHAnsi" w:hAnsiTheme="minorHAnsi" w:cstheme="minorHAnsi"/>
+          <w:sz w:val="20"/>
+        </w:rPr>
+        <w:t xml:space="preserve"> </w:t>
+      </w:r>
+      <w:r>
+        <w:rPr>
+          <w:rFonts w:asciiTheme="minorHAnsi" w:hAnsiTheme="minorHAnsi" w:cstheme="minorHAnsi"/>
+          <w:sz w:val="20"/>
+        </w:rPr>
+        <w:t>{{CHOICE_CLIENT_OR_TARGET_POSSESSIVE}}</w:t>
+      </w:r>
+      <w:r>
+        <w:rPr>
+          <w:rFonts w:asciiTheme="minorHAnsi" w:hAnsiTheme="minorHAnsi" w:cstheme="minorHAnsi"/>
+          <w:sz w:val="20"/>
+        </w:rPr>
+        <w:t xml:space="preserve"> financial model or any projected financial information in connection with this engagement.</w:t>
+      </w:r>
+    </w:p>
+    <w:p>
+      <w:pPr>
+        <w:pStyle w:val="BodyText"/>
+        <w:spacing w:line="260" w:lineRule="exact"/>
+        <w:jc w:val="both"/>
         <w:rPr>
           <w:rFonts w:asciiTheme="minorHAnsi" w:hAnsiTheme="minorHAnsi" w:cstheme="minorHAnsi"/>
           <w:i/>
@@ -1289,127 +1483,6 @@
           <w:sz w:val="20"/>
           <w:highlight w:val="yellow"/>
         </w:rPr>
-        <w:t>[GUIDANCE: Tax Risk Management recommends the inclusion of the following paragraph if KPMG might provide tax services to Client under this EL and Client conducts business or resides in Québec:</w:t>
-      </w:r>
-    </w:p>
-    <w:p>
-      <w:pPr>
-        <w:pStyle w:val="BodyText"/>
-        <w:spacing w:line="260" w:lineRule="exact"/>
-        <w:jc w:val="both"/>
-        <w:rPr>
-          <w:rFonts w:asciiTheme="minorHAnsi" w:hAnsiTheme="minorHAnsi" w:cstheme="minorHAnsi"/>
-          <w:sz w:val="20"/>
-        </w:rPr>
-      </w:pPr>
-      <w:r>
-        <w:rPr>
-          <w:rFonts w:asciiTheme="minorHAnsi" w:hAnsiTheme="minorHAnsi" w:cstheme="minorHAnsi"/>
-          <w:sz w:val="20"/>
-        </w:rPr>
-        <w:t xml:space="preserve">If </w:t>
-      </w:r>
-      <w:r>
-        <w:rPr>
-          <w:rFonts w:asciiTheme="minorHAnsi" w:hAnsiTheme="minorHAnsi" w:cstheme="minorHAnsi"/>
-          <w:sz w:val="20"/>
-        </w:rPr>
-        <w:t>{{CLIENT_OR_TARGET}}</w:t>
-      </w:r>
-      <w:r>
-        <w:rPr>
-          <w:rFonts w:asciiTheme="minorHAnsi" w:hAnsiTheme="minorHAnsi" w:cstheme="minorHAnsi"/>
-          <w:sz w:val="20"/>
-        </w:rPr>
-        <w:t xml:space="preserve"> </w:t>
-      </w:r>
-      <w:r>
-        <w:rPr>
-          <w:rFonts w:asciiTheme="minorHAnsi" w:hAnsiTheme="minorHAnsi" w:cstheme="minorHAnsi"/>
-          <w:sz w:val="20"/>
-        </w:rPr>
-        <w:t xml:space="preserve">carries on business or resides in Québec, KPMG wishes to advise you that Québec introduced legislation that prohibits a taxpayer who has carried out a transaction, or series of transactions, that is subject to a </w:t>
-      </w:r>
-      <w:proofErr w:type="spellStart"/>
-      <w:r>
-        <w:rPr>
-          <w:rFonts w:asciiTheme="minorHAnsi" w:hAnsiTheme="minorHAnsi" w:cstheme="minorHAnsi"/>
-          <w:sz w:val="20"/>
-        </w:rPr>
-        <w:t>Revenu</w:t>
-      </w:r>
-      <w:proofErr w:type="spellEnd"/>
-      <w:r>
-        <w:rPr>
-          <w:rFonts w:asciiTheme="minorHAnsi" w:hAnsiTheme="minorHAnsi" w:cstheme="minorHAnsi"/>
-          <w:sz w:val="20"/>
-        </w:rPr>
-        <w:t xml:space="preserve"> Québec final assessment based on the general anti-avoidance rule, from being able to obtain authorization from the </w:t>
-      </w:r>
-      <w:r>
-        <w:rPr>
-          <w:rFonts w:asciiTheme="minorHAnsi" w:hAnsiTheme="minorHAnsi" w:cstheme="minorHAnsi"/>
-          <w:i/>
-          <w:iCs/>
-          <w:sz w:val="20"/>
-        </w:rPr>
-        <w:t xml:space="preserve">Autorité des </w:t>
-      </w:r>
-      <w:proofErr w:type="spellStart"/>
-      <w:r>
-        <w:rPr>
-          <w:rFonts w:asciiTheme="minorHAnsi" w:hAnsiTheme="minorHAnsi" w:cstheme="minorHAnsi"/>
-          <w:i/>
-          <w:iCs/>
-          <w:sz w:val="20"/>
-        </w:rPr>
-        <w:t>marchés</w:t>
-      </w:r>
-      <w:proofErr w:type="spellEnd"/>
-      <w:r>
-        <w:rPr>
-          <w:rFonts w:asciiTheme="minorHAnsi" w:hAnsiTheme="minorHAnsi" w:cstheme="minorHAnsi"/>
-          <w:i/>
-          <w:iCs/>
-          <w:sz w:val="20"/>
-        </w:rPr>
-        <w:t xml:space="preserve"> publics</w:t>
-      </w:r>
-      <w:r>
-        <w:rPr>
-          <w:rFonts w:asciiTheme="minorHAnsi" w:hAnsiTheme="minorHAnsi" w:cstheme="minorHAnsi"/>
-          <w:sz w:val="20"/>
-        </w:rPr>
-        <w:t xml:space="preserve"> (“</w:t>
-      </w:r>
-      <w:r>
-        <w:rPr>
-          <w:rFonts w:asciiTheme="minorHAnsi" w:hAnsiTheme="minorHAnsi" w:cstheme="minorHAnsi"/>
-          <w:b/>
-          <w:bCs/>
-          <w:sz w:val="20"/>
-        </w:rPr>
-        <w:t>AMP</w:t>
-      </w:r>
-      <w:r>
-        <w:rPr>
-          <w:rFonts w:asciiTheme="minorHAnsi" w:hAnsiTheme="minorHAnsi" w:cstheme="minorHAnsi"/>
-          <w:sz w:val="20"/>
-        </w:rPr>
-        <w:t>”) to bid for or obtain public contracts. The taxpayer will be listed in the Register of Enterprises Ineligible for Public Contracts for a period of five years from the time the name is entered on the list.</w:t>
-      </w:r>
-    </w:p>
-    <w:p>
-      <w:pPr>
-        <w:pStyle w:val="BodyText"/>
-        <w:spacing w:line="260" w:lineRule="exact"/>
-        <w:jc w:val="both"/>
-        <w:rPr>
-          <w:rFonts w:asciiTheme="minorHAnsi" w:hAnsiTheme="minorHAnsi" w:cstheme="minorHAnsi"/>
-          <w:i/>
-          <w:iCs/>
-          <w:sz w:val="20"/>
-        </w:rPr>
       </w:pPr>
       <w:r>
         <w:rPr>
@@ -1420,18 +1493,17 @@
           <w:sz w:val="20"/>
           <w:highlight w:val="yellow"/>
         </w:rPr>
-        <w:t>[GUIDANCE: the following section is mandatory if the Client or Target are assurance clients (or potential future assurance clients in the near-term) of KPMG. If Client and Target are not assurance clients of KPMG, this section must be deleted since it is irrelevant.]</w:t>
-      </w:r>
-    </w:p>
-    <w:p>
-      <w:r>
-        <w:t>{{BLOCK_INDEPENDENCE_START}}</w:t>
-      </w:r>
-    </w:p>
-    <w:p>
-      <w:pPr>
-        <w:pStyle w:val="BodyText"/>
-        <w:keepNext/>
+        <w:t>[GUIDANCE: the following section is mandatory for all clients. It may not be deleted and is key to have in our sell-side diligence contracts with clients.]</w:t>
+      </w:r>
+    </w:p>
+    <w:p>
+      <w:r>
+        <w:t>{{BLOCK_INDEPENDENCE_END}}</w:t>
+      </w:r>
+    </w:p>
+    <w:p>
+      <w:pPr>
+        <w:pStyle w:val="BodyText"/>
         <w:spacing w:line="260" w:lineRule="exact"/>
         <w:jc w:val="both"/>
         <w:rPr>
@@ -1448,14 +1520,12 @@
           <w:bCs/>
           <w:sz w:val="20"/>
         </w:rPr>
-        <w:lastRenderedPageBreak/>
-        <w:t>Independence Considerations</w:t>
-      </w:r>
-    </w:p>
-    <w:p>
-      <w:pPr>
-        <w:pStyle w:val="BodyText"/>
-        <w:keepNext/>
+        <w:t>Management’s Responsibilities</w:t>
+      </w:r>
+    </w:p>
+    <w:p>
+      <w:pPr>
+        <w:pStyle w:val="BodyText"/>
         <w:spacing w:line="260" w:lineRule="exact"/>
         <w:jc w:val="both"/>
         <w:rPr>
@@ -1468,202 +1538,7 @@
           <w:rFonts w:asciiTheme="minorHAnsi" w:hAnsiTheme="minorHAnsi" w:cstheme="minorHAnsi"/>
           <w:sz w:val="20"/>
         </w:rPr>
-        <w:t xml:space="preserve">As you are aware, Client is </w:t>
-      </w:r>
-      <w:r>
-        <w:rPr>
-          <w:rFonts w:asciiTheme="minorHAnsi" w:hAnsiTheme="minorHAnsi" w:cstheme="minorHAnsi"/>
-          <w:sz w:val="20"/>
-        </w:rPr>
-        <w:t>{{CHOICE_SEC_STATUS}}</w:t>
-      </w:r>
-      <w:r>
-        <w:rPr>
-          <w:rFonts w:asciiTheme="minorHAnsi" w:hAnsiTheme="minorHAnsi" w:cstheme="minorHAnsi"/>
-          <w:sz w:val="20"/>
-        </w:rPr>
-        <w:t xml:space="preserve"> of KPMG. Therefore, the scope of our work is subject to certain limitations </w:t>
-      </w:r>
-      <w:proofErr w:type="gramStart"/>
-      <w:r>
-        <w:rPr>
-          <w:rFonts w:asciiTheme="minorHAnsi" w:hAnsiTheme="minorHAnsi" w:cstheme="minorHAnsi"/>
-          <w:sz w:val="20"/>
-        </w:rPr>
-        <w:t>in order to</w:t>
-      </w:r>
-      <w:proofErr w:type="gramEnd"/>
-      <w:r>
-        <w:rPr>
-          <w:rFonts w:asciiTheme="minorHAnsi" w:hAnsiTheme="minorHAnsi" w:cstheme="minorHAnsi"/>
-          <w:sz w:val="20"/>
-        </w:rPr>
-        <w:t xml:space="preserve"> maintain our independence.</w:t>
-      </w:r>
-    </w:p>
-    <w:p>
-      <w:pPr>
-        <w:pStyle w:val="BodyText"/>
-        <w:spacing w:line="260" w:lineRule="exact"/>
-        <w:jc w:val="both"/>
-        <w:rPr>
-          <w:rFonts w:asciiTheme="minorHAnsi" w:hAnsiTheme="minorHAnsi" w:cstheme="minorHAnsi"/>
-          <w:sz w:val="20"/>
-        </w:rPr>
-      </w:pPr>
-      <w:r>
-        <w:rPr>
-          <w:rFonts w:asciiTheme="minorHAnsi" w:hAnsiTheme="minorHAnsi" w:cstheme="minorHAnsi"/>
-          <w:sz w:val="20"/>
-        </w:rPr>
-        <w:t xml:space="preserve">Our reporting will present our objective analysis and commentary based upon the information obtained and will not provide assurance on any projected financial information you may prepare with respect to </w:t>
-      </w:r>
-      <w:r>
-        <w:rPr>
-          <w:rFonts w:asciiTheme="minorHAnsi" w:hAnsiTheme="minorHAnsi" w:cstheme="minorHAnsi"/>
-          <w:sz w:val="20"/>
-        </w:rPr>
-        <w:t>{{CHOICE_CLIENT_OR_TARGET}}</w:t>
-      </w:r>
-      <w:r>
-        <w:rPr>
-          <w:rFonts w:asciiTheme="minorHAnsi" w:hAnsiTheme="minorHAnsi" w:cstheme="minorHAnsi"/>
-          <w:sz w:val="20"/>
-        </w:rPr>
-        <w:t>.</w:t>
-      </w:r>
-    </w:p>
-    <w:p>
-      <w:pPr>
-        <w:pStyle w:val="BodyText"/>
-        <w:spacing w:line="260" w:lineRule="exact"/>
-        <w:jc w:val="both"/>
-        <w:rPr>
-          <w:rFonts w:asciiTheme="minorHAnsi" w:hAnsiTheme="minorHAnsi" w:cstheme="minorHAnsi"/>
-          <w:sz w:val="20"/>
-        </w:rPr>
-      </w:pPr>
-      <w:r>
-        <w:rPr>
-          <w:rFonts w:asciiTheme="minorHAnsi" w:hAnsiTheme="minorHAnsi" w:cstheme="minorHAnsi"/>
-          <w:sz w:val="20"/>
-        </w:rPr>
-        <w:t xml:space="preserve">Based upon the nature of our work (and limitations with respect to maintaining our independence), our work will not extend to facilitating or leading your Project </w:t>
-      </w:r>
-      <w:r>
-        <w:rPr>
-          <w:rFonts w:asciiTheme="minorHAnsi" w:hAnsiTheme="minorHAnsi" w:cstheme="minorHAnsi"/>
-          <w:sz w:val="20"/>
-        </w:rPr>
-        <w:t>{{PROJECT_CODE_NAME}}</w:t>
-      </w:r>
-      <w:r>
-        <w:rPr>
-          <w:rFonts w:asciiTheme="minorHAnsi" w:hAnsiTheme="minorHAnsi" w:cstheme="minorHAnsi"/>
-          <w:sz w:val="20"/>
-        </w:rPr>
-        <w:t xml:space="preserve"> meetings or workshops, nor will we assist you in preparing</w:t>
-      </w:r>
-      <w:r>
-        <w:rPr>
-          <w:rFonts w:asciiTheme="minorHAnsi" w:hAnsiTheme="minorHAnsi" w:cstheme="minorHAnsi"/>
-          <w:sz w:val="20"/>
-        </w:rPr>
-        <w:t xml:space="preserve"> </w:t>
-      </w:r>
-      <w:r>
-        <w:rPr>
-          <w:rFonts w:asciiTheme="minorHAnsi" w:hAnsiTheme="minorHAnsi" w:cstheme="minorHAnsi"/>
-          <w:sz w:val="20"/>
-        </w:rPr>
-        <w:t>{{CHOICE_CLIENT_OR_TARGET_POSSESSIVE}}</w:t>
-      </w:r>
-      <w:r>
-        <w:rPr>
-          <w:rFonts w:asciiTheme="minorHAnsi" w:hAnsiTheme="minorHAnsi" w:cstheme="minorHAnsi"/>
-          <w:sz w:val="20"/>
-        </w:rPr>
-        <w:t xml:space="preserve"> financial model or any projected financial information in connection with this engagement.</w:t>
-      </w:r>
-    </w:p>
-    <w:p>
-      <w:pPr>
-        <w:pStyle w:val="BodyText"/>
-        <w:spacing w:line="260" w:lineRule="exact"/>
-        <w:jc w:val="both"/>
-        <w:rPr>
-          <w:rFonts w:asciiTheme="minorHAnsi" w:hAnsiTheme="minorHAnsi" w:cstheme="minorHAnsi"/>
-          <w:i/>
-          <w:iCs/>
-          <w:color w:val="FF0000"/>
-          <w:sz w:val="20"/>
-          <w:highlight w:val="yellow"/>
-        </w:rPr>
-      </w:pPr>
-      <w:r>
-        <w:rPr>
-          <w:rFonts w:asciiTheme="minorHAnsi" w:hAnsiTheme="minorHAnsi" w:cstheme="minorHAnsi"/>
-          <w:i/>
-          <w:iCs/>
-          <w:color w:val="FF0000"/>
-          <w:sz w:val="20"/>
-          <w:highlight w:val="yellow"/>
-        </w:rPr>
-        <w:t>[GUIDANCE: the following section is mandatory for all clients. It may not be deleted and is key to have in our sell-side diligence contracts with clients.]</w:t>
-      </w:r>
-    </w:p>
-    <w:p>
-      <w:r>
-        <w:t>{{BLOCK_INDEPENDENCE_END}}</w:t>
-      </w:r>
-    </w:p>
-    <w:p>
-      <w:pPr>
-        <w:pStyle w:val="BodyText"/>
-        <w:spacing w:line="260" w:lineRule="exact"/>
-        <w:jc w:val="both"/>
-        <w:rPr>
-          <w:rFonts w:asciiTheme="minorHAnsi" w:hAnsiTheme="minorHAnsi" w:cstheme="minorHAnsi"/>
-          <w:b/>
-          <w:bCs/>
-          <w:sz w:val="20"/>
-        </w:rPr>
-      </w:pPr>
-      <w:r>
-        <w:rPr>
-          <w:rFonts w:asciiTheme="minorHAnsi" w:hAnsiTheme="minorHAnsi" w:cstheme="minorHAnsi"/>
-          <w:b/>
-          <w:bCs/>
-          <w:sz w:val="20"/>
-        </w:rPr>
-        <w:t>Management’s Responsibilities</w:t>
-      </w:r>
-    </w:p>
-    <w:p>
-      <w:pPr>
-        <w:pStyle w:val="BodyText"/>
-        <w:spacing w:line="260" w:lineRule="exact"/>
-        <w:jc w:val="both"/>
-        <w:rPr>
-          <w:rFonts w:asciiTheme="minorHAnsi" w:hAnsiTheme="minorHAnsi" w:cstheme="minorHAnsi"/>
-          <w:sz w:val="20"/>
-        </w:rPr>
-      </w:pPr>
-      <w:proofErr w:type="gramStart"/>
-      <w:r>
-        <w:rPr>
-          <w:rFonts w:asciiTheme="minorHAnsi" w:hAnsiTheme="minorHAnsi" w:cstheme="minorHAnsi"/>
-          <w:sz w:val="20"/>
-        </w:rPr>
-        <w:t>With regard to</w:t>
-      </w:r>
-      <w:proofErr w:type="gramEnd"/>
-      <w:r>
-        <w:rPr>
-          <w:rFonts w:asciiTheme="minorHAnsi" w:hAnsiTheme="minorHAnsi" w:cstheme="minorHAnsi"/>
-          <w:sz w:val="20"/>
-        </w:rPr>
-        <w:t xml:space="preserve"> KPMG’s services delivered in accordance with this engagement letter, Client is responsible for: </w:t>
+        <w:t xml:space="preserve">With regard to KPMG’s services delivered in accordance with this engagement letter, Client is responsible for: </w:t>
       </w:r>
     </w:p>
     <w:p>
@@ -1685,17 +1560,8 @@
           <w:rFonts w:asciiTheme="minorHAnsi" w:hAnsiTheme="minorHAnsi" w:cstheme="minorHAnsi"/>
           <w:sz w:val="20"/>
         </w:rPr>
-        <w:t xml:space="preserve">designating a management-level individual of appropriate seniority and authority to oversee Project {{PROJECT_CODE_NAME}} and to address issues as they arise. The individual must have the skills, experience, and knowledge of {{CHOICE_CLIENT_OR_TARGET_POSSESSIVE}} business necessary to effectively perform this function. We understand that {{EL_SIGNATORY_NAME}} will fulfill these </w:t>
-      </w:r>
-      <w:proofErr w:type="gramStart"/>
-      <w:r>
-        <w:rPr>
-          <w:rFonts w:asciiTheme="minorHAnsi" w:hAnsiTheme="minorHAnsi" w:cstheme="minorHAnsi"/>
-          <w:sz w:val="20"/>
-        </w:rPr>
-        <w:t>responsibilities;</w:t>
-      </w:r>
-      <w:proofErr w:type="gramEnd"/>
+        <w:t>designating a management-level individual of appropriate seniority and authority to oversee Project {{PROJECT_CODE_NAME}} and to address issues as they arise. The individual must have the skills, experience, and knowledge of {{CHOICE_CLIENT_OR_TARGET_POSSESSIVE}} business necessary to effectively perform this function. We understand that {{EL_SIGNATORY_NAME}} will fulfill these responsibilities;</w:t>
+      </w:r>
     </w:p>
     <w:p>
       <w:pPr>
@@ -1716,17 +1582,8 @@
           <w:rFonts w:asciiTheme="minorHAnsi" w:hAnsiTheme="minorHAnsi" w:cstheme="minorHAnsi"/>
           <w:sz w:val="20"/>
         </w:rPr>
-        <w:t xml:space="preserve">determining the objectives, scope, and extent of KPMG’s </w:t>
-      </w:r>
-      <w:proofErr w:type="gramStart"/>
-      <w:r>
-        <w:rPr>
-          <w:rFonts w:asciiTheme="minorHAnsi" w:hAnsiTheme="minorHAnsi" w:cstheme="minorHAnsi"/>
-          <w:sz w:val="20"/>
-        </w:rPr>
-        <w:t>services;</w:t>
-      </w:r>
-      <w:proofErr w:type="gramEnd"/>
+        <w:t>determining the objectives, scope, and extent of KPMG’s services;</w:t>
+      </w:r>
     </w:p>
     <w:p>
       <w:pPr>
@@ -1776,23 +1633,7 @@
           <w:rFonts w:asciiTheme="minorHAnsi" w:hAnsiTheme="minorHAnsi" w:cstheme="minorHAnsi"/>
           <w:sz w:val="20"/>
         </w:rPr>
-        <w:t xml:space="preserve">evaluating the </w:t>
-      </w:r>
-      <w:proofErr w:type="gramStart"/>
-      <w:r>
-        <w:rPr>
-          <w:rFonts w:asciiTheme="minorHAnsi" w:hAnsiTheme="minorHAnsi" w:cstheme="minorHAnsi"/>
-          <w:sz w:val="20"/>
-        </w:rPr>
-        <w:t>adequacy, and</w:t>
-      </w:r>
-      <w:proofErr w:type="gramEnd"/>
-      <w:r>
-        <w:rPr>
-          <w:rFonts w:asciiTheme="minorHAnsi" w:hAnsiTheme="minorHAnsi" w:cstheme="minorHAnsi"/>
-          <w:sz w:val="20"/>
-        </w:rPr>
-        <w:t xml:space="preserve"> accept responsibility for </w:t>
+        <w:t xml:space="preserve">evaluating the adequacy, and accept responsibility for </w:t>
       </w:r>
       <w:r>
         <w:rPr>
@@ -2260,30 +2101,14 @@
           <w:rFonts w:asciiTheme="minorHAnsi" w:hAnsiTheme="minorHAnsi" w:cstheme="minorHAnsi"/>
           <w:sz w:val="20"/>
         </w:rPr>
-        <w:t>{{FEE_DISCOUNT_CLAUSE</w:t>
-      </w:r>
-      <w:proofErr w:type="gramStart"/>
-      <w:r>
-        <w:rPr>
-          <w:rFonts w:asciiTheme="minorHAnsi" w:hAnsiTheme="minorHAnsi" w:cstheme="minorHAnsi"/>
-          <w:sz w:val="20"/>
-        </w:rPr>
-        <w:t>}}</w:t>
-      </w:r>
-      <w:r>
-        <w:rPr>
-          <w:rFonts w:asciiTheme="minorHAnsi" w:hAnsiTheme="minorHAnsi" w:cstheme="minorHAnsi"/>
-          <w:sz w:val="20"/>
-        </w:rPr>
-        <w:t>%</w:t>
-      </w:r>
-      <w:proofErr w:type="gramEnd"/>
-      <w:r>
-        <w:rPr>
-          <w:rFonts w:asciiTheme="minorHAnsi" w:hAnsiTheme="minorHAnsi" w:cstheme="minorHAnsi"/>
-          <w:sz w:val="20"/>
-        </w:rPr>
-        <w:t xml:space="preserve"> discount from our standard hourly rates. Neither the amount of our fees nor the payment of our fees and expenses will depend upon whether you move forward with </w:t>
+        <w:t>{{FEE_DISCOUNT_CLAUSE}}</w:t>
+      </w:r>
+      <w:r>
+        <w:rPr>
+          <w:rFonts w:asciiTheme="minorHAnsi" w:hAnsiTheme="minorHAnsi" w:cstheme="minorHAnsi"/>
+          <w:sz w:val="20"/>
+        </w:rPr>
+        <w:t xml:space="preserve">% discount from our standard hourly rates. Neither the amount of our fees nor the payment of our fees and expenses will depend upon whether you move forward with </w:t>
       </w:r>
       <w:r>
         <w:rPr>
@@ -2304,30 +2129,14 @@
           <w:rFonts w:asciiTheme="minorHAnsi" w:hAnsiTheme="minorHAnsi" w:cstheme="minorHAnsi"/>
           <w:sz w:val="20"/>
         </w:rPr>
-        <w:t>{{FEE_DISCOUNT_PERCENT</w:t>
-      </w:r>
-      <w:proofErr w:type="gramStart"/>
-      <w:r>
-        <w:rPr>
-          <w:rFonts w:asciiTheme="minorHAnsi" w:hAnsiTheme="minorHAnsi" w:cstheme="minorHAnsi"/>
-          <w:sz w:val="20"/>
-        </w:rPr>
-        <w:t>}}</w:t>
-      </w:r>
-      <w:r>
-        <w:rPr>
-          <w:rFonts w:asciiTheme="minorHAnsi" w:hAnsiTheme="minorHAnsi" w:cstheme="minorHAnsi"/>
-          <w:sz w:val="20"/>
-        </w:rPr>
-        <w:t>%</w:t>
-      </w:r>
-      <w:proofErr w:type="gramEnd"/>
-      <w:r>
-        <w:rPr>
-          <w:rFonts w:asciiTheme="minorHAnsi" w:hAnsiTheme="minorHAnsi" w:cstheme="minorHAnsi"/>
-          <w:sz w:val="20"/>
-        </w:rPr>
-        <w:t xml:space="preserve"> discount):</w:t>
+        <w:t>{{FEE_DISCOUNT_PERCENT}}</w:t>
+      </w:r>
+      <w:r>
+        <w:rPr>
+          <w:rFonts w:asciiTheme="minorHAnsi" w:hAnsiTheme="minorHAnsi" w:cstheme="minorHAnsi"/>
+          <w:sz w:val="20"/>
+        </w:rPr>
+        <w:t>% discount):</w:t>
       </w:r>
     </w:p>
     <w:p>
@@ -2443,23 +2252,7 @@
           <w:sz w:val="20"/>
         </w:rPr>
         <w:tab/>
-        <w:t xml:space="preserve">Report </w:t>
-      </w:r>
-      <w:proofErr w:type="gramStart"/>
-      <w:r>
-        <w:rPr>
-          <w:rFonts w:asciiTheme="minorHAnsi" w:hAnsiTheme="minorHAnsi" w:cstheme="minorHAnsi"/>
-          <w:sz w:val="20"/>
-        </w:rPr>
-        <w:t>update</w:t>
-      </w:r>
-      <w:proofErr w:type="gramEnd"/>
-      <w:r>
-        <w:rPr>
-          <w:rFonts w:asciiTheme="minorHAnsi" w:hAnsiTheme="minorHAnsi" w:cstheme="minorHAnsi"/>
-          <w:sz w:val="20"/>
-        </w:rPr>
-        <w:t xml:space="preserve"> for additional monthly results</w:t>
+        <w:t>Report update for additional monthly results</w:t>
       </w:r>
       <w:r>
         <w:rPr>
@@ -2601,23 +2394,7 @@
           <w:rFonts w:asciiTheme="minorHAnsi" w:hAnsiTheme="minorHAnsi" w:cstheme="minorHAnsi"/>
           <w:sz w:val="20"/>
         </w:rPr>
-        <w:t xml:space="preserve">% technology and support charge to cover information technology infrastructure costs and administrative support of our client service personnel which are not included in our professional fees. The technology and support charge covers costs such as our client service personnel computer hardware and customized KPMG software, telecommunications equipment, client service professional administrative support, IT programming professional services and other client support services. Reasonable out-of-pocket costs, such as travel, meals, accommodations, and </w:t>
-      </w:r>
-      <w:proofErr w:type="gramStart"/>
-      <w:r>
-        <w:rPr>
-          <w:rFonts w:asciiTheme="minorHAnsi" w:hAnsiTheme="minorHAnsi" w:cstheme="minorHAnsi"/>
-          <w:sz w:val="20"/>
-        </w:rPr>
-        <w:t>third party</w:t>
-      </w:r>
-      <w:proofErr w:type="gramEnd"/>
-      <w:r>
-        <w:rPr>
-          <w:rFonts w:asciiTheme="minorHAnsi" w:hAnsiTheme="minorHAnsi" w:cstheme="minorHAnsi"/>
-          <w:sz w:val="20"/>
-        </w:rPr>
-        <w:t xml:space="preserve"> database costs, will be charged in addition based on our actual costs.</w:t>
+        <w:t>% technology and support charge to cover information technology infrastructure costs and administrative support of our client service personnel which are not included in our professional fees. The technology and support charge covers costs such as our client service personnel computer hardware and customized KPMG software, telecommunications equipment, client service professional administrative support, IT programming professional services and other client support services. Reasonable out-of-pocket costs, such as travel, meals, accommodations, and third party database costs, will be charged in addition based on our actual costs.</w:t>
       </w:r>
     </w:p>
     <w:p>
@@ -2653,23 +2430,7 @@
           <w:rFonts w:asciiTheme="minorHAnsi" w:hAnsiTheme="minorHAnsi" w:cstheme="minorHAnsi"/>
           <w:sz w:val="20"/>
         </w:rPr>
-        <w:t xml:space="preserve">Additional costs may be required </w:t>
-      </w:r>
-      <w:proofErr w:type="gramStart"/>
-      <w:r>
-        <w:rPr>
-          <w:rFonts w:asciiTheme="minorHAnsi" w:hAnsiTheme="minorHAnsi" w:cstheme="minorHAnsi"/>
-          <w:sz w:val="20"/>
-        </w:rPr>
-        <w:t>as a result of</w:t>
-      </w:r>
-      <w:proofErr w:type="gramEnd"/>
-      <w:r>
-        <w:rPr>
-          <w:rFonts w:asciiTheme="minorHAnsi" w:hAnsiTheme="minorHAnsi" w:cstheme="minorHAnsi"/>
-          <w:sz w:val="20"/>
-        </w:rPr>
-        <w:t xml:space="preserve"> any material change in the engagement or difficulties in obtaining information which could not reasonably be foreseen and which cause additional work not included in the original fee estimate. We will discuss and obtain approval from you of any material changes in the engagement or difficulties in obtaining information prior to performing any additional work.</w:t>
+        <w:t>Additional costs may be required as a result of any material change in the engagement or difficulties in obtaining information which could not reasonably be foreseen and which cause additional work not included in the original fee estimate. We will discuss and obtain approval from you of any material changes in the engagement or difficulties in obtaining information prior to performing any additional work.</w:t>
       </w:r>
     </w:p>
     <w:p>
@@ -2747,7 +2508,7 @@
         </w:rPr>
         <w:t xml:space="preserve"> </w:t>
       </w:r>
-      <w:commentRangeStart w:id="2"/>
+      <w:commentRangeStart w:id="3"/>
       <w:r>
         <w:rPr>
           <w:rFonts w:asciiTheme="minorHAnsi" w:hAnsiTheme="minorHAnsi" w:cstheme="minorHAnsi"/>
@@ -2796,17 +2557,8 @@
           <w:rFonts w:asciiTheme="minorHAnsi" w:hAnsiTheme="minorHAnsi" w:cstheme="minorHAnsi"/>
           <w:sz w:val="20"/>
         </w:rPr>
-        <w:t xml:space="preserve"> for </w:t>
-      </w:r>
-      <w:proofErr w:type="gramStart"/>
-      <w:r>
-        <w:rPr>
-          <w:rFonts w:asciiTheme="minorHAnsi" w:hAnsiTheme="minorHAnsi" w:cstheme="minorHAnsi"/>
-          <w:sz w:val="20"/>
-        </w:rPr>
-        <w:t>comments;</w:t>
-      </w:r>
-      <w:proofErr w:type="gramEnd"/>
+        <w:t xml:space="preserve"> for comments;</w:t>
+      </w:r>
     </w:p>
     <w:p>
       <w:pPr>
@@ -2898,31 +2650,16 @@
           <w:rFonts w:asciiTheme="minorHAnsi" w:hAnsiTheme="minorHAnsi" w:cstheme="minorHAnsi"/>
           <w:sz w:val="20"/>
         </w:rPr>
-        <w:t xml:space="preserve">SPA commentary, and other out-of-scope procedures will be issued </w:t>
-      </w:r>
-      <w:proofErr w:type="gramStart"/>
-      <w:r>
-        <w:rPr>
-          <w:rFonts w:asciiTheme="minorHAnsi" w:hAnsiTheme="minorHAnsi" w:cstheme="minorHAnsi"/>
-          <w:sz w:val="20"/>
-        </w:rPr>
-        <w:t>on a monthly basis</w:t>
-      </w:r>
-      <w:proofErr w:type="gramEnd"/>
-      <w:r>
-        <w:rPr>
-          <w:rFonts w:asciiTheme="minorHAnsi" w:hAnsiTheme="minorHAnsi" w:cstheme="minorHAnsi"/>
-          <w:sz w:val="20"/>
-        </w:rPr>
-        <w:t>.</w:t>
-      </w:r>
-      <w:commentRangeEnd w:id="2"/>
+        <w:t>SPA commentary, and other out-of-scope procedures will be issued on a monthly basis.</w:t>
+      </w:r>
+      <w:commentRangeEnd w:id="3"/>
       <w:r>
         <w:rPr>
           <w:rStyle w:val="CommentReference"/>
-          <w:rFonts w:ascii="Times New Roman" w:hAnsi="Times New Roman"/>
-        </w:rPr>
-        <w:commentReference w:id="2"/>
+          <w:rFonts w:asciiTheme="minorHAnsi" w:hAnsiTheme="minorHAnsi" w:cstheme="minorHAnsi"/>
+          <w:sz w:val="20"/>
+        </w:rPr>
+        <w:commentReference w:id="3"/>
       </w:r>
     </w:p>
     <w:p>
@@ -3022,31 +2759,7 @@
           <w:sz w:val="20"/>
           <w:highlight w:val="yellow"/>
         </w:rPr>
-        <w:t xml:space="preserve">[GUIDANCE: It is very rare at the start of a sell-side DD engagement for there to be an identified conflict. However, this could occur if there is a bidder identified upfront and included as an Other Party in your initial Sentinel Request. If the Sentinel Resolver identified a professional conflict that must be disclosed to Client and that </w:t>
-      </w:r>
-      <w:proofErr w:type="gramStart"/>
-      <w:r>
-        <w:rPr>
-          <w:rFonts w:asciiTheme="minorHAnsi" w:hAnsiTheme="minorHAnsi" w:cstheme="minorHAnsi"/>
-          <w:i/>
-          <w:iCs/>
-          <w:color w:val="FF0000"/>
-          <w:sz w:val="20"/>
-          <w:highlight w:val="yellow"/>
-        </w:rPr>
-        <w:t>requires</w:t>
-      </w:r>
-      <w:proofErr w:type="gramEnd"/>
-      <w:r>
-        <w:rPr>
-          <w:rFonts w:asciiTheme="minorHAnsi" w:hAnsiTheme="minorHAnsi" w:cstheme="minorHAnsi"/>
-          <w:i/>
-          <w:iCs/>
-          <w:color w:val="FF0000"/>
-          <w:sz w:val="20"/>
-          <w:highlight w:val="yellow"/>
-        </w:rPr>
-        <w:t xml:space="preserve"> we obtain a release and indemnity, keep these sections below and tailor to the specific situation. If there has been no professional conflict identified, then the three sections below (i.e. “Other Relationships”, “Ethical Divider and Confidentiality Procedures”, and “Consent, Release and Indemnity”, must be deleted entirely as you have nothing to disclose and there is no requirement to outline our standard Ethical Divider and Confidentiality Procedures in our engagement letters.]</w:t>
+        <w:t>[GUIDANCE: It is very rare at the start of a sell-side DD engagement for there to be an identified conflict. However, this could occur if there is a bidder identified upfront and included as an Other Party in your initial Sentinel Request. If the Sentinel Resolver identified a professional conflict that must be disclosed to Client and that requires we obtain a release and indemnity, keep these sections below and tailor to the specific situation. If there has been no professional conflict identified, then the three sections below (i.e. “Other Relationships”, “Ethical Divider and Confidentiality Procedures”, and “Consent, Release and Indemnity”, must be deleted entirely as you have nothing to disclose and there is no requirement to outline our standard Ethical Divider and Confidentiality Procedures in our engagement letters.]</w:t>
       </w:r>
     </w:p>
     <w:p>
@@ -3254,31 +2967,7 @@
           <w:sz w:val="20"/>
           <w:highlight w:val="yellow"/>
         </w:rPr>
-        <w:t xml:space="preserve">[GUIDANCE: Depending on the specific situation identified by the Resolver, different confidentiality procedures may be necessary. Consult the Advisory RM Portal and find guidance in the “Conflicts of Interest” area to find and insert the applicable template wording which describes the confidentiality procedures (e.g. Appendix 6a, Appendix 7, Appendix 10, etc.) that apply to your specific situation. All wording must be </w:t>
-      </w:r>
-      <w:proofErr w:type="gramStart"/>
-      <w:r>
-        <w:rPr>
-          <w:rFonts w:asciiTheme="minorHAnsi" w:hAnsiTheme="minorHAnsi" w:cstheme="minorHAnsi"/>
-          <w:i/>
-          <w:iCs/>
-          <w:color w:val="FF0000"/>
-          <w:sz w:val="20"/>
-          <w:highlight w:val="yellow"/>
-        </w:rPr>
-        <w:t>tailored</w:t>
-      </w:r>
-      <w:proofErr w:type="gramEnd"/>
-      <w:r>
-        <w:rPr>
-          <w:rFonts w:asciiTheme="minorHAnsi" w:hAnsiTheme="minorHAnsi" w:cstheme="minorHAnsi"/>
-          <w:i/>
-          <w:iCs/>
-          <w:color w:val="FF0000"/>
-          <w:sz w:val="20"/>
-          <w:highlight w:val="yellow"/>
-        </w:rPr>
-        <w:t xml:space="preserve"> and engagement teams are required to fulfil all promises made to the Client.]</w:t>
+        <w:t>[GUIDANCE: Depending on the specific situation identified by the Resolver, different confidentiality procedures may be necessary. Consult the Advisory RM Portal and find guidance in the “Conflicts of Interest” area to find and insert the applicable template wording which describes the confidentiality procedures (e.g. Appendix 6a, Appendix 7, Appendix 10, etc.) that apply to your specific situation. All wording must be tailored and engagement teams are required to fulfil all promises made to the Client.]</w:t>
       </w:r>
     </w:p>
     <w:p>
@@ -3319,23 +3008,7 @@
           <w:sz w:val="20"/>
         </w:rPr>
         <w:lastRenderedPageBreak/>
-        <w:t xml:space="preserve">By signing this letter, you confirm that Client is satisfied with the foregoing confidentiality </w:t>
-      </w:r>
-      <w:proofErr w:type="gramStart"/>
-      <w:r>
-        <w:rPr>
-          <w:rFonts w:asciiTheme="minorHAnsi" w:hAnsiTheme="minorHAnsi" w:cstheme="minorHAnsi"/>
-          <w:sz w:val="20"/>
-        </w:rPr>
-        <w:t>procedures</w:t>
-      </w:r>
-      <w:proofErr w:type="gramEnd"/>
-      <w:r>
-        <w:rPr>
-          <w:rFonts w:asciiTheme="minorHAnsi" w:hAnsiTheme="minorHAnsi" w:cstheme="minorHAnsi"/>
-          <w:sz w:val="20"/>
-        </w:rPr>
-        <w:t xml:space="preserve"> and you further agree that Client:</w:t>
+        <w:t>By signing this letter, you confirm that Client is satisfied with the foregoing confidentiality procedures and you further agree that Client:</w:t>
       </w:r>
     </w:p>
     <w:p>
@@ -3778,87 +3451,85 @@
           <w:sz w:val="20"/>
           <w:highlight w:val="yellow"/>
         </w:rPr>
-        <w:t xml:space="preserve">[GUIDANCE: </w:t>
-      </w:r>
-      <w:proofErr w:type="gramStart"/>
-      <w:r>
+        <w:t>[GUIDANCE: non Canada CPA partners must use the following below the partner’s signature since such partners must be referred to as authorized signatories when binding KPMG LLP to contracts]</w:t>
+      </w:r>
+    </w:p>
+    <w:p>
+      <w:pPr>
+        <w:pStyle w:val="BodyText"/>
+        <w:spacing w:after="0" w:line="260" w:lineRule="exact"/>
+        <w:ind w:left="-360"/>
+        <w:jc w:val="both"/>
+        <w:rPr>
+          <w:rFonts w:asciiTheme="minorHAnsi" w:hAnsiTheme="minorHAnsi" w:cstheme="minorHAnsi"/>
+          <w:sz w:val="20"/>
+        </w:rPr>
+      </w:pPr>
+      <w:r>
+        <w:rPr>
+          <w:rFonts w:asciiTheme="minorHAnsi" w:hAnsiTheme="minorHAnsi" w:cstheme="minorHAnsi"/>
+          <w:sz w:val="20"/>
+        </w:rPr>
+        <w:t>By:</w:t>
+      </w:r>
+      <w:r>
+        <w:rPr>
+          <w:rFonts w:asciiTheme="minorHAnsi" w:hAnsiTheme="minorHAnsi" w:cstheme="minorHAnsi"/>
+          <w:sz w:val="20"/>
+        </w:rPr>
+        <w:tab/>
+      </w:r>
+      <w:r>
+        <w:rPr>
+          <w:rFonts w:asciiTheme="minorHAnsi" w:hAnsiTheme="minorHAnsi" w:cstheme="minorHAnsi"/>
+          <w:sz w:val="20"/>
+        </w:rPr>
+        <w:t>{{SIGNING_PARTNER_NAME}}</w:t>
+      </w:r>
+    </w:p>
+    <w:p>
+      <w:pPr>
+        <w:pStyle w:val="BodyText"/>
+        <w:spacing w:before="0" w:after="0" w:line="260" w:lineRule="exact"/>
+        <w:jc w:val="both"/>
         <w:rPr>
           <w:rFonts w:asciiTheme="minorHAnsi" w:hAnsiTheme="minorHAnsi" w:cstheme="minorHAnsi"/>
           <w:i/>
           <w:iCs/>
-          <w:color w:val="FF0000"/>
-          <w:sz w:val="20"/>
-          <w:highlight w:val="yellow"/>
-        </w:rPr>
-        <w:t>non Canada</w:t>
-      </w:r>
-      <w:proofErr w:type="gramEnd"/>
+          <w:sz w:val="20"/>
+        </w:rPr>
+      </w:pPr>
       <w:r>
         <w:rPr>
           <w:rFonts w:asciiTheme="minorHAnsi" w:hAnsiTheme="minorHAnsi" w:cstheme="minorHAnsi"/>
           <w:i/>
           <w:iCs/>
-          <w:color w:val="FF0000"/>
-          <w:sz w:val="20"/>
-          <w:highlight w:val="yellow"/>
-        </w:rPr>
-        <w:t xml:space="preserve"> CPA partners must use the following below the partner’s signature since such partners must be referred to as authorized signatories when binding KPMG LLP to contracts]</w:t>
-      </w:r>
-    </w:p>
-    <w:p>
-      <w:pPr>
-        <w:pStyle w:val="BodyText"/>
-        <w:spacing w:after="0" w:line="260" w:lineRule="exact"/>
-        <w:ind w:left="-360"/>
-        <w:jc w:val="both"/>
-        <w:rPr>
-          <w:rFonts w:asciiTheme="minorHAnsi" w:hAnsiTheme="minorHAnsi" w:cstheme="minorHAnsi"/>
-          <w:sz w:val="20"/>
-        </w:rPr>
-      </w:pPr>
-      <w:r>
-        <w:rPr>
-          <w:rFonts w:asciiTheme="minorHAnsi" w:hAnsiTheme="minorHAnsi" w:cstheme="minorHAnsi"/>
-          <w:sz w:val="20"/>
-        </w:rPr>
-        <w:t>By:</w:t>
-      </w:r>
-      <w:r>
-        <w:rPr>
-          <w:rFonts w:asciiTheme="minorHAnsi" w:hAnsiTheme="minorHAnsi" w:cstheme="minorHAnsi"/>
-          <w:sz w:val="20"/>
-        </w:rPr>
-        <w:tab/>
-      </w:r>
-      <w:r>
-        <w:rPr>
-          <w:rFonts w:asciiTheme="minorHAnsi" w:hAnsiTheme="minorHAnsi" w:cstheme="minorHAnsi"/>
-          <w:sz w:val="20"/>
-        </w:rPr>
-        <w:t>{{SIGNING_PARTNER_NAME}}</w:t>
-      </w:r>
-    </w:p>
-    <w:p>
-      <w:pPr>
-        <w:pStyle w:val="BodyText"/>
-        <w:spacing w:before="0" w:after="0" w:line="260" w:lineRule="exact"/>
-        <w:jc w:val="both"/>
+          <w:sz w:val="20"/>
+        </w:rPr>
+        <w:t>Authorized signatory</w:t>
+      </w:r>
+      <w:r>
         <w:rPr>
           <w:rFonts w:asciiTheme="minorHAnsi" w:hAnsiTheme="minorHAnsi" w:cstheme="minorHAnsi"/>
           <w:i/>
           <w:iCs/>
           <w:sz w:val="20"/>
         </w:rPr>
-      </w:pPr>
-      <w:r>
+        <w:t xml:space="preserve"> of KPMG LLP</w:t>
+      </w:r>
+    </w:p>
+    <w:p>
+      <w:pPr>
+        <w:pStyle w:val="BodyText"/>
+        <w:spacing w:before="0" w:after="0" w:line="260" w:lineRule="exact"/>
+        <w:jc w:val="both"/>
         <w:rPr>
           <w:rFonts w:asciiTheme="minorHAnsi" w:hAnsiTheme="minorHAnsi" w:cstheme="minorHAnsi"/>
           <w:i/>
           <w:iCs/>
           <w:sz w:val="20"/>
         </w:rPr>
-        <w:t>Authorized signatory</w:t>
-      </w:r>
+      </w:pPr>
       <w:r>
         <w:rPr>
           <w:rFonts w:asciiTheme="minorHAnsi" w:hAnsiTheme="minorHAnsi" w:cstheme="minorHAnsi"/>
@@ -3866,13 +3537,13 @@
           <w:iCs/>
           <w:sz w:val="20"/>
         </w:rPr>
-        <w:t xml:space="preserve"> of KPMG LLP</w:t>
-      </w:r>
-    </w:p>
-    <w:p>
-      <w:pPr>
-        <w:pStyle w:val="BodyText"/>
-        <w:spacing w:before="0" w:after="0" w:line="260" w:lineRule="exact"/>
+        <w:t>Partner, KPMG Canada</w:t>
+      </w:r>
+    </w:p>
+    <w:p>
+      <w:pPr>
+        <w:pStyle w:val="BodyText"/>
+        <w:spacing w:before="0" w:line="260" w:lineRule="exact"/>
         <w:jc w:val="both"/>
         <w:rPr>
           <w:rFonts w:asciiTheme="minorHAnsi" w:hAnsiTheme="minorHAnsi" w:cstheme="minorHAnsi"/>
@@ -3888,28 +3559,6 @@
           <w:iCs/>
           <w:sz w:val="20"/>
         </w:rPr>
-        <w:t>Partner, KPMG Canada</w:t>
-      </w:r>
-    </w:p>
-    <w:p>
-      <w:pPr>
-        <w:pStyle w:val="BodyText"/>
-        <w:spacing w:before="0" w:line="260" w:lineRule="exact"/>
-        <w:jc w:val="both"/>
-        <w:rPr>
-          <w:rFonts w:asciiTheme="minorHAnsi" w:hAnsiTheme="minorHAnsi" w:cstheme="minorHAnsi"/>
-          <w:i/>
-          <w:iCs/>
-          <w:sz w:val="20"/>
-        </w:rPr>
-      </w:pPr>
-      <w:r>
-        <w:rPr>
-          <w:rFonts w:asciiTheme="minorHAnsi" w:hAnsiTheme="minorHAnsi" w:cstheme="minorHAnsi"/>
-          <w:i/>
-          <w:iCs/>
-          <w:sz w:val="20"/>
-        </w:rPr>
         <w:t>Deal Advisory</w:t>
       </w:r>
     </w:p>
@@ -3979,23 +3628,7 @@
           <w:color w:val="000000" w:themeColor="text1"/>
           <w:sz w:val="20"/>
         </w:rPr>
-        <w:t xml:space="preserve">I have read and understood the terms and conditions of this engagement </w:t>
-      </w:r>
-      <w:proofErr w:type="gramStart"/>
-      <w:r>
-        <w:rPr>
-          <w:color w:val="000000" w:themeColor="text1"/>
-          <w:sz w:val="20"/>
-        </w:rPr>
-        <w:t>letter</w:t>
-      </w:r>
-      <w:proofErr w:type="gramEnd"/>
-      <w:r>
-        <w:rPr>
-          <w:color w:val="000000" w:themeColor="text1"/>
-          <w:sz w:val="20"/>
-        </w:rPr>
-        <w:t xml:space="preserve"> and I agree to accept them for and on behalf of </w:t>
+        <w:t xml:space="preserve">I have read and understood the terms and conditions of this engagement letter and I agree to accept them for and on behalf of </w:t>
       </w:r>
       <w:r>
         <w:rPr>
@@ -4486,23 +4119,7 @@
           <w:rFonts w:asciiTheme="minorHAnsi" w:hAnsiTheme="minorHAnsi" w:cstheme="minorHAnsi"/>
           <w:sz w:val="20"/>
         </w:rPr>
-        <w:t xml:space="preserve"> officers and management </w:t>
-      </w:r>
-      <w:proofErr w:type="gramStart"/>
-      <w:r>
-        <w:rPr>
-          <w:rFonts w:asciiTheme="minorHAnsi" w:hAnsiTheme="minorHAnsi" w:cstheme="minorHAnsi"/>
-          <w:sz w:val="20"/>
-        </w:rPr>
-        <w:t>in order to</w:t>
-      </w:r>
-      <w:proofErr w:type="gramEnd"/>
-      <w:r>
-        <w:rPr>
-          <w:rFonts w:asciiTheme="minorHAnsi" w:hAnsiTheme="minorHAnsi" w:cstheme="minorHAnsi"/>
-          <w:sz w:val="20"/>
-        </w:rPr>
-        <w:t xml:space="preserve"> develop an understanding of </w:t>
+        <w:t xml:space="preserve"> officers and management in order to develop an understanding of </w:t>
       </w:r>
       <w:r>
         <w:rPr>
@@ -4538,17 +4155,8 @@
           <w:rFonts w:asciiTheme="minorHAnsi" w:hAnsiTheme="minorHAnsi" w:cstheme="minorHAnsi"/>
           <w:sz w:val="20"/>
         </w:rPr>
-        <w:t xml:space="preserve">History, organization structure, proposed transaction perimeter and management reporting </w:t>
-      </w:r>
-      <w:proofErr w:type="gramStart"/>
-      <w:r>
-        <w:rPr>
-          <w:rFonts w:asciiTheme="minorHAnsi" w:hAnsiTheme="minorHAnsi" w:cstheme="minorHAnsi"/>
-          <w:sz w:val="20"/>
-        </w:rPr>
-        <w:t>relationships;</w:t>
-      </w:r>
-      <w:proofErr w:type="gramEnd"/>
+        <w:t>History, organization structure, proposed transaction perimeter and management reporting relationships;</w:t>
+      </w:r>
     </w:p>
     <w:p>
       <w:pPr>
@@ -4583,17 +4191,8 @@
           <w:rFonts w:asciiTheme="minorHAnsi" w:hAnsiTheme="minorHAnsi" w:cstheme="minorHAnsi"/>
           <w:sz w:val="20"/>
         </w:rPr>
-        <w:t xml:space="preserve"> operations and allocation of corporate </w:t>
-      </w:r>
-      <w:proofErr w:type="gramStart"/>
-      <w:r>
-        <w:rPr>
-          <w:rFonts w:asciiTheme="minorHAnsi" w:hAnsiTheme="minorHAnsi" w:cstheme="minorHAnsi"/>
-          <w:sz w:val="20"/>
-        </w:rPr>
-        <w:t>overheads;</w:t>
-      </w:r>
-      <w:proofErr w:type="gramEnd"/>
+        <w:t xml:space="preserve"> operations and allocation of corporate overheads;</w:t>
+      </w:r>
     </w:p>
     <w:p>
       <w:pPr>
@@ -4614,17 +4213,8 @@
           <w:rFonts w:asciiTheme="minorHAnsi" w:hAnsiTheme="minorHAnsi" w:cstheme="minorHAnsi"/>
           <w:sz w:val="20"/>
         </w:rPr>
-        <w:t xml:space="preserve">Production sites/ lines capacity, utilization </w:t>
-      </w:r>
-      <w:proofErr w:type="gramStart"/>
-      <w:r>
-        <w:rPr>
-          <w:rFonts w:asciiTheme="minorHAnsi" w:hAnsiTheme="minorHAnsi" w:cstheme="minorHAnsi"/>
-          <w:sz w:val="20"/>
-        </w:rPr>
-        <w:t>rates;</w:t>
-      </w:r>
-      <w:proofErr w:type="gramEnd"/>
+        <w:t>Production sites/ lines capacity, utilization rates;</w:t>
+      </w:r>
     </w:p>
     <w:p>
       <w:pPr>
@@ -4645,17 +4235,8 @@
           <w:rFonts w:asciiTheme="minorHAnsi" w:hAnsiTheme="minorHAnsi" w:cstheme="minorHAnsi"/>
           <w:sz w:val="20"/>
         </w:rPr>
-        <w:t>Details of pricing methodology; key contractual terms with key customers (incl. ability to pass cost increases to customers</w:t>
-      </w:r>
-      <w:proofErr w:type="gramStart"/>
-      <w:r>
-        <w:rPr>
-          <w:rFonts w:asciiTheme="minorHAnsi" w:hAnsiTheme="minorHAnsi" w:cstheme="minorHAnsi"/>
-          <w:sz w:val="20"/>
-        </w:rPr>
-        <w:t>);</w:t>
-      </w:r>
-      <w:proofErr w:type="gramEnd"/>
+        <w:t>Details of pricing methodology; key contractual terms with key customers (incl. ability to pass cost increases to customers);</w:t>
+      </w:r>
     </w:p>
     <w:p>
       <w:pPr>
@@ -4676,17 +4257,8 @@
           <w:rFonts w:asciiTheme="minorHAnsi" w:hAnsiTheme="minorHAnsi" w:cstheme="minorHAnsi"/>
           <w:sz w:val="20"/>
         </w:rPr>
-        <w:t xml:space="preserve">Range of suppliers, significant dependencies; key contractual terms; price volatility for key materials; inventory levels and </w:t>
-      </w:r>
-      <w:proofErr w:type="gramStart"/>
-      <w:r>
-        <w:rPr>
-          <w:rFonts w:asciiTheme="minorHAnsi" w:hAnsiTheme="minorHAnsi" w:cstheme="minorHAnsi"/>
-          <w:sz w:val="20"/>
-        </w:rPr>
-        <w:t>turnover;</w:t>
-      </w:r>
-      <w:proofErr w:type="gramEnd"/>
+        <w:t>Range of suppliers, significant dependencies; key contractual terms; price volatility for key materials; inventory levels and turnover;</w:t>
+      </w:r>
     </w:p>
     <w:p>
       <w:pPr>
@@ -4707,17 +4279,8 @@
           <w:rFonts w:asciiTheme="minorHAnsi" w:hAnsiTheme="minorHAnsi" w:cstheme="minorHAnsi"/>
           <w:sz w:val="20"/>
         </w:rPr>
-        <w:t xml:space="preserve">Range of customer segments, customer concentration and regions </w:t>
-      </w:r>
-      <w:proofErr w:type="gramStart"/>
-      <w:r>
-        <w:rPr>
-          <w:rFonts w:asciiTheme="minorHAnsi" w:hAnsiTheme="minorHAnsi" w:cstheme="minorHAnsi"/>
-          <w:sz w:val="20"/>
-        </w:rPr>
-        <w:t>served;</w:t>
-      </w:r>
-      <w:proofErr w:type="gramEnd"/>
+        <w:t>Range of customer segments, customer concentration and regions served;</w:t>
+      </w:r>
     </w:p>
     <w:p>
       <w:pPr>
@@ -4738,17 +4301,8 @@
           <w:rFonts w:asciiTheme="minorHAnsi" w:hAnsiTheme="minorHAnsi" w:cstheme="minorHAnsi"/>
           <w:sz w:val="20"/>
         </w:rPr>
-        <w:t xml:space="preserve">Key performance metrics used by </w:t>
-      </w:r>
-      <w:proofErr w:type="gramStart"/>
-      <w:r>
-        <w:rPr>
-          <w:rFonts w:asciiTheme="minorHAnsi" w:hAnsiTheme="minorHAnsi" w:cstheme="minorHAnsi"/>
-          <w:sz w:val="20"/>
-        </w:rPr>
-        <w:t>management;</w:t>
-      </w:r>
-      <w:proofErr w:type="gramEnd"/>
+        <w:t>Key performance metrics used by management;</w:t>
+      </w:r>
     </w:p>
     <w:p>
       <w:pPr>
@@ -4769,17 +4323,8 @@
           <w:rFonts w:asciiTheme="minorHAnsi" w:hAnsiTheme="minorHAnsi" w:cstheme="minorHAnsi"/>
           <w:sz w:val="20"/>
         </w:rPr>
-        <w:t xml:space="preserve">Financial reporting framework and information systems; monthly/annual cut-off </w:t>
-      </w:r>
-      <w:proofErr w:type="gramStart"/>
-      <w:r>
-        <w:rPr>
-          <w:rFonts w:asciiTheme="minorHAnsi" w:hAnsiTheme="minorHAnsi" w:cstheme="minorHAnsi"/>
-          <w:sz w:val="20"/>
-        </w:rPr>
-        <w:t>process;</w:t>
-      </w:r>
-      <w:proofErr w:type="gramEnd"/>
+        <w:t>Financial reporting framework and information systems; monthly/annual cut-off process;</w:t>
+      </w:r>
     </w:p>
     <w:p>
       <w:pPr>
@@ -4800,23 +4345,7 @@
           <w:rFonts w:asciiTheme="minorHAnsi" w:hAnsiTheme="minorHAnsi" w:cstheme="minorHAnsi"/>
           <w:sz w:val="20"/>
         </w:rPr>
-        <w:t xml:space="preserve">Key accounting policies </w:t>
-      </w:r>
-      <w:proofErr w:type="gramStart"/>
-      <w:r>
-        <w:rPr>
-          <w:rFonts w:asciiTheme="minorHAnsi" w:hAnsiTheme="minorHAnsi" w:cstheme="minorHAnsi"/>
-          <w:sz w:val="20"/>
-        </w:rPr>
-        <w:t>including:</w:t>
-      </w:r>
-      <w:proofErr w:type="gramEnd"/>
-      <w:r>
-        <w:rPr>
-          <w:rFonts w:asciiTheme="minorHAnsi" w:hAnsiTheme="minorHAnsi" w:cstheme="minorHAnsi"/>
-          <w:sz w:val="20"/>
-        </w:rPr>
-        <w:t xml:space="preserve"> revenue recognition, inventory valuation methodologies, costing methodology, warranties, provisions, management estimates, etc.</w:t>
+        <w:t>Key accounting policies including: revenue recognition, inventory valuation methodologies, costing methodology, warranties, provisions, management estimates, etc.</w:t>
       </w:r>
     </w:p>
     <w:p>
@@ -4902,7 +4431,6 @@
         </w:rPr>
         <w:t xml:space="preserve">Normalization adjustments identified by </w:t>
       </w:r>
-      <w:proofErr w:type="gramStart"/>
       <w:r>
         <w:rPr>
           <w:rFonts w:asciiTheme="minorHAnsi" w:hAnsiTheme="minorHAnsi" w:cstheme="minorHAnsi"/>
@@ -4924,7 +4452,6 @@
         </w:rPr>
         <w:t>;</w:t>
       </w:r>
-      <w:proofErr w:type="gramEnd"/>
     </w:p>
     <w:p>
       <w:pPr>
@@ -4946,17 +4473,8 @@
           <w:rFonts w:asciiTheme="minorHAnsi" w:hAnsiTheme="minorHAnsi" w:cstheme="minorHAnsi"/>
           <w:sz w:val="20"/>
         </w:rPr>
-        <w:t xml:space="preserve">The impact from significant foreign exchange </w:t>
-      </w:r>
-      <w:proofErr w:type="gramStart"/>
-      <w:r>
-        <w:rPr>
-          <w:rFonts w:asciiTheme="minorHAnsi" w:hAnsiTheme="minorHAnsi" w:cstheme="minorHAnsi"/>
-          <w:sz w:val="20"/>
-        </w:rPr>
-        <w:t>fluctuations;</w:t>
-      </w:r>
-      <w:proofErr w:type="gramEnd"/>
+        <w:t>The impact from significant foreign exchange fluctuations;</w:t>
+      </w:r>
     </w:p>
     <w:p>
       <w:pPr>
@@ -4978,23 +4496,7 @@
           <w:rFonts w:asciiTheme="minorHAnsi" w:hAnsiTheme="minorHAnsi" w:cstheme="minorHAnsi"/>
           <w:sz w:val="20"/>
         </w:rPr>
-        <w:t>The impact of non-cash items (i.e., stock-based compensation</w:t>
-      </w:r>
-      <w:proofErr w:type="gramStart"/>
-      <w:r>
-        <w:rPr>
-          <w:rFonts w:asciiTheme="minorHAnsi" w:hAnsiTheme="minorHAnsi" w:cstheme="minorHAnsi"/>
-          <w:sz w:val="20"/>
-        </w:rPr>
-        <w:t>);</w:t>
-      </w:r>
-      <w:proofErr w:type="gramEnd"/>
-      <w:r>
-        <w:rPr>
-          <w:rFonts w:asciiTheme="minorHAnsi" w:hAnsiTheme="minorHAnsi" w:cstheme="minorHAnsi"/>
-          <w:sz w:val="20"/>
-        </w:rPr>
-        <w:t xml:space="preserve"> </w:t>
+        <w:t xml:space="preserve">The impact of non-cash items (i.e., stock-based compensation); </w:t>
       </w:r>
     </w:p>
     <w:p>
@@ -5017,17 +4519,8 @@
           <w:rFonts w:asciiTheme="minorHAnsi" w:hAnsiTheme="minorHAnsi" w:cstheme="minorHAnsi"/>
           <w:sz w:val="20"/>
         </w:rPr>
-        <w:t xml:space="preserve">The pro forma impact from recent </w:t>
-      </w:r>
-      <w:proofErr w:type="gramStart"/>
-      <w:r>
-        <w:rPr>
-          <w:rFonts w:asciiTheme="minorHAnsi" w:hAnsiTheme="minorHAnsi" w:cstheme="minorHAnsi"/>
-          <w:sz w:val="20"/>
-        </w:rPr>
-        <w:t>acquisitions;</w:t>
-      </w:r>
-      <w:proofErr w:type="gramEnd"/>
+        <w:t>The pro forma impact from recent acquisitions;</w:t>
+      </w:r>
     </w:p>
     <w:p>
       <w:pPr>
@@ -5049,17 +4542,8 @@
           <w:rFonts w:asciiTheme="minorHAnsi" w:hAnsiTheme="minorHAnsi" w:cstheme="minorHAnsi"/>
           <w:sz w:val="20"/>
         </w:rPr>
-        <w:t xml:space="preserve">The pro forma impact from significant cost saving initiatives, if </w:t>
-      </w:r>
-      <w:proofErr w:type="gramStart"/>
-      <w:r>
-        <w:rPr>
-          <w:rFonts w:asciiTheme="minorHAnsi" w:hAnsiTheme="minorHAnsi" w:cstheme="minorHAnsi"/>
-          <w:sz w:val="20"/>
-        </w:rPr>
-        <w:t>any;</w:t>
-      </w:r>
-      <w:proofErr w:type="gramEnd"/>
+        <w:t>The pro forma impact from significant cost saving initiatives, if any;</w:t>
+      </w:r>
     </w:p>
     <w:p>
       <w:pPr>
@@ -5104,17 +4588,8 @@
           <w:rFonts w:asciiTheme="minorHAnsi" w:hAnsiTheme="minorHAnsi" w:cstheme="minorHAnsi"/>
           <w:sz w:val="20"/>
         </w:rPr>
-        <w:t xml:space="preserve">The impact of any changes in accounting </w:t>
-      </w:r>
-      <w:proofErr w:type="gramStart"/>
-      <w:r>
-        <w:rPr>
-          <w:rFonts w:asciiTheme="minorHAnsi" w:hAnsiTheme="minorHAnsi" w:cstheme="minorHAnsi"/>
-          <w:sz w:val="20"/>
-        </w:rPr>
-        <w:t>policies;</w:t>
-      </w:r>
-      <w:proofErr w:type="gramEnd"/>
+        <w:t>The impact of any changes in accounting policies;</w:t>
+      </w:r>
     </w:p>
     <w:p>
       <w:pPr>
@@ -5137,17 +4612,8 @@
           <w:sz w:val="20"/>
         </w:rPr>
         <w:lastRenderedPageBreak/>
-        <w:t xml:space="preserve">Related party transactions and the pricing </w:t>
-      </w:r>
-      <w:proofErr w:type="gramStart"/>
-      <w:r>
-        <w:rPr>
-          <w:rFonts w:asciiTheme="minorHAnsi" w:hAnsiTheme="minorHAnsi" w:cstheme="minorHAnsi"/>
-          <w:sz w:val="20"/>
-        </w:rPr>
-        <w:t>thereof;</w:t>
-      </w:r>
-      <w:proofErr w:type="gramEnd"/>
+        <w:t>Related party transactions and the pricing thereof;</w:t>
+      </w:r>
     </w:p>
     <w:p>
       <w:pPr>
@@ -5209,27 +4675,7 @@
           <w:bCs/>
           <w:sz w:val="20"/>
         </w:rPr>
-        <w:t xml:space="preserve">Revenue, material value </w:t>
-      </w:r>
-      <w:proofErr w:type="gramStart"/>
-      <w:r>
-        <w:rPr>
-          <w:rFonts w:asciiTheme="minorHAnsi" w:hAnsiTheme="minorHAnsi" w:cstheme="minorHAnsi"/>
-          <w:b/>
-          <w:bCs/>
-          <w:sz w:val="20"/>
-        </w:rPr>
-        <w:t>add</w:t>
-      </w:r>
-      <w:proofErr w:type="gramEnd"/>
-      <w:r>
-        <w:rPr>
-          <w:rFonts w:asciiTheme="minorHAnsi" w:hAnsiTheme="minorHAnsi" w:cstheme="minorHAnsi"/>
-          <w:b/>
-          <w:bCs/>
-          <w:sz w:val="20"/>
-        </w:rPr>
-        <w:t xml:space="preserve"> and contribution margin trends</w:t>
+        <w:t>Revenue, material value add and contribution margin trends</w:t>
       </w:r>
     </w:p>
     <w:p>
@@ -5248,23 +4694,7 @@
           <w:rFonts w:asciiTheme="minorHAnsi" w:hAnsiTheme="minorHAnsi" w:cstheme="minorHAnsi"/>
           <w:sz w:val="20"/>
         </w:rPr>
-        <w:t xml:space="preserve">Obtain a comprehensive view of revenue, material value </w:t>
-      </w:r>
-      <w:proofErr w:type="gramStart"/>
-      <w:r>
-        <w:rPr>
-          <w:rFonts w:asciiTheme="minorHAnsi" w:hAnsiTheme="minorHAnsi" w:cstheme="minorHAnsi"/>
-          <w:sz w:val="20"/>
-        </w:rPr>
-        <w:t>add</w:t>
-      </w:r>
-      <w:proofErr w:type="gramEnd"/>
-      <w:r>
-        <w:rPr>
-          <w:rFonts w:asciiTheme="minorHAnsi" w:hAnsiTheme="minorHAnsi" w:cstheme="minorHAnsi"/>
-          <w:sz w:val="20"/>
-        </w:rPr>
-        <w:t xml:space="preserve"> and contribution margin (pending data availability) by product order</w:t>
+        <w:t>Obtain a comprehensive view of revenue, material value add and contribution margin (pending data availability) by product order</w:t>
       </w:r>
       <w:r>
         <w:rPr>
@@ -5315,23 +4745,7 @@
           <w:rFonts w:asciiTheme="minorHAnsi" w:hAnsiTheme="minorHAnsi" w:cstheme="minorHAnsi"/>
           <w:sz w:val="20"/>
         </w:rPr>
-        <w:t xml:space="preserve">Revenue and margin trends by product category / </w:t>
-      </w:r>
-      <w:proofErr w:type="gramStart"/>
-      <w:r>
-        <w:rPr>
-          <w:rFonts w:asciiTheme="minorHAnsi" w:hAnsiTheme="minorHAnsi" w:cstheme="minorHAnsi"/>
-          <w:sz w:val="20"/>
-        </w:rPr>
-        <w:t>SKU;</w:t>
-      </w:r>
-      <w:proofErr w:type="gramEnd"/>
-      <w:r>
-        <w:rPr>
-          <w:rFonts w:asciiTheme="minorHAnsi" w:hAnsiTheme="minorHAnsi" w:cstheme="minorHAnsi"/>
-          <w:sz w:val="20"/>
-        </w:rPr>
-        <w:t xml:space="preserve"> </w:t>
+        <w:t xml:space="preserve">Revenue and margin trends by product category / SKU; </w:t>
       </w:r>
     </w:p>
     <w:p>
@@ -5354,17 +4768,8 @@
           <w:rFonts w:asciiTheme="minorHAnsi" w:hAnsiTheme="minorHAnsi" w:cstheme="minorHAnsi"/>
           <w:sz w:val="20"/>
         </w:rPr>
-        <w:t xml:space="preserve">Revenue and margin by significant customer and end market/ segment/ </w:t>
-      </w:r>
-      <w:proofErr w:type="gramStart"/>
-      <w:r>
-        <w:rPr>
-          <w:rFonts w:asciiTheme="minorHAnsi" w:hAnsiTheme="minorHAnsi" w:cstheme="minorHAnsi"/>
-          <w:sz w:val="20"/>
-        </w:rPr>
-        <w:t>region;</w:t>
-      </w:r>
-      <w:proofErr w:type="gramEnd"/>
+        <w:t>Revenue and margin by significant customer and end market/ segment/ region;</w:t>
+      </w:r>
     </w:p>
     <w:p>
       <w:pPr>
@@ -5386,17 +4791,8 @@
           <w:rFonts w:asciiTheme="minorHAnsi" w:hAnsiTheme="minorHAnsi" w:cstheme="minorHAnsi"/>
           <w:sz w:val="20"/>
         </w:rPr>
-        <w:t xml:space="preserve">Price and volume </w:t>
-      </w:r>
-      <w:proofErr w:type="gramStart"/>
-      <w:r>
-        <w:rPr>
-          <w:rFonts w:asciiTheme="minorHAnsi" w:hAnsiTheme="minorHAnsi" w:cstheme="minorHAnsi"/>
-          <w:sz w:val="20"/>
-        </w:rPr>
-        <w:t>trends;</w:t>
-      </w:r>
-      <w:proofErr w:type="gramEnd"/>
+        <w:t>Price and volume trends;</w:t>
+      </w:r>
     </w:p>
     <w:p>
       <w:pPr>
@@ -5441,23 +4837,7 @@
           <w:rFonts w:asciiTheme="minorHAnsi" w:hAnsiTheme="minorHAnsi" w:cstheme="minorHAnsi"/>
           <w:sz w:val="20"/>
         </w:rPr>
-        <w:t>impact of large or long-term orders/ seasonality (if applicable</w:t>
-      </w:r>
-      <w:proofErr w:type="gramStart"/>
-      <w:r>
-        <w:rPr>
-          <w:rFonts w:asciiTheme="minorHAnsi" w:hAnsiTheme="minorHAnsi" w:cstheme="minorHAnsi"/>
-          <w:sz w:val="20"/>
-        </w:rPr>
-        <w:t>);</w:t>
-      </w:r>
-      <w:proofErr w:type="gramEnd"/>
-      <w:r>
-        <w:rPr>
-          <w:rFonts w:asciiTheme="minorHAnsi" w:hAnsiTheme="minorHAnsi" w:cstheme="minorHAnsi"/>
-          <w:sz w:val="20"/>
-        </w:rPr>
-        <w:t xml:space="preserve"> </w:t>
+        <w:t xml:space="preserve">impact of large or long-term orders/ seasonality (if applicable); </w:t>
       </w:r>
     </w:p>
     <w:p>
@@ -5480,15 +4860,7 @@
           <w:rFonts w:asciiTheme="minorHAnsi" w:hAnsiTheme="minorHAnsi" w:cstheme="minorHAnsi"/>
           <w:sz w:val="20"/>
         </w:rPr>
-        <w:t xml:space="preserve">any non-recurring components of </w:t>
-      </w:r>
-      <w:proofErr w:type="gramStart"/>
-      <w:r>
-        <w:rPr>
-          <w:rFonts w:asciiTheme="minorHAnsi" w:hAnsiTheme="minorHAnsi" w:cstheme="minorHAnsi"/>
-          <w:sz w:val="20"/>
-        </w:rPr>
-        <w:t>revenue</w:t>
+        <w:t>any non-recurring components of revenue</w:t>
       </w:r>
       <w:r>
         <w:rPr>
@@ -5497,7 +4869,6 @@
         </w:rPr>
         <w:t>;</w:t>
       </w:r>
-      <w:proofErr w:type="gramEnd"/>
     </w:p>
     <w:p>
       <w:pPr>
@@ -5519,39 +4890,7 @@
           <w:rFonts w:asciiTheme="minorHAnsi" w:hAnsiTheme="minorHAnsi" w:cstheme="minorHAnsi"/>
           <w:sz w:val="20"/>
         </w:rPr>
-        <w:t xml:space="preserve">Breakdown of costs of goods sold </w:t>
-      </w:r>
-      <w:proofErr w:type="gramStart"/>
-      <w:r>
-        <w:rPr>
-          <w:rFonts w:asciiTheme="minorHAnsi" w:hAnsiTheme="minorHAnsi" w:cstheme="minorHAnsi"/>
-          <w:sz w:val="20"/>
-        </w:rPr>
-        <w:t>including:</w:t>
-      </w:r>
-      <w:proofErr w:type="gramEnd"/>
-      <w:r>
-        <w:rPr>
-          <w:rFonts w:asciiTheme="minorHAnsi" w:hAnsiTheme="minorHAnsi" w:cstheme="minorHAnsi"/>
-          <w:sz w:val="20"/>
-        </w:rPr>
-        <w:t xml:space="preserve"> materials, scrap/waste, </w:t>
-      </w:r>
-      <w:proofErr w:type="spellStart"/>
-      <w:r>
-        <w:rPr>
-          <w:rFonts w:asciiTheme="minorHAnsi" w:hAnsiTheme="minorHAnsi" w:cstheme="minorHAnsi"/>
-          <w:sz w:val="20"/>
-        </w:rPr>
-        <w:t>labour</w:t>
-      </w:r>
-      <w:proofErr w:type="spellEnd"/>
-      <w:r>
-        <w:rPr>
-          <w:rFonts w:asciiTheme="minorHAnsi" w:hAnsiTheme="minorHAnsi" w:cstheme="minorHAnsi"/>
-          <w:sz w:val="20"/>
-        </w:rPr>
-        <w:t xml:space="preserve"> expense, manufacturing overhead, packing and outbound freight for product sales</w:t>
+        <w:t>Breakdown of costs of goods sold including: materials, scrap/waste, labour expense, manufacturing overhead, packing and outbound freight for product sales</w:t>
       </w:r>
       <w:r>
         <w:rPr>
@@ -5677,17 +5016,8 @@
           <w:rFonts w:asciiTheme="minorHAnsi" w:hAnsiTheme="minorHAnsi" w:cstheme="minorHAnsi"/>
           <w:sz w:val="20"/>
         </w:rPr>
-        <w:t xml:space="preserve">Salaries and benefits (including headcount and average compensation costs, incentive-based compensation, severance, other), and any capitalization of </w:t>
-      </w:r>
-      <w:proofErr w:type="gramStart"/>
-      <w:r>
-        <w:rPr>
-          <w:rFonts w:asciiTheme="minorHAnsi" w:hAnsiTheme="minorHAnsi" w:cstheme="minorHAnsi"/>
-          <w:sz w:val="20"/>
-        </w:rPr>
-        <w:t>costs;</w:t>
-      </w:r>
-      <w:proofErr w:type="gramEnd"/>
+        <w:t>Salaries and benefits (including headcount and average compensation costs, incentive-based compensation, severance, other), and any capitalization of costs;</w:t>
+      </w:r>
     </w:p>
     <w:p>
       <w:pPr>
@@ -5709,17 +5039,8 @@
           <w:rFonts w:asciiTheme="minorHAnsi" w:hAnsiTheme="minorHAnsi" w:cstheme="minorHAnsi"/>
           <w:sz w:val="20"/>
         </w:rPr>
-        <w:t xml:space="preserve">Occupancy </w:t>
-      </w:r>
-      <w:proofErr w:type="gramStart"/>
-      <w:r>
-        <w:rPr>
-          <w:rFonts w:asciiTheme="minorHAnsi" w:hAnsiTheme="minorHAnsi" w:cstheme="minorHAnsi"/>
-          <w:sz w:val="20"/>
-        </w:rPr>
-        <w:t>costs;</w:t>
-      </w:r>
-      <w:proofErr w:type="gramEnd"/>
+        <w:t>Occupancy costs;</w:t>
+      </w:r>
     </w:p>
     <w:p>
       <w:pPr>
@@ -5741,17 +5062,8 @@
           <w:rFonts w:asciiTheme="minorHAnsi" w:hAnsiTheme="minorHAnsi" w:cstheme="minorHAnsi"/>
           <w:sz w:val="20"/>
         </w:rPr>
-        <w:t xml:space="preserve">Repairs and </w:t>
-      </w:r>
-      <w:proofErr w:type="gramStart"/>
-      <w:r>
-        <w:rPr>
-          <w:rFonts w:asciiTheme="minorHAnsi" w:hAnsiTheme="minorHAnsi" w:cstheme="minorHAnsi"/>
-          <w:sz w:val="20"/>
-        </w:rPr>
-        <w:t>maintenance;</w:t>
-      </w:r>
-      <w:proofErr w:type="gramEnd"/>
+        <w:t>Repairs and maintenance;</w:t>
+      </w:r>
     </w:p>
     <w:p>
       <w:pPr>
@@ -5773,17 +5085,8 @@
           <w:rFonts w:asciiTheme="minorHAnsi" w:hAnsiTheme="minorHAnsi" w:cstheme="minorHAnsi"/>
           <w:sz w:val="20"/>
         </w:rPr>
-        <w:t xml:space="preserve">General and administration </w:t>
-      </w:r>
-      <w:proofErr w:type="gramStart"/>
-      <w:r>
-        <w:rPr>
-          <w:rFonts w:asciiTheme="minorHAnsi" w:hAnsiTheme="minorHAnsi" w:cstheme="minorHAnsi"/>
-          <w:sz w:val="20"/>
-        </w:rPr>
-        <w:t>costs;</w:t>
-      </w:r>
-      <w:proofErr w:type="gramEnd"/>
+        <w:t>General and administration costs;</w:t>
+      </w:r>
     </w:p>
     <w:p>
       <w:pPr>
@@ -5897,17 +5200,8 @@
           <w:rFonts w:asciiTheme="minorHAnsi" w:hAnsiTheme="minorHAnsi" w:cstheme="minorHAnsi"/>
           <w:sz w:val="20"/>
         </w:rPr>
-        <w:t xml:space="preserve">FY22 to </w:t>
-      </w:r>
-      <w:proofErr w:type="gramStart"/>
-      <w:r>
-        <w:rPr>
-          <w:rFonts w:asciiTheme="minorHAnsi" w:hAnsiTheme="minorHAnsi" w:cstheme="minorHAnsi"/>
-          <w:sz w:val="20"/>
-        </w:rPr>
-        <w:t>FY23;</w:t>
-      </w:r>
-      <w:proofErr w:type="gramEnd"/>
+        <w:t>FY22 to FY23;</w:t>
+      </w:r>
     </w:p>
     <w:p>
       <w:pPr>
@@ -6127,17 +5421,8 @@
           <w:rFonts w:asciiTheme="minorHAnsi" w:hAnsiTheme="minorHAnsi" w:cstheme="minorHAnsi"/>
           <w:sz w:val="20"/>
         </w:rPr>
-        <w:t xml:space="preserve">Comment on the historical working capital </w:t>
-      </w:r>
-      <w:proofErr w:type="gramStart"/>
-      <w:r>
-        <w:rPr>
-          <w:rFonts w:asciiTheme="minorHAnsi" w:hAnsiTheme="minorHAnsi" w:cstheme="minorHAnsi"/>
-          <w:sz w:val="20"/>
-        </w:rPr>
-        <w:t>trends;</w:t>
-      </w:r>
-      <w:proofErr w:type="gramEnd"/>
+        <w:t>Comment on the historical working capital trends;</w:t>
+      </w:r>
     </w:p>
     <w:p>
       <w:pPr>
@@ -6159,17 +5444,8 @@
           <w:rFonts w:asciiTheme="minorHAnsi" w:hAnsiTheme="minorHAnsi" w:cstheme="minorHAnsi"/>
           <w:sz w:val="20"/>
         </w:rPr>
-        <w:t>Understand key drivers and trade ratio trends (i.e. seasonality, days sales outstanding, days inventory outstanding, accounts payable days, etc.</w:t>
-      </w:r>
-      <w:proofErr w:type="gramStart"/>
-      <w:r>
-        <w:rPr>
-          <w:rFonts w:asciiTheme="minorHAnsi" w:hAnsiTheme="minorHAnsi" w:cstheme="minorHAnsi"/>
-          <w:sz w:val="20"/>
-        </w:rPr>
-        <w:t>);</w:t>
-      </w:r>
-      <w:proofErr w:type="gramEnd"/>
+        <w:t>Understand key drivers and trade ratio trends (i.e. seasonality, days sales outstanding, days inventory outstanding, accounts payable days, etc.);</w:t>
+      </w:r>
     </w:p>
     <w:p>
       <w:pPr>
@@ -6191,17 +5467,8 @@
           <w:rFonts w:asciiTheme="minorHAnsi" w:hAnsiTheme="minorHAnsi" w:cstheme="minorHAnsi"/>
           <w:sz w:val="20"/>
         </w:rPr>
-        <w:t xml:space="preserve">Accrued liabilities and prepaid </w:t>
-      </w:r>
-      <w:proofErr w:type="gramStart"/>
-      <w:r>
-        <w:rPr>
-          <w:rFonts w:asciiTheme="minorHAnsi" w:hAnsiTheme="minorHAnsi" w:cstheme="minorHAnsi"/>
-          <w:sz w:val="20"/>
-        </w:rPr>
-        <w:t>expenses;</w:t>
-      </w:r>
-      <w:proofErr w:type="gramEnd"/>
+        <w:t>Accrued liabilities and prepaid expenses;</w:t>
+      </w:r>
     </w:p>
     <w:p>
       <w:pPr>
@@ -6223,17 +5490,8 @@
           <w:rFonts w:asciiTheme="minorHAnsi" w:hAnsiTheme="minorHAnsi" w:cstheme="minorHAnsi"/>
           <w:sz w:val="20"/>
         </w:rPr>
-        <w:t xml:space="preserve">Large or unusual non-recurring items that may have impacted normal working capital trends including potential items identified within the quality of earnings analysis noted </w:t>
-      </w:r>
-      <w:proofErr w:type="gramStart"/>
-      <w:r>
-        <w:rPr>
-          <w:rFonts w:asciiTheme="minorHAnsi" w:hAnsiTheme="minorHAnsi" w:cstheme="minorHAnsi"/>
-          <w:sz w:val="20"/>
-        </w:rPr>
-        <w:t>above;</w:t>
-      </w:r>
-      <w:proofErr w:type="gramEnd"/>
+        <w:t>Large or unusual non-recurring items that may have impacted normal working capital trends including potential items identified within the quality of earnings analysis noted above;</w:t>
+      </w:r>
     </w:p>
     <w:p>
       <w:pPr>
@@ -6346,23 +5604,7 @@
           <w:rFonts w:asciiTheme="minorHAnsi" w:hAnsiTheme="minorHAnsi" w:cstheme="minorHAnsi"/>
           <w:sz w:val="20"/>
         </w:rPr>
-        <w:t xml:space="preserve">Trade and non-trade (due from officers, stockholder, employees, affiliates, and other) </w:t>
-      </w:r>
-      <w:proofErr w:type="gramStart"/>
-      <w:r>
-        <w:rPr>
-          <w:rFonts w:asciiTheme="minorHAnsi" w:hAnsiTheme="minorHAnsi" w:cstheme="minorHAnsi"/>
-          <w:sz w:val="20"/>
-        </w:rPr>
-        <w:t>balances;</w:t>
-      </w:r>
-      <w:proofErr w:type="gramEnd"/>
-      <w:r>
-        <w:rPr>
-          <w:rFonts w:asciiTheme="minorHAnsi" w:hAnsiTheme="minorHAnsi" w:cstheme="minorHAnsi"/>
-          <w:sz w:val="20"/>
-        </w:rPr>
-        <w:t xml:space="preserve"> </w:t>
+        <w:t xml:space="preserve">Trade and non-trade (due from officers, stockholder, employees, affiliates, and other) balances; </w:t>
       </w:r>
     </w:p>
     <w:p>
@@ -6385,17 +5627,8 @@
           <w:rFonts w:asciiTheme="minorHAnsi" w:hAnsiTheme="minorHAnsi" w:cstheme="minorHAnsi"/>
           <w:sz w:val="20"/>
         </w:rPr>
-        <w:t xml:space="preserve">Aging analysis by key customer and by customer type and turnover </w:t>
-      </w:r>
-      <w:proofErr w:type="gramStart"/>
-      <w:r>
-        <w:rPr>
-          <w:rFonts w:asciiTheme="minorHAnsi" w:hAnsiTheme="minorHAnsi" w:cstheme="minorHAnsi"/>
-          <w:sz w:val="20"/>
-        </w:rPr>
-        <w:t>analysis;</w:t>
-      </w:r>
-      <w:proofErr w:type="gramEnd"/>
+        <w:t>Aging analysis by key customer and by customer type and turnover analysis;</w:t>
+      </w:r>
     </w:p>
     <w:p>
       <w:pPr>
@@ -6527,17 +5760,8 @@
           <w:rFonts w:asciiTheme="minorHAnsi" w:hAnsiTheme="minorHAnsi" w:cstheme="minorHAnsi"/>
           <w:sz w:val="20"/>
         </w:rPr>
-        <w:t xml:space="preserve">Accounts payable aging and days </w:t>
-      </w:r>
-      <w:proofErr w:type="gramStart"/>
-      <w:r>
-        <w:rPr>
-          <w:rFonts w:asciiTheme="minorHAnsi" w:hAnsiTheme="minorHAnsi" w:cstheme="minorHAnsi"/>
-          <w:sz w:val="20"/>
-        </w:rPr>
-        <w:t>outstanding;</w:t>
-      </w:r>
-      <w:proofErr w:type="gramEnd"/>
+        <w:t>Accounts payable aging and days outstanding;</w:t>
+      </w:r>
     </w:p>
     <w:p>
       <w:pPr>
@@ -6559,17 +5783,8 @@
           <w:rFonts w:asciiTheme="minorHAnsi" w:hAnsiTheme="minorHAnsi" w:cstheme="minorHAnsi"/>
           <w:sz w:val="20"/>
         </w:rPr>
-        <w:t xml:space="preserve">Accrued liabilities including (where possible) a basis for the adequacy of accruals for such items as bonuses, deferred compensation, severance, workers’ compensation, commissions, vacation pay, litigation, customer returns, product liability, sales allowances and credits, and </w:t>
-      </w:r>
-      <w:proofErr w:type="gramStart"/>
-      <w:r>
-        <w:rPr>
-          <w:rFonts w:asciiTheme="minorHAnsi" w:hAnsiTheme="minorHAnsi" w:cstheme="minorHAnsi"/>
-          <w:sz w:val="20"/>
-        </w:rPr>
-        <w:t>other;</w:t>
-      </w:r>
-      <w:proofErr w:type="gramEnd"/>
+        <w:t>Accrued liabilities including (where possible) a basis for the adequacy of accruals for such items as bonuses, deferred compensation, severance, workers’ compensation, commissions, vacation pay, litigation, customer returns, product liability, sales allowances and credits, and other;</w:t>
+      </w:r>
     </w:p>
     <w:p>
       <w:pPr>
@@ -6683,17 +5898,8 @@
           <w:rFonts w:asciiTheme="minorHAnsi" w:hAnsiTheme="minorHAnsi" w:cstheme="minorHAnsi"/>
           <w:sz w:val="20"/>
         </w:rPr>
-        <w:t xml:space="preserve">Inventory costing methodology and its consistent and appropriate application during the historical </w:t>
-      </w:r>
-      <w:proofErr w:type="gramStart"/>
-      <w:r>
-        <w:rPr>
-          <w:rFonts w:asciiTheme="minorHAnsi" w:hAnsiTheme="minorHAnsi" w:cstheme="minorHAnsi"/>
-          <w:sz w:val="20"/>
-        </w:rPr>
-        <w:t>period;</w:t>
-      </w:r>
-      <w:proofErr w:type="gramEnd"/>
+        <w:t>Inventory costing methodology and its consistent and appropriate application during the historical period;</w:t>
+      </w:r>
     </w:p>
     <w:p>
       <w:pPr>
@@ -6715,17 +5921,8 @@
           <w:rFonts w:asciiTheme="minorHAnsi" w:hAnsiTheme="minorHAnsi" w:cstheme="minorHAnsi"/>
           <w:sz w:val="20"/>
         </w:rPr>
-        <w:t xml:space="preserve">Inventory by </w:t>
-      </w:r>
-      <w:proofErr w:type="gramStart"/>
-      <w:r>
-        <w:rPr>
-          <w:rFonts w:asciiTheme="minorHAnsi" w:hAnsiTheme="minorHAnsi" w:cstheme="minorHAnsi"/>
-          <w:sz w:val="20"/>
-        </w:rPr>
-        <w:t>category;</w:t>
-      </w:r>
-      <w:proofErr w:type="gramEnd"/>
+        <w:t>Inventory by category;</w:t>
+      </w:r>
     </w:p>
     <w:p>
       <w:pPr>
@@ -6747,17 +5944,8 @@
           <w:rFonts w:asciiTheme="minorHAnsi" w:hAnsiTheme="minorHAnsi" w:cstheme="minorHAnsi"/>
           <w:sz w:val="20"/>
         </w:rPr>
-        <w:t xml:space="preserve">Inventory aging profile at each period-end date and historical </w:t>
-      </w:r>
-      <w:proofErr w:type="gramStart"/>
-      <w:r>
-        <w:rPr>
-          <w:rFonts w:asciiTheme="minorHAnsi" w:hAnsiTheme="minorHAnsi" w:cstheme="minorHAnsi"/>
-          <w:sz w:val="20"/>
-        </w:rPr>
-        <w:t>write-offs;</w:t>
-      </w:r>
-      <w:proofErr w:type="gramEnd"/>
+        <w:t>Inventory aging profile at each period-end date and historical write-offs;</w:t>
+      </w:r>
     </w:p>
     <w:p>
       <w:pPr>
@@ -6853,23 +6041,7 @@
           <w:sz w:val="20"/>
         </w:rPr>
         <w:lastRenderedPageBreak/>
-        <w:t xml:space="preserve">Fixed asset continuity schedule showing additions and </w:t>
-      </w:r>
-      <w:proofErr w:type="gramStart"/>
-      <w:r>
-        <w:rPr>
-          <w:rFonts w:asciiTheme="minorHAnsi" w:hAnsiTheme="minorHAnsi" w:cstheme="minorHAnsi"/>
-          <w:sz w:val="20"/>
-        </w:rPr>
-        <w:t>depreciation;</w:t>
-      </w:r>
-      <w:proofErr w:type="gramEnd"/>
-      <w:r>
-        <w:rPr>
-          <w:rFonts w:asciiTheme="minorHAnsi" w:hAnsiTheme="minorHAnsi" w:cstheme="minorHAnsi"/>
-          <w:sz w:val="20"/>
-        </w:rPr>
-        <w:t xml:space="preserve"> </w:t>
+        <w:t xml:space="preserve">Fixed asset continuity schedule showing additions and depreciation; </w:t>
       </w:r>
     </w:p>
     <w:p>
@@ -7056,17 +6228,8 @@
           <w:rFonts w:asciiTheme="minorHAnsi" w:hAnsiTheme="minorHAnsi" w:cstheme="minorHAnsi"/>
           <w:sz w:val="20"/>
         </w:rPr>
-        <w:t xml:space="preserve">Significant purchase commitments and product financing arrangements with customers and/or </w:t>
-      </w:r>
-      <w:proofErr w:type="gramStart"/>
-      <w:r>
-        <w:rPr>
-          <w:rFonts w:asciiTheme="minorHAnsi" w:hAnsiTheme="minorHAnsi" w:cstheme="minorHAnsi"/>
-          <w:sz w:val="20"/>
-        </w:rPr>
-        <w:t>suppliers;</w:t>
-      </w:r>
-      <w:proofErr w:type="gramEnd"/>
+        <w:t>Significant purchase commitments and product financing arrangements with customers and/or suppliers;</w:t>
+      </w:r>
     </w:p>
     <w:p>
       <w:pPr>
@@ -7095,17 +6258,8 @@
           <w:rFonts w:asciiTheme="minorHAnsi" w:hAnsiTheme="minorHAnsi" w:cstheme="minorHAnsi"/>
           <w:sz w:val="20"/>
         </w:rPr>
-        <w:t xml:space="preserve"> </w:t>
-      </w:r>
-      <w:proofErr w:type="gramStart"/>
-      <w:r>
-        <w:rPr>
-          <w:rFonts w:asciiTheme="minorHAnsi" w:hAnsiTheme="minorHAnsi" w:cstheme="minorHAnsi"/>
-          <w:sz w:val="20"/>
-        </w:rPr>
-        <w:t>commitments;</w:t>
-      </w:r>
-      <w:proofErr w:type="gramEnd"/>
+        <w:t xml:space="preserve"> commitments;</w:t>
+      </w:r>
     </w:p>
     <w:p>
       <w:pPr>
@@ -7127,23 +6281,7 @@
           <w:rFonts w:asciiTheme="minorHAnsi" w:hAnsiTheme="minorHAnsi" w:cstheme="minorHAnsi"/>
           <w:sz w:val="20"/>
         </w:rPr>
-        <w:t xml:space="preserve">Earn-out arrangements and commitments relating to previous </w:t>
-      </w:r>
-      <w:proofErr w:type="gramStart"/>
-      <w:r>
-        <w:rPr>
-          <w:rFonts w:asciiTheme="minorHAnsi" w:hAnsiTheme="minorHAnsi" w:cstheme="minorHAnsi"/>
-          <w:sz w:val="20"/>
-        </w:rPr>
-        <w:t>acquisitions;</w:t>
-      </w:r>
-      <w:proofErr w:type="gramEnd"/>
-      <w:r>
-        <w:rPr>
-          <w:rFonts w:asciiTheme="minorHAnsi" w:hAnsiTheme="minorHAnsi" w:cstheme="minorHAnsi"/>
-          <w:sz w:val="20"/>
-        </w:rPr>
-        <w:t xml:space="preserve"> </w:t>
+        <w:t xml:space="preserve">Earn-out arrangements and commitments relating to previous acquisitions; </w:t>
       </w:r>
     </w:p>
     <w:p>
@@ -7166,23 +6304,7 @@
           <w:rFonts w:asciiTheme="minorHAnsi" w:hAnsiTheme="minorHAnsi" w:cstheme="minorHAnsi"/>
           <w:sz w:val="20"/>
         </w:rPr>
-        <w:t xml:space="preserve">Incentive compensation and employee benefit </w:t>
-      </w:r>
-      <w:proofErr w:type="gramStart"/>
-      <w:r>
-        <w:rPr>
-          <w:rFonts w:asciiTheme="minorHAnsi" w:hAnsiTheme="minorHAnsi" w:cstheme="minorHAnsi"/>
-          <w:sz w:val="20"/>
-        </w:rPr>
-        <w:t>obligations;</w:t>
-      </w:r>
-      <w:proofErr w:type="gramEnd"/>
-      <w:r>
-        <w:rPr>
-          <w:rFonts w:asciiTheme="minorHAnsi" w:hAnsiTheme="minorHAnsi" w:cstheme="minorHAnsi"/>
-          <w:sz w:val="20"/>
-        </w:rPr>
-        <w:t xml:space="preserve"> </w:t>
+        <w:t xml:space="preserve">Incentive compensation and employee benefit obligations; </w:t>
       </w:r>
     </w:p>
     <w:p>
@@ -7321,7 +6443,7 @@
           <w:smallCaps w:val="0"/>
         </w:rPr>
       </w:pPr>
-      <w:bookmarkStart w:id="6" w:name="_Ref159424122"/>
+      <w:bookmarkStart w:id="7" w:name="_Ref159424122"/>
       <w:r>
         <w:rPr>
           <w:rFonts w:ascii="Arial Bold" w:hAnsi="Arial Bold"/>
@@ -7346,7 +6468,7 @@
         </w:rPr>
         <w:t>.</w:t>
       </w:r>
-      <w:bookmarkEnd w:id="6"/>
+      <w:bookmarkEnd w:id="7"/>
     </w:p>
     <w:p>
       <w:pPr>
@@ -7458,7 +6580,7 @@
           <w:bCs/>
         </w:rPr>
       </w:pPr>
-      <w:bookmarkStart w:id="7" w:name="_Hlk173423862"/>
+      <w:bookmarkStart w:id="8" w:name="_Hlk173423862"/>
       <w:r>
         <w:t>“</w:t>
       </w:r>
@@ -7473,7 +6595,7 @@
         <w:t>” means the client(s) under the Engagement Letter.</w:t>
       </w:r>
     </w:p>
-    <w:bookmarkEnd w:id="7"/>
+    <w:bookmarkEnd w:id="8"/>
     <w:p>
       <w:pPr>
         <w:pStyle w:val="TnC0"/>
@@ -7492,11 +6614,11 @@
       <w:r>
         <w:t xml:space="preserve">” means any materials, equipment, systems, software/software as a service, </w:t>
       </w:r>
-      <w:bookmarkStart w:id="8" w:name="_Hlk148702097"/>
+      <w:bookmarkStart w:id="9" w:name="_Hlk148702097"/>
       <w:r>
         <w:t>data and information supplied or made available by or on behalf of Client to KPMG in connection with the Services</w:t>
       </w:r>
-      <w:bookmarkEnd w:id="8"/>
+      <w:bookmarkEnd w:id="9"/>
       <w:r>
         <w:t>.</w:t>
       </w:r>
@@ -7517,15 +6639,7 @@
         <w:t>Confidential Information</w:t>
       </w:r>
       <w:r>
-        <w:t>” means any information made available, directly or indirectly, by one party to the other in connection with the Services or otherwise pursuant to this Agreement that is marked or communicated as confidential or that due to its nature a reasonable person under like circumstances would consider it confidential. Confidential Information includes, without limitation, Personal Information, business plans, proprietary software code and specifications, information about a party’s  products, processes, services, finances and customers, and the terms of this Agreement, except (but not as regards Personal Information) to the extent such information: (</w:t>
-      </w:r>
-      <w:proofErr w:type="spellStart"/>
-      <w:r>
-        <w:t>i</w:t>
-      </w:r>
-      <w:proofErr w:type="spellEnd"/>
-      <w:r>
-        <w:t>) is or hereafter enters the public domain through no fault of the receiving party; (ii) is already or hereafter becomes known to the receiving party free of any obligation of confidence; or (iii) is developed by the receiving party independently of the disclosing party’s Confidential Information.</w:t>
+        <w:t>” means any information made available, directly or indirectly, by one party to the other in connection with the Services or otherwise pursuant to this Agreement that is marked or communicated as confidential or that due to its nature a reasonable person under like circumstances would consider it confidential. Confidential Information includes, without limitation, Personal Information, business plans, proprietary software code and specifications, information about a party’s  products, processes, services, finances and customers, and the terms of this Agreement, except (but not as regards Personal Information) to the extent such information: (i) is or hereafter enters the public domain through no fault of the receiving party; (ii) is already or hereafter becomes known to the receiving party free of any obligation of confidence; or (iii) is developed by the receiving party independently of the disclosing party’s Confidential Information.</w:t>
       </w:r>
     </w:p>
     <w:p>
@@ -7792,15 +6906,7 @@
         <w:t>KPMG Property</w:t>
       </w:r>
       <w:r>
-        <w:t>” means all rights and interest (including all intellectual property rights) in and to: (</w:t>
-      </w:r>
-      <w:proofErr w:type="spellStart"/>
-      <w:r>
-        <w:t>i</w:t>
-      </w:r>
-      <w:proofErr w:type="spellEnd"/>
-      <w:r>
-        <w:t>) all inventions, trade-secrets, methodologies, know-how, concepts, ideas, techniques, works of authorship (including templates, art work and graphics), technology (including software applications, code, scripts, connectors and tools) and other proprietary materials and information that is licensed, owned or developed by KPMG prior to, independently of, or in the course of providing the Services, and any enhancements, improvements and modifications made to, or derivative works of, any of the foregoing; and (ii) KPMG’s working papers, working drafts and internal correspondence.  For certainty, KPMG Property does not include Client Confidential Information</w:t>
+        <w:t>” means all rights and interest (including all intellectual property rights) in and to: (i) all inventions, trade-secrets, methodologies, know-how, concepts, ideas, techniques, works of authorship (including templates, art work and graphics), technology (including software applications, code, scripts, connectors and tools) and other proprietary materials and information that is licensed, owned or developed by KPMG prior to, independently of, or in the course of providing the Services, and any enhancements, improvements and modifications made to, or derivative works of, any of the foregoing; and (ii) KPMG’s working papers, working drafts and internal correspondence.  For certainty, KPMG Property does not include Client Confidential Information</w:t>
       </w:r>
       <w:r>
         <w:t xml:space="preserve"> or Client Materials</w:t>
@@ -7993,7 +7099,7 @@
           <w:smallCaps w:val="0"/>
         </w:rPr>
       </w:pPr>
-      <w:bookmarkStart w:id="9" w:name="_Ref157761883"/>
+      <w:bookmarkStart w:id="10" w:name="_Ref157761883"/>
       <w:r>
         <w:rPr>
           <w:rFonts w:ascii="Arial Bold" w:hAnsi="Arial Bold"/>
@@ -8002,7 +7108,7 @@
         </w:rPr>
         <w:t>Services.</w:t>
       </w:r>
-      <w:bookmarkEnd w:id="9"/>
+      <w:bookmarkEnd w:id="10"/>
     </w:p>
     <w:p>
       <w:pPr>
@@ -8055,15 +7161,7 @@
         <w:t>KPMG Resources to assist KPMG in the performance of the Services</w:t>
       </w:r>
       <w:r>
-        <w:t xml:space="preserve">, </w:t>
-      </w:r>
-      <w:proofErr w:type="gramStart"/>
-      <w:r>
-        <w:t>provided that</w:t>
-      </w:r>
-      <w:proofErr w:type="gramEnd"/>
-      <w:r>
-        <w:t xml:space="preserve"> </w:t>
+        <w:t xml:space="preserve">, provided that </w:t>
       </w:r>
       <w:r>
         <w:t xml:space="preserve">KPMG remains responsible to Client for the performance of any Services by KPMG Resources. Client agrees that any </w:t>
@@ -8098,11 +7196,11 @@
           <w:b/>
         </w:rPr>
       </w:pPr>
-      <w:bookmarkStart w:id="10" w:name="_Ref159426423"/>
+      <w:bookmarkStart w:id="11" w:name="_Ref159426423"/>
       <w:r>
         <w:t>KPMG will, in performing the Services, rely on the facts, assumptions, data, material and other information furnished by or on behalf of Client without any independent investigation or verification. Inaccuracy or incompleteness of such facts, assumptions, data, material and other information could have a material effect on KPMG’s conclusions or the results or performance of the Services or Deliverables.</w:t>
       </w:r>
-      <w:bookmarkEnd w:id="10"/>
+      <w:bookmarkEnd w:id="11"/>
     </w:p>
     <w:p>
       <w:pPr>
@@ -8119,7 +7217,7 @@
         <w:spacing w:before="120"/>
         <w:ind w:left="270" w:hanging="270"/>
       </w:pPr>
-      <w:bookmarkStart w:id="11" w:name="_Ref159424304"/>
+      <w:bookmarkStart w:id="12" w:name="_Ref159424304"/>
       <w:r>
         <w:rPr>
           <w:bCs/>
@@ -8139,7 +7237,7 @@
       <w:r>
         <w:t>KPMG will not update the Services or Deliverables for changes in law or regulations, or to the judicial and administrative interpretations thereof, or for subsequent events or transactions.</w:t>
       </w:r>
-      <w:bookmarkEnd w:id="11"/>
+      <w:bookmarkEnd w:id="12"/>
     </w:p>
     <w:p>
       <w:pPr>
@@ -8164,7 +7262,7 @@
           <w:szCs w:val="16"/>
         </w:rPr>
       </w:pPr>
-      <w:bookmarkStart w:id="12" w:name="_Ref159426440"/>
+      <w:bookmarkStart w:id="13" w:name="_Ref159426440"/>
       <w:r>
         <w:rPr>
           <w:rFonts w:cs="Arial"/>
@@ -8173,7 +7271,7 @@
         </w:rPr>
         <w:t>Unless expressly stated in the Engagement Letter, the Services do not include: (a) any lobbying activity, as defined in all applicable federal, provincial and municipal lobbyist registration statutes and regulations; or (b) the provision of legal advice.</w:t>
       </w:r>
-      <w:bookmarkEnd w:id="12"/>
+      <w:bookmarkEnd w:id="13"/>
     </w:p>
     <w:p>
       <w:pPr>
@@ -8198,7 +7296,7 @@
           <w:szCs w:val="16"/>
         </w:rPr>
       </w:pPr>
-      <w:bookmarkStart w:id="13" w:name="_Ref159424313"/>
+      <w:bookmarkStart w:id="14" w:name="_Ref159424313"/>
       <w:r>
         <w:rPr>
           <w:rFonts w:cs="Arial"/>
@@ -8223,7 +7321,7 @@
         </w:rPr>
         <w:t>for Client’s assessment or evaluation of internal control over financial reporting, disclosure controls and procedures, officer certification requirements, or Client’s compliance with any requirements for an internal control report from management.</w:t>
       </w:r>
-      <w:bookmarkEnd w:id="13"/>
+      <w:bookmarkEnd w:id="14"/>
     </w:p>
     <w:p>
       <w:pPr>
@@ -8244,7 +7342,7 @@
           <w:smallCaps w:val="0"/>
         </w:rPr>
       </w:pPr>
-      <w:bookmarkStart w:id="14" w:name="_Ref157761908"/>
+      <w:bookmarkStart w:id="15" w:name="_Ref157761908"/>
       <w:r>
         <w:rPr>
           <w:rFonts w:ascii="Arial Bold" w:hAnsi="Arial Bold"/>
@@ -8253,7 +7351,7 @@
         </w:rPr>
         <w:t>Client Responsibilities.</w:t>
       </w:r>
-      <w:bookmarkEnd w:id="14"/>
+      <w:bookmarkEnd w:id="15"/>
     </w:p>
     <w:p>
       <w:pPr>
@@ -8269,16 +7367,16 @@
         <w:spacing w:before="120"/>
         <w:ind w:left="270" w:hanging="270"/>
       </w:pPr>
-      <w:bookmarkStart w:id="15" w:name="_Hlk148702039"/>
-      <w:bookmarkStart w:id="16" w:name="_Ref159424322"/>
+      <w:bookmarkStart w:id="16" w:name="_Hlk148702039"/>
+      <w:bookmarkStart w:id="17" w:name="_Ref159424322"/>
       <w:r>
         <w:t>Client agrees to cooperate with KPMG in the performance of the Services and shall provide KPMG with timely access to and use of the Client Materials, personnel and facilities necessary for KPMG to perform the Services.</w:t>
       </w:r>
-      <w:bookmarkEnd w:id="15"/>
+      <w:bookmarkEnd w:id="16"/>
       <w:r>
         <w:t xml:space="preserve"> Client shall promptly respond to KPMG inquiries, review reports and advise KPMG of any additional work Client would like KPMG to perform. The Engagement Letter may set forth additional responsibilities of Client in connection with the engagement. Client acknowledges that Client’s failure to perform its obligations under this Agreement could adversely impact KPMG’s ability to perform the Services, and/or to perform them in accordance with the fees and timelines set out in the Engagement Letter.</w:t>
       </w:r>
-      <w:bookmarkEnd w:id="16"/>
+      <w:bookmarkEnd w:id="17"/>
     </w:p>
     <w:p>
       <w:pPr>
@@ -8312,22 +7410,14 @@
         <w:spacing w:before="120"/>
         <w:ind w:left="270" w:hanging="270"/>
       </w:pPr>
-      <w:bookmarkStart w:id="17" w:name="_Ref159424334"/>
-      <w:r>
-        <w:t>Client agrees that, while the Services may include advice and recommendations, all decisions in connection with the implementation of such advice and recommendations shall be the responsibility of, and made by, Client.  Client, and not KPMG, shall perform the following functions: (</w:t>
-      </w:r>
-      <w:proofErr w:type="spellStart"/>
-      <w:r>
-        <w:t>i</w:t>
-      </w:r>
-      <w:proofErr w:type="spellEnd"/>
-      <w:r>
-        <w:t>) make all management decisions and perform all management functions; (ii) designate an individual who possesses suitable skill, knowledge and experience, preferably within senior management, to oversee the performance of the Services, and to evaluate the adequacy and results of such Services; (iii) accept responsibility for the results of such Services; and (iv) establis</w:t>
+      <w:bookmarkStart w:id="18" w:name="_Ref159424334"/>
+      <w:r>
+        <w:t>Client agrees that, while the Services may include advice and recommendations, all decisions in connection with the implementation of such advice and recommendations shall be the responsibility of, and made by, Client.  Client, and not KPMG, shall perform the following functions: (i) make all management decisions and perform all management functions; (ii) designate an individual who possesses suitable skill, knowledge and experience, preferably within senior management, to oversee the performance of the Services, and to evaluate the adequacy and results of such Services; (iii) accept responsibility for the results of such Services; and (iv) establis</w:t>
       </w:r>
       <w:r>
         <w:t>h and maintain internal controls over the processes with which such Services are concerned, including, without limitation, monitoring ongoing activities.</w:t>
       </w:r>
-      <w:bookmarkEnd w:id="17"/>
+      <w:bookmarkEnd w:id="18"/>
     </w:p>
     <w:p>
       <w:pPr>
@@ -8348,7 +7438,7 @@
           <w:smallCaps w:val="0"/>
         </w:rPr>
       </w:pPr>
-      <w:bookmarkStart w:id="18" w:name="_Ref153284251"/>
+      <w:bookmarkStart w:id="19" w:name="_Ref153284251"/>
       <w:r>
         <w:rPr>
           <w:rFonts w:ascii="Arial Bold" w:hAnsi="Arial Bold"/>
@@ -8357,7 +7447,7 @@
         </w:rPr>
         <w:t>Ownership, Use and Disclosure of our Advice.</w:t>
       </w:r>
-      <w:bookmarkEnd w:id="18"/>
+      <w:bookmarkEnd w:id="19"/>
     </w:p>
     <w:p>
       <w:pPr>
@@ -8373,17 +7463,9 @@
         <w:spacing w:before="120"/>
         <w:ind w:left="270" w:hanging="270"/>
       </w:pPr>
-      <w:bookmarkStart w:id="19" w:name="_Hlk148701458"/>
-      <w:r>
-        <w:t>Subject to Client’s payment in full of all fees owing under the Engagement Letter: (</w:t>
-      </w:r>
-      <w:proofErr w:type="spellStart"/>
-      <w:r>
-        <w:t>i</w:t>
-      </w:r>
-      <w:proofErr w:type="spellEnd"/>
-      <w:r>
-        <w:t>) Client shall be the owner of any final Deliverable</w:t>
+      <w:bookmarkStart w:id="20" w:name="_Hlk148701458"/>
+      <w:r>
+        <w:t>Subject to Client’s payment in full of all fees owing under the Engagement Letter: (i) Client shall be the owner of any final Deliverable</w:t>
       </w:r>
       <w:r>
         <w:t>s</w:t>
@@ -8418,7 +7500,7 @@
         <w:spacing w:before="120"/>
         <w:ind w:left="270" w:hanging="270"/>
       </w:pPr>
-      <w:bookmarkStart w:id="20" w:name="_Ref159424092"/>
+      <w:bookmarkStart w:id="21" w:name="_Ref159424092"/>
       <w:r>
         <w:t xml:space="preserve">The Services and Deliverables are provided for Client’s sole benefit and internal use </w:t>
       </w:r>
@@ -8446,7 +7528,7 @@
       <w:r>
         <w:t xml:space="preserve">to any party other than Client in respect of the Services or Deliverables. </w:t>
       </w:r>
-      <w:bookmarkEnd w:id="19"/>
+      <w:bookmarkEnd w:id="20"/>
       <w:r>
         <w:t xml:space="preserve"> Accordingly, in the event of a Claim by any </w:t>
       </w:r>
@@ -8498,7 +7580,7 @@
       <w:r>
         <w:t>, the term KPMG shall include KPMG Parties.</w:t>
       </w:r>
-      <w:bookmarkEnd w:id="20"/>
+      <w:bookmarkEnd w:id="21"/>
     </w:p>
     <w:p>
       <w:pPr>
@@ -8550,17 +7632,9 @@
         <w:spacing w:before="120"/>
         <w:ind w:left="270" w:hanging="270"/>
       </w:pPr>
-      <w:bookmarkStart w:id="21" w:name="_Ref159424163"/>
-      <w:r>
-        <w:t>Client may disclose a copy of any final Deliverable: (</w:t>
-      </w:r>
-      <w:proofErr w:type="spellStart"/>
-      <w:r>
-        <w:t>i</w:t>
-      </w:r>
-      <w:proofErr w:type="spellEnd"/>
-      <w:r>
-        <w:t>) in response to a Legal Demand or otherwise to the extent required by law; (ii) on a non-</w:t>
+      <w:bookmarkStart w:id="22" w:name="_Ref159424163"/>
+      <w:r>
+        <w:t>Client may disclose a copy of any final Deliverable: (i) in response to a Legal Demand or otherwise to the extent required by law; (ii) on a non-</w:t>
       </w:r>
       <w:r>
         <w:t>reliance basis to Client’s legal and other professional advis</w:t>
@@ -8703,7 +7777,7 @@
       <w:r>
         <w:t>) (Additional Terms for Tax Services).</w:t>
       </w:r>
-      <w:bookmarkEnd w:id="21"/>
+      <w:bookmarkEnd w:id="22"/>
     </w:p>
     <w:p>
       <w:pPr>
@@ -8760,7 +7834,7 @@
           <w:smallCaps w:val="0"/>
         </w:rPr>
       </w:pPr>
-      <w:bookmarkStart w:id="22" w:name="_Ref153284253"/>
+      <w:bookmarkStart w:id="23" w:name="_Ref153284253"/>
       <w:r>
         <w:rPr>
           <w:rFonts w:ascii="Arial Bold" w:hAnsi="Arial Bold"/>
@@ -8769,7 +7843,7 @@
         </w:rPr>
         <w:t>Confidentiality.</w:t>
       </w:r>
-      <w:bookmarkEnd w:id="22"/>
+      <w:bookmarkEnd w:id="23"/>
     </w:p>
     <w:p>
       <w:pPr>
@@ -8806,12 +7880,12 @@
         <w:spacing w:before="120"/>
         <w:ind w:left="270" w:hanging="270"/>
       </w:pPr>
-      <w:bookmarkStart w:id="23" w:name="_Hlk173423904"/>
+      <w:bookmarkStart w:id="24" w:name="_Hlk173423904"/>
       <w:r>
         <w:t>KPMG may share Confidential Information of Client with other KPMG Resources who are assisting KPMG in the performance of the Services.</w:t>
       </w:r>
     </w:p>
-    <w:bookmarkEnd w:id="23"/>
+    <w:bookmarkEnd w:id="24"/>
     <w:p>
       <w:pPr>
         <w:pStyle w:val="TnC0"/>
@@ -8828,15 +7902,7 @@
       </w:pPr>
       <w:r>
         <w:lastRenderedPageBreak/>
-        <w:t>The receiving party may disclose Confidential Information of the disclosing party: (</w:t>
-      </w:r>
-      <w:proofErr w:type="spellStart"/>
-      <w:r>
-        <w:t>i</w:t>
-      </w:r>
-      <w:proofErr w:type="spellEnd"/>
-      <w:r>
-        <w:t>) to the extent required by law or professional standards; (ii) to its professional advisors and insurers in relation to any dispute concerning this Agreement; and (iii) in the case of a Legal Demand, provided that the receiving party will exercise commercially reasonable efforts to afford the Confidential Information all available confidentiality protections.</w:t>
+        <w:t>The receiving party may disclose Confidential Information of the disclosing party: (i) to the extent required by law or professional standards; (ii) to its professional advisors and insurers in relation to any dispute concerning this Agreement; and (iii) in the case of a Legal Demand, provided that the receiving party will exercise commercially reasonable efforts to afford the Confidential Information all available confidentiality protections.</w:t>
       </w:r>
     </w:p>
     <w:p>
@@ -8853,7 +7919,7 @@
         <w:spacing w:before="120"/>
         <w:ind w:left="270" w:hanging="270"/>
       </w:pPr>
-      <w:bookmarkStart w:id="24" w:name="_Hlk173424226"/>
+      <w:bookmarkStart w:id="25" w:name="_Hlk173424226"/>
       <w:r>
         <w:t>Each party may share Confidential Information of the other party (in the case of KPMG, with other KPMG Resources and KPMG Parties, and in the case of Client, with third parties engaged by Client), as reasonably required to facilitate the operation of its business or support its infrastructure, including for the performance of administrative, clerical and technological operations and functions, to manage its relationship with the other party and, in the case of KPMG, to comply with its professional obligations and standards (including for quality assurance and risk management purposes). Any such disclosure shall be under obligations of confidentiality to the same or similar extent as the parties have agreed to hereunder, and each party shall be responsible to the other for any failure to comply with such conditions of confidentiality.</w:t>
       </w:r>
@@ -8872,8 +7938,8 @@
         <w:spacing w:before="120"/>
         <w:ind w:left="270" w:hanging="270"/>
       </w:pPr>
-      <w:bookmarkStart w:id="25" w:name="_Hlk173424251"/>
-      <w:bookmarkEnd w:id="24"/>
+      <w:bookmarkStart w:id="26" w:name="_Hlk173424251"/>
+      <w:bookmarkEnd w:id="25"/>
       <w:r>
         <w:t>KPMG Parties and KPMG Resources may use information obtained while performing engagements for business-related purposes including developing new or improving existing services, technologies, data sets and benchmarks</w:t>
       </w:r>
@@ -8887,7 +7953,7 @@
         <w:t xml:space="preserve"> and training cognitive systems.  Where this involves Confidential Information of Client, it will not be disclosed to other third parties unless de-identified, anonymized and/or aggregated so as not to be attributable to Client.</w:t>
       </w:r>
     </w:p>
-    <w:bookmarkEnd w:id="25"/>
+    <w:bookmarkEnd w:id="26"/>
     <w:p>
       <w:pPr>
         <w:pStyle w:val="TnC0"/>
@@ -8903,15 +7969,7 @@
         <w:ind w:left="270" w:hanging="270"/>
       </w:pPr>
       <w:r>
-        <w:t xml:space="preserve">KPMG may disclose the general nature of its engagement for Client as reasonably required </w:t>
-      </w:r>
-      <w:proofErr w:type="gramStart"/>
-      <w:r>
-        <w:t>in order to</w:t>
-      </w:r>
-      <w:proofErr w:type="gramEnd"/>
-      <w:r>
-        <w:t xml:space="preserve"> assess and address conflicts of interest.</w:t>
+        <w:t>KPMG may disclose the general nature of its engagement for Client as reasonably required in order to assess and address conflicts of interest.</w:t>
       </w:r>
     </w:p>
     <w:p>
@@ -8951,7 +8009,7 @@
           <w:smallCaps w:val="0"/>
         </w:rPr>
       </w:pPr>
-      <w:bookmarkStart w:id="26" w:name="_Ref216604502"/>
+      <w:bookmarkStart w:id="27" w:name="_Ref216604502"/>
       <w:r>
         <w:rPr>
           <w:rFonts w:ascii="Arial Bold" w:hAnsi="Arial Bold"/>
@@ -8999,15 +8057,7 @@
         <w:t>party</w:t>
       </w:r>
       <w:r>
-        <w:t xml:space="preserve"> shall provide the other with information and co-operation relating to its processing of Personal Information as reasonably required </w:t>
-      </w:r>
-      <w:proofErr w:type="gramStart"/>
-      <w:r>
-        <w:t>in order for</w:t>
-      </w:r>
-      <w:proofErr w:type="gramEnd"/>
-      <w:r>
-        <w:t xml:space="preserve"> the other to satisfy its obligations under Privacy Laws.</w:t>
+        <w:t xml:space="preserve"> shall provide the other with information and co-operation relating to its processing of Personal Information as reasonably required in order for the other to satisfy its obligations under Privacy Laws.</w:t>
       </w:r>
     </w:p>
     <w:p>
@@ -9046,7 +8096,7 @@
         <w:t xml:space="preserve">.   </w:t>
       </w:r>
     </w:p>
-    <w:bookmarkEnd w:id="26"/>
+    <w:bookmarkEnd w:id="27"/>
     <w:p>
       <w:pPr>
         <w:pStyle w:val="TnCHeading"/>
@@ -9238,7 +8288,7 @@
           <w:smallCaps w:val="0"/>
         </w:rPr>
       </w:pPr>
-      <w:bookmarkStart w:id="27" w:name="_Ref153285817"/>
+      <w:bookmarkStart w:id="28" w:name="_Ref153285817"/>
       <w:r>
         <w:rPr>
           <w:rFonts w:ascii="Arial Bold" w:hAnsi="Arial Bold"/>
@@ -9247,7 +8297,7 @@
         </w:rPr>
         <w:t>Limitation on Liability.</w:t>
       </w:r>
-      <w:bookmarkEnd w:id="27"/>
+      <w:bookmarkEnd w:id="28"/>
     </w:p>
     <w:p>
       <w:pPr>
@@ -9266,9 +8316,9 @@
           <w:bCs/>
         </w:rPr>
       </w:pPr>
-      <w:bookmarkStart w:id="28" w:name="_Hlk158649822"/>
-      <w:bookmarkStart w:id="29" w:name="_Ref159424253"/>
-      <w:bookmarkStart w:id="30" w:name="_Hlk136869984"/>
+      <w:bookmarkStart w:id="29" w:name="_Hlk158649822"/>
+      <w:bookmarkStart w:id="30" w:name="_Ref159424253"/>
+      <w:bookmarkStart w:id="31" w:name="_Hlk136869984"/>
       <w:r>
         <w:rPr>
           <w:bCs/>
@@ -9335,7 +8385,7 @@
         </w:rPr>
         <w:t>the termination thereof, for an aggregate amount that is more than the fees paid to KPMG under this Agreement</w:t>
       </w:r>
-      <w:bookmarkEnd w:id="28"/>
+      <w:bookmarkEnd w:id="29"/>
       <w:r>
         <w:rPr>
           <w:bCs/>
@@ -9346,29 +8396,15 @@
         <w:rPr>
           <w:bCs/>
         </w:rPr>
-        <w:t xml:space="preserve"> except to the extent finally determined to have resulted from KPMG’s fraud or </w:t>
-      </w:r>
-      <w:proofErr w:type="spellStart"/>
+        <w:t xml:space="preserve"> except to the extent finally determined to have resulted from KPMG’s fraud or wilful misconduct</w:t>
+      </w:r>
       <w:r>
         <w:rPr>
           <w:bCs/>
         </w:rPr>
-        <w:t>wilful</w:t>
-      </w:r>
-      <w:proofErr w:type="spellEnd"/>
-      <w:r>
-        <w:rPr>
-          <w:bCs/>
-        </w:rPr>
-        <w:t xml:space="preserve"> misconduct</w:t>
-      </w:r>
-      <w:r>
-        <w:rPr>
-          <w:bCs/>
-        </w:rPr>
         <w:t>.</w:t>
       </w:r>
-      <w:bookmarkEnd w:id="29"/>
+      <w:bookmarkEnd w:id="30"/>
       <w:r>
         <w:rPr>
           <w:bCs/>
@@ -9393,14 +8429,14 @@
           <w:bCs/>
         </w:rPr>
       </w:pPr>
-      <w:bookmarkStart w:id="31" w:name="_Ref159424269"/>
+      <w:bookmarkStart w:id="32" w:name="_Ref159424269"/>
       <w:r>
         <w:rPr>
           <w:bCs/>
         </w:rPr>
         <w:t>KPMG shall not be liable to Client for consequential, special, indirect, incidental, punitive or exemplary damages, or any loss of revenue or profit or other commercial or economic loss, even if advised of the possibility thereof.</w:t>
       </w:r>
-      <w:bookmarkEnd w:id="31"/>
+      <w:bookmarkEnd w:id="32"/>
     </w:p>
     <w:p>
       <w:pPr>
@@ -9691,7 +8727,7 @@
         <w:t xml:space="preserve"> shall apply regardless of the form of claim, whether in contract, statute, tort (including, without limitation, negligence) or otherwise.</w:t>
       </w:r>
     </w:p>
-    <w:bookmarkEnd w:id="30"/>
+    <w:bookmarkEnd w:id="31"/>
     <w:p>
       <w:pPr>
         <w:pStyle w:val="TnCHeading"/>
@@ -9757,15 +8793,7 @@
         <w:t>This Agreement may be terminated by either party</w:t>
       </w:r>
       <w:r>
-        <w:t>: (</w:t>
-      </w:r>
-      <w:proofErr w:type="spellStart"/>
-      <w:r>
-        <w:t>i</w:t>
-      </w:r>
-      <w:proofErr w:type="spellEnd"/>
-      <w:r>
-        <w:t>)</w:t>
+        <w:t>: (i)</w:t>
       </w:r>
       <w:r>
         <w:t xml:space="preserve"> at any time by giving written notice to the other party not less than 30 days before the effective date of termination</w:t>
@@ -10033,7 +9061,7 @@
           <w:smallCaps w:val="0"/>
         </w:rPr>
       </w:pPr>
-      <w:bookmarkStart w:id="32" w:name="_Ref157761928"/>
+      <w:bookmarkStart w:id="33" w:name="_Ref157761928"/>
       <w:r>
         <w:rPr>
           <w:rFonts w:ascii="Arial Bold" w:hAnsi="Arial Bold"/>
@@ -10042,7 +9070,7 @@
         </w:rPr>
         <w:t>Force Majeure.</w:t>
       </w:r>
-      <w:bookmarkEnd w:id="32"/>
+      <w:bookmarkEnd w:id="33"/>
     </w:p>
     <w:p>
       <w:pPr>
@@ -10055,15 +9083,7 @@
         <w:ind w:left="270"/>
       </w:pPr>
       <w:r>
-        <w:t xml:space="preserve">Neither party shall be liable for any delays in the performance of its obligations hereunder, other than payment obligations, arising out of or caused by, directly or indirectly, circumstances or causes beyond its control, including, without limitation, fire or other casualty, strike or </w:t>
-      </w:r>
-      <w:proofErr w:type="spellStart"/>
-      <w:r>
-        <w:t>labour</w:t>
-      </w:r>
-      <w:proofErr w:type="spellEnd"/>
-      <w:r>
-        <w:t xml:space="preserve"> dispute, war or other violence, any law, order or requirement of any governmental agency or authority, or any epidemic, pandemic or quarantine.</w:t>
+        <w:t>Neither party shall be liable for any delays in the performance of its obligations hereunder, other than payment obligations, arising out of or caused by, directly or indirectly, circumstances or causes beyond its control, including, without limitation, fire or other casualty, strike or labour dispute, war or other violence, any law, order or requirement of any governmental agency or authority, or any epidemic, pandemic or quarantine.</w:t>
       </w:r>
     </w:p>
     <w:p>
@@ -10187,27 +9207,7 @@
           <w:sz w:val="16"/>
           <w:szCs w:val="16"/>
         </w:rPr>
-        <w:t xml:space="preserve"> </w:t>
-      </w:r>
-      <w:proofErr w:type="gramStart"/>
-      <w:r>
-        <w:rPr>
-          <w:rFonts w:cs="Arial"/>
-          <w:color w:val="000000"/>
-          <w:sz w:val="16"/>
-          <w:szCs w:val="16"/>
-        </w:rPr>
-        <w:t>whether or not</w:t>
-      </w:r>
-      <w:proofErr w:type="gramEnd"/>
-      <w:r>
-        <w:rPr>
-          <w:rFonts w:cs="Arial"/>
-          <w:color w:val="000000"/>
-          <w:sz w:val="16"/>
-          <w:szCs w:val="16"/>
-        </w:rPr>
-        <w:t xml:space="preserve"> KPMG is </w:t>
+        <w:t xml:space="preserve"> whether or not KPMG is </w:t>
       </w:r>
       <w:r>
         <w:rPr>
@@ -10408,11 +9408,11 @@
         <w:spacing w:before="120"/>
         <w:ind w:left="270" w:hanging="270"/>
       </w:pPr>
-      <w:bookmarkStart w:id="33" w:name="_Hlk128570409"/>
+      <w:bookmarkStart w:id="34" w:name="_Hlk128570409"/>
       <w:r>
         <w:t>The parties consent and agree to the use of electronic signatures with respect to this Agreement and any other agreements, notices or communications contemplated hereby</w:t>
       </w:r>
-      <w:bookmarkEnd w:id="33"/>
+      <w:bookmarkEnd w:id="34"/>
       <w:r>
         <w:t>, where permissible by law.</w:t>
       </w:r>
@@ -10431,7 +9431,7 @@
         <w:spacing w:before="120"/>
         <w:ind w:left="270" w:hanging="270"/>
       </w:pPr>
-      <w:bookmarkStart w:id="34" w:name="_Hlk157697240"/>
+      <w:bookmarkStart w:id="35" w:name="_Hlk157697240"/>
       <w:r>
         <w:t>This Agreement shall be binding upon</w:t>
       </w:r>
@@ -10439,15 +9439,7 @@
         <w:t xml:space="preserve"> </w:t>
       </w:r>
       <w:r>
-        <w:t xml:space="preserve">and </w:t>
-      </w:r>
-      <w:proofErr w:type="spellStart"/>
-      <w:r>
-        <w:t>enure</w:t>
-      </w:r>
-      <w:proofErr w:type="spellEnd"/>
-      <w:r>
-        <w:t xml:space="preserve"> to the benefit of</w:t>
+        <w:t>and enure to the benefit of</w:t>
       </w:r>
       <w:r>
         <w:t xml:space="preserve"> the parties hereto and their respective successors</w:t>
@@ -10464,7 +9456,7 @@
       <w:r>
         <w:t>.</w:t>
       </w:r>
-      <w:bookmarkEnd w:id="34"/>
+      <w:bookmarkEnd w:id="35"/>
       <w:r>
         <w:t xml:space="preserve"> Except as expressly provided herein, neither party may assign or transfer any of its rights or obligations hereunder without the prior written consent of the other party. KPMG may assign its rights and obligations hereunder to any </w:t>
       </w:r>
@@ -10472,15 +9464,7 @@
         <w:t>A</w:t>
       </w:r>
       <w:r>
-        <w:t xml:space="preserve">ffiliate or successor in interest to all or substantially </w:t>
-      </w:r>
-      <w:proofErr w:type="gramStart"/>
-      <w:r>
-        <w:t>all of</w:t>
-      </w:r>
-      <w:proofErr w:type="gramEnd"/>
-      <w:r>
-        <w:t xml:space="preserve"> the assets or business of the relevant KPMG practice, without the consent of Client. </w:t>
+        <w:t xml:space="preserve">ffiliate or successor in interest to all or substantially all of the assets or business of the relevant KPMG practice, without the consent of Client. </w:t>
       </w:r>
     </w:p>
     <w:p>
@@ -10498,15 +9482,7 @@
         <w:ind w:left="270" w:hanging="270"/>
       </w:pPr>
       <w:r>
-        <w:t xml:space="preserve">The provisions of this Agreement shall only apply to the extent that they are not prohibited by a mandatory provision of applicable law, regulation or professional standards. If any of these provisions shall be held to be invalid, void or unenforceable, the remaining provisions shall not be affected, impaired or invalidated, and each such provision shall </w:t>
-      </w:r>
-      <w:proofErr w:type="gramStart"/>
-      <w:r>
-        <w:t>be valid and enforceable to the fullest extent</w:t>
-      </w:r>
-      <w:proofErr w:type="gramEnd"/>
-      <w:r>
-        <w:t xml:space="preserve"> permitted by law.</w:t>
+        <w:t>The provisions of this Agreement shall only apply to the extent that they are not prohibited by a mandatory provision of applicable law, regulation or professional standards. If any of these provisions shall be held to be invalid, void or unenforceable, the remaining provisions shall not be affected, impaired or invalidated, and each such provision shall be valid and enforceable to the fullest extent permitted by law.</w:t>
       </w:r>
     </w:p>
     <w:p>
@@ -10627,15 +9603,7 @@
         <w:ind w:left="270" w:hanging="270"/>
       </w:pPr>
       <w:r>
-        <w:t xml:space="preserve">This Agreement shall be subject to and governed by the laws of the </w:t>
-      </w:r>
-      <w:proofErr w:type="gramStart"/>
-      <w:r>
-        <w:t>Province</w:t>
-      </w:r>
-      <w:proofErr w:type="gramEnd"/>
-      <w:r>
-        <w:t xml:space="preserve"> in which KPMG’s principal Canadian office performing the engagement is located (without regard to such Province’s rules on conflicts of law).</w:t>
+        <w:t>This Agreement shall be subject to and governed by the laws of the Province in which KPMG’s principal Canadian office performing the engagement is located (without regard to such Province’s rules on conflicts of law).</w:t>
       </w:r>
     </w:p>
     <w:p>
@@ -10674,7 +9642,7 @@
           <w:smallCaps w:val="0"/>
         </w:rPr>
       </w:pPr>
-      <w:bookmarkStart w:id="35" w:name="_Ref153279735"/>
+      <w:bookmarkStart w:id="36" w:name="_Ref153279735"/>
       <w:r>
         <w:rPr>
           <w:rFonts w:ascii="Arial Bold" w:hAnsi="Arial Bold"/>
@@ -10683,14 +9651,14 @@
         </w:rPr>
         <w:t>Additional Terms for Tax Services.</w:t>
       </w:r>
-      <w:bookmarkEnd w:id="35"/>
+      <w:bookmarkEnd w:id="36"/>
     </w:p>
     <w:p>
       <w:pPr>
         <w:pStyle w:val="TnC0"/>
         <w:spacing w:before="120"/>
       </w:pPr>
-      <w:bookmarkStart w:id="36" w:name="_Hlk148546534"/>
+      <w:bookmarkStart w:id="37" w:name="_Hlk148546534"/>
       <w:r>
         <w:t>The following provisions also apply where KPMG is engaged to perform Canadian and/or United States</w:t>
       </w:r>
@@ -10705,7 +9673,7 @@
         <w:t>tax services:</w:t>
       </w:r>
     </w:p>
-    <w:bookmarkEnd w:id="36"/>
+    <w:bookmarkEnd w:id="37"/>
     <w:p>
       <w:pPr>
         <w:pStyle w:val="TnC0"/>
@@ -10727,31 +9695,7 @@
         <w:t>relevant</w:t>
       </w:r>
       <w:r>
-        <w:t xml:space="preserve"> taxing statutes, the regulations thereunder, applicable tax treaties and judicial and administrative interpretations thereof. In the case of Canadian tax services only, KPMG will also </w:t>
-      </w:r>
-      <w:proofErr w:type="gramStart"/>
-      <w:r>
-        <w:t>take into account</w:t>
-      </w:r>
-      <w:proofErr w:type="gramEnd"/>
-      <w:r>
-        <w:t xml:space="preserve"> all specific proposals to amend such statutes, regulations and treaties publicly announced prior to the date of KPMG's reports, based on the assumption that these amendments will be enacted substantially as proposed.  For certainty, in the case of US tax services, KPMG shall not </w:t>
-      </w:r>
-      <w:proofErr w:type="gramStart"/>
-      <w:r>
-        <w:t>take into account</w:t>
-      </w:r>
-      <w:proofErr w:type="gramEnd"/>
-      <w:r>
-        <w:t xml:space="preserve"> any specific proposals to amend such statutes, regulations and treaties. These authorities are subject to change, retroactively and/or prospectively, and any such changes could affect the validity of KPMG's advice and may result in incremental taxes, interest or penalties. KPMG’s advice will not otherwise </w:t>
-      </w:r>
-      <w:proofErr w:type="gramStart"/>
-      <w:r>
-        <w:t>take into account</w:t>
-      </w:r>
-      <w:proofErr w:type="gramEnd"/>
-      <w:r>
-        <w:t xml:space="preserve"> or anticipate any changes in law or practice, by way of judicial, governmental or legislative action or interpretation. Unless Client specifically requests otherwise, KPMG will not update tax work to take any such changes into account.</w:t>
+        <w:t xml:space="preserve"> taxing statutes, the regulations thereunder, applicable tax treaties and judicial and administrative interpretations thereof. In the case of Canadian tax services only, KPMG will also take into account all specific proposals to amend such statutes, regulations and treaties publicly announced prior to the date of KPMG's reports, based on the assumption that these amendments will be enacted substantially as proposed.  For certainty, in the case of US tax services, KPMG shall not take into account any specific proposals to amend such statutes, regulations and treaties. These authorities are subject to change, retroactively and/or prospectively, and any such changes could affect the validity of KPMG's advice and may result in incremental taxes, interest or penalties. KPMG’s advice will not otherwise take into account or anticipate any changes in law or practice, by way of judicial, governmental or legislative action or interpretation. Unless Client specifically requests otherwise, KPMG will not update tax work to take any such changes into account.</w:t>
       </w:r>
     </w:p>
     <w:p>
@@ -10787,23 +9731,7 @@
         <w:ind w:left="270" w:hanging="270"/>
       </w:pPr>
       <w:r>
-        <w:t xml:space="preserve">KPMG is not responsible for any taxes, penalties or interest assessed against Client, or for any form of loss suffered by Client, </w:t>
-      </w:r>
-      <w:proofErr w:type="gramStart"/>
-      <w:r>
-        <w:t>as a result of</w:t>
-      </w:r>
-      <w:proofErr w:type="gramEnd"/>
-      <w:r>
-        <w:t xml:space="preserve"> a failure by Client to (</w:t>
-      </w:r>
-      <w:proofErr w:type="spellStart"/>
-      <w:r>
-        <w:t>i</w:t>
-      </w:r>
-      <w:proofErr w:type="spellEnd"/>
-      <w:r>
-        <w:t>) provide KPMG with accurate and complete information or (ii) implement KPMG’s advice in accordance with KPMG’s recommendations.</w:t>
+        <w:t>KPMG is not responsible for any taxes, penalties or interest assessed against Client, or for any form of loss suffered by Client, as a result of a failure by Client to (i) provide KPMG with accurate and complete information or (ii) implement KPMG’s advice in accordance with KPMG’s recommendations.</w:t>
       </w:r>
     </w:p>
     <w:p>
@@ -10851,15 +9779,7 @@
         <w:t>Unless prevented by law, Client will use commercially reasonable efforts to inform KPMG if Client or any of Client’s other advisors is required to make an MDR Disclosure or if an MDR Disclosure was required prior to the engagement for any part of a series of transactions within the scope of the engagement. Client is advised to consult with a tax or legal professional service provider proficient in such MDRs for assistance in this regard; for greater certainty</w:t>
       </w:r>
       <w:r>
-        <w:t xml:space="preserve">, unless expressly provided for in the Engagement Letter, the Services do not include advice in relation to the application of, and compliance with, MDRs. To the fullest extent permitted by law, KPMG is not liable to Client for any consequences that may result or arise from or otherwise </w:t>
-      </w:r>
-      <w:proofErr w:type="gramStart"/>
-      <w:r>
-        <w:t>be connected with</w:t>
-      </w:r>
-      <w:proofErr w:type="gramEnd"/>
-      <w:r>
-        <w:t xml:space="preserve"> any MDR Disclosure made by KPMG or another Member Firm in good faith. </w:t>
+        <w:t xml:space="preserve">, unless expressly provided for in the Engagement Letter, the Services do not include advice in relation to the application of, and compliance with, MDRs. To the fullest extent permitted by law, KPMG is not liable to Client for any consequences that may result or arise from or otherwise be connected with any MDR Disclosure made by KPMG or another Member Firm in good faith. </w:t>
       </w:r>
     </w:p>
     <w:p>
@@ -10876,7 +9796,7 @@
         <w:spacing w:before="120"/>
         <w:ind w:left="270" w:hanging="270"/>
       </w:pPr>
-      <w:bookmarkStart w:id="37" w:name="_Ref159424221"/>
+      <w:bookmarkStart w:id="38" w:name="_Ref159424221"/>
       <w:r>
         <w:t xml:space="preserve">The prohibitions on Client set out in Sections </w:t>
       </w:r>
@@ -10920,39 +9840,7 @@
         <w:fldChar w:fldCharType="end"/>
       </w:r>
       <w:r>
-        <w:t xml:space="preserve"> of these Terms and Conditions regarding the disclosure, publication or other distribution of KPMG’s reports and written advice or information provided by KPMG, or any similar prohibition set out in the Engagement Letter, shall not apply, and no provision of this Agreement is or is intended to be construed as: (</w:t>
-      </w:r>
-      <w:proofErr w:type="spellStart"/>
-      <w:r>
-        <w:t>i</w:t>
-      </w:r>
-      <w:proofErr w:type="spellEnd"/>
-      <w:r>
-        <w:t>) confidential protection within the meaning of subsection 237.3(1) of the Income Tax Act (Canada) (the “ITA”) or any applicable regulations thereunder; (ii) a condition of confidentiality within the scope of the Internal Revenue Code of 1986 (“IRC”) section 6011 as implemented through Treasury Regulation 1.6011-4(b)(3)(</w:t>
-      </w:r>
-      <w:proofErr w:type="spellStart"/>
-      <w:r>
-        <w:t>i</w:t>
-      </w:r>
-      <w:proofErr w:type="spellEnd"/>
-      <w:r>
-        <w:t xml:space="preserve">) (without regard to references to payment or receipt of a minimum fee); or (iii) any similar confidentiality protection or condition under any similar or analogous provisions of the laws of any province, state or other jurisdiction. </w:t>
-      </w:r>
-      <w:proofErr w:type="gramStart"/>
-      <w:r>
-        <w:t>In particular, Client</w:t>
-      </w:r>
-      <w:proofErr w:type="gramEnd"/>
-      <w:r>
-        <w:t xml:space="preserve"> may disclose to </w:t>
-      </w:r>
-      <w:proofErr w:type="gramStart"/>
-      <w:r>
-        <w:t>any and all</w:t>
-      </w:r>
-      <w:proofErr w:type="gramEnd"/>
-      <w:r>
-        <w:t xml:space="preserve"> persons, without limitation of any kind, tax information, advice and other </w:t>
+        <w:t xml:space="preserve"> of these Terms and Conditions regarding the disclosure, publication or other distribution of KPMG’s reports and written advice or information provided by KPMG, or any similar prohibition set out in the Engagement Letter, shall not apply, and no provision of this Agreement is or is intended to be construed as: (i) confidential protection within the meaning of subsection 237.3(1) of the Income Tax Act (Canada) (the “ITA”) or any applicable regulations thereunder; (ii) a condition of confidentiality within the scope of the Internal Revenue Code of 1986 (“IRC”) section 6011 as implemented through Treasury Regulation 1.6011-4(b)(3)(i) (without regard to references to payment or receipt of a minimum fee); or (iii) any similar confidentiality protection or condition under any similar or analogous provisions of the laws of any province, state or other jurisdiction. In particular, Client may disclose to any and all persons, without limitation of any kind, tax information, advice and other </w:t>
       </w:r>
       <w:r>
         <w:t>materials KPMG provides to Client relating to the tax treatment, details or structure of a transaction or series of transactions within the scope of the engagement.</w:t>
@@ -10966,7 +9854,7 @@
       <w:r>
         <w:t>party advisor or promoter with respect to any transaction or series on which KPMG’s services are requested. Such notification must occur prior to KPMG providing any advice with respect to the transaction or series.</w:t>
       </w:r>
-      <w:bookmarkEnd w:id="37"/>
+      <w:bookmarkEnd w:id="38"/>
     </w:p>
     <w:p>
       <w:pPr>
@@ -10980,15 +9868,7 @@
       </w:pPr>
       <w:r>
         <w:lastRenderedPageBreak/>
-        <w:t>Notwithstanding the foregoing, Client acknowledges and agrees that all tax Services and Deliverables are designed to meet Client’s agreed requirements only, as determined by Client’s needs at the time, and are not suitable to be used by any party other than Client. KPMG assumes no responsibility and accepts no liability to any person or entity other than Client in respect of the tax Services and Deliverables. Accordingly, Client agrees, in connection with any disclosure by or on behalf of Client of any such information to a third party: (</w:t>
-      </w:r>
-      <w:proofErr w:type="spellStart"/>
-      <w:r>
-        <w:t>i</w:t>
-      </w:r>
-      <w:proofErr w:type="spellEnd"/>
-      <w:r>
-        <w:t xml:space="preserve">) </w:t>
+        <w:t xml:space="preserve">Notwithstanding the foregoing, Client acknowledges and agrees that all tax Services and Deliverables are designed to meet Client’s agreed requirements only, as determined by Client’s needs at the time, and are not suitable to be used by any party other than Client. KPMG assumes no responsibility and accepts no liability to any person or entity other than Client in respect of the tax Services and Deliverables. Accordingly, Client agrees, in connection with any disclosure by or on behalf of Client of any such information to a third party: (i) </w:t>
       </w:r>
       <w:r>
         <w:t xml:space="preserve">Client accepts the risk of such disclosure and will not hold KPMG responsible if such disclosure results in adversity to Client; (ii) </w:t>
@@ -11115,23 +9995,7 @@
           <w:bCs/>
           <w:lang w:val="en-CA"/>
         </w:rPr>
-        <w:t>As used herein, “Target” refers to the entity(</w:t>
-      </w:r>
-      <w:proofErr w:type="spellStart"/>
-      <w:r>
-        <w:rPr>
-          <w:bCs/>
-          <w:lang w:val="en-CA"/>
-        </w:rPr>
-        <w:t>ies</w:t>
-      </w:r>
-      <w:proofErr w:type="spellEnd"/>
-      <w:r>
-        <w:rPr>
-          <w:bCs/>
-          <w:lang w:val="en-CA"/>
-        </w:rPr>
-        <w:t>) or division(s) (which may include Client or divisions of Client) representing the subject of the due diligence assistance procedures, as set out in the Engagement Letter.</w:t>
+        <w:t>As used herein, “Target” refers to the entity(ies) or division(s) (which may include Client or divisions of Client) representing the subject of the due diligence assistance procedures, as set out in the Engagement Letter.</w:t>
       </w:r>
     </w:p>
     <w:p>
@@ -11214,7 +10078,7 @@
         <w:spacing w:before="120"/>
         <w:ind w:left="270" w:hanging="270"/>
       </w:pPr>
-      <w:bookmarkStart w:id="38" w:name="_Hlk149053271"/>
+      <w:bookmarkStart w:id="39" w:name="_Hlk149053271"/>
       <w:r>
         <w:t xml:space="preserve">If KPMG provides services to Target, Client agrees and acknowledges that </w:t>
       </w:r>
@@ -11233,7 +10097,7 @@
       <w:r>
         <w:t>require the KPMG team serving Client to disclose to the KPMG audit team serving Target information affecting the audit of Target.</w:t>
       </w:r>
-      <w:bookmarkEnd w:id="38"/>
+      <w:bookmarkEnd w:id="39"/>
     </w:p>
     <w:p>
       <w:pPr>
@@ -12087,23 +10951,7 @@
           <w:rFonts w:asciiTheme="minorHAnsi" w:hAnsiTheme="minorHAnsi" w:cstheme="minorHAnsi"/>
           <w:sz w:val="20"/>
         </w:rPr>
-        <w:t xml:space="preserve"> </w:t>
-      </w:r>
-      <w:proofErr w:type="gramStart"/>
-      <w:r>
-        <w:rPr>
-          <w:rFonts w:asciiTheme="minorHAnsi" w:hAnsiTheme="minorHAnsi" w:cstheme="minorHAnsi"/>
-          <w:sz w:val="20"/>
-        </w:rPr>
-        <w:t>are in agreement</w:t>
-      </w:r>
-      <w:proofErr w:type="gramEnd"/>
-      <w:r>
-        <w:rPr>
-          <w:rFonts w:asciiTheme="minorHAnsi" w:hAnsiTheme="minorHAnsi" w:cstheme="minorHAnsi"/>
-          <w:sz w:val="20"/>
-        </w:rPr>
-        <w:t xml:space="preserve"> with the terms of this letter and to the release of the Information to the Recipient and/or its professional advisors.</w:t>
+        <w:t xml:space="preserve"> are in agreement with the terms of this letter and to the release of the Information to the Recipient and/or its professional advisors.</w:t>
       </w:r>
     </w:p>
     <w:p>
@@ -13312,17 +12160,8 @@
           <w:rFonts w:ascii="Arial" w:hAnsi="Arial" w:cs="Arial"/>
           <w:sz w:val="20"/>
         </w:rPr>
-        <w:t xml:space="preserve">KPMG neither warrants nor represents that the Information is accurate, complete, sufficient or appropriate for any purpose contemplated by the Recipient or its professional </w:t>
-      </w:r>
-      <w:proofErr w:type="gramStart"/>
-      <w:r>
-        <w:rPr>
-          <w:rFonts w:ascii="Arial" w:hAnsi="Arial" w:cs="Arial"/>
-          <w:sz w:val="20"/>
-        </w:rPr>
-        <w:t>advisors;</w:t>
-      </w:r>
-      <w:proofErr w:type="gramEnd"/>
+        <w:t>KPMG neither warrants nor represents that the Information is accurate, complete, sufficient or appropriate for any purpose contemplated by the Recipient or its professional advisors;</w:t>
+      </w:r>
     </w:p>
     <w:p>
       <w:pPr>
@@ -13343,17 +12182,8 @@
           <w:rFonts w:ascii="Arial" w:hAnsi="Arial" w:cs="Arial"/>
           <w:sz w:val="20"/>
         </w:rPr>
-        <w:t xml:space="preserve">the Information is being provided by KPMG on a non-reliance basis, and KPMG shall not be liable for any reliance that the Recipient or its professional advisors may place on the </w:t>
-      </w:r>
-      <w:proofErr w:type="gramStart"/>
-      <w:r>
-        <w:rPr>
-          <w:rFonts w:ascii="Arial" w:hAnsi="Arial" w:cs="Arial"/>
-          <w:sz w:val="20"/>
-        </w:rPr>
-        <w:t>Information;</w:t>
-      </w:r>
-      <w:proofErr w:type="gramEnd"/>
+        <w:t>the Information is being provided by KPMG on a non-reliance basis, and KPMG shall not be liable for any reliance that the Recipient or its professional advisors may place on the Information;</w:t>
+      </w:r>
     </w:p>
     <w:p>
       <w:pPr>
@@ -13374,17 +12204,8 @@
           <w:rFonts w:ascii="Arial" w:hAnsi="Arial" w:cs="Arial"/>
           <w:sz w:val="20"/>
         </w:rPr>
-        <w:t xml:space="preserve">KPMG’s provision of the Information is not intended to replace any other inquiries or procedures that the Recipient or its professional advisors should undertake for their own </w:t>
-      </w:r>
-      <w:proofErr w:type="gramStart"/>
-      <w:r>
-        <w:rPr>
-          <w:rFonts w:ascii="Arial" w:hAnsi="Arial" w:cs="Arial"/>
-          <w:sz w:val="20"/>
-        </w:rPr>
-        <w:t>purposes;</w:t>
-      </w:r>
-      <w:proofErr w:type="gramEnd"/>
+        <w:t>KPMG’s provision of the Information is not intended to replace any other inquiries or procedures that the Recipient or its professional advisors should undertake for their own purposes;</w:t>
+      </w:r>
     </w:p>
     <w:p>
       <w:pPr>
@@ -13405,39 +12226,7 @@
           <w:rFonts w:ascii="Arial" w:hAnsi="Arial" w:cs="Arial"/>
           <w:sz w:val="20"/>
         </w:rPr>
-        <w:t xml:space="preserve">KPMG does not have any other duties, responsibilities or obligations to the Recipient or its professional advisors </w:t>
-      </w:r>
-      <w:proofErr w:type="gramStart"/>
-      <w:r>
-        <w:rPr>
-          <w:rFonts w:ascii="Arial" w:hAnsi="Arial" w:cs="Arial"/>
-          <w:sz w:val="20"/>
-        </w:rPr>
-        <w:t>as a result of</w:t>
-      </w:r>
-      <w:proofErr w:type="gramEnd"/>
-      <w:r>
-        <w:rPr>
-          <w:rFonts w:ascii="Arial" w:hAnsi="Arial" w:cs="Arial"/>
-          <w:sz w:val="20"/>
-        </w:rPr>
-        <w:t xml:space="preserve"> providing the </w:t>
-      </w:r>
-      <w:proofErr w:type="gramStart"/>
-      <w:r>
-        <w:rPr>
-          <w:rFonts w:ascii="Arial" w:hAnsi="Arial" w:cs="Arial"/>
-          <w:sz w:val="20"/>
-        </w:rPr>
-        <w:t>Information;</w:t>
-      </w:r>
-      <w:proofErr w:type="gramEnd"/>
-      <w:r>
-        <w:rPr>
-          <w:rFonts w:ascii="Arial" w:hAnsi="Arial" w:cs="Arial"/>
-          <w:sz w:val="20"/>
-        </w:rPr>
-        <w:t xml:space="preserve"> </w:t>
+        <w:t xml:space="preserve">KPMG does not have any other duties, responsibilities or obligations to the Recipient or its professional advisors as a result of providing the Information; </w:t>
       </w:r>
     </w:p>
     <w:p>
@@ -13497,23 +12286,7 @@
           <w:rFonts w:ascii="Arial" w:hAnsi="Arial" w:cs="Arial"/>
           <w:sz w:val="20"/>
         </w:rPr>
-        <w:t xml:space="preserve">if, notwithstanding the acknowledgement in paragraph e) above, a Claim is made against KPMG, the Recipient will fully release, indemnify and hold harmless KPMG from such Claims, including, without limitation, in respect of reasonable legal </w:t>
-      </w:r>
-      <w:proofErr w:type="gramStart"/>
-      <w:r>
-        <w:rPr>
-          <w:rFonts w:ascii="Arial" w:hAnsi="Arial" w:cs="Arial"/>
-          <w:sz w:val="20"/>
-        </w:rPr>
-        <w:t>fees;</w:t>
-      </w:r>
-      <w:proofErr w:type="gramEnd"/>
-      <w:r>
-        <w:rPr>
-          <w:rFonts w:ascii="Arial" w:hAnsi="Arial" w:cs="Arial"/>
-          <w:sz w:val="20"/>
-        </w:rPr>
-        <w:t xml:space="preserve"> </w:t>
+        <w:t xml:space="preserve">if, notwithstanding the acknowledgement in paragraph e) above, a Claim is made against KPMG, the Recipient will fully release, indemnify and hold harmless KPMG from such Claims, including, without limitation, in respect of reasonable legal fees; </w:t>
       </w:r>
     </w:p>
     <w:p>
@@ -13560,21 +12333,12 @@
           <w:sz w:val="20"/>
         </w:rPr>
       </w:pPr>
-      <w:proofErr w:type="gramStart"/>
       <w:r>
         <w:rPr>
           <w:rFonts w:ascii="Arial" w:hAnsi="Arial" w:cs="Arial"/>
           <w:sz w:val="20"/>
         </w:rPr>
-        <w:t>in the event that</w:t>
-      </w:r>
-      <w:proofErr w:type="gramEnd"/>
-      <w:r>
-        <w:rPr>
-          <w:rFonts w:ascii="Arial" w:hAnsi="Arial" w:cs="Arial"/>
-          <w:sz w:val="20"/>
-        </w:rPr>
-        <w:t xml:space="preserve"> disclosure of the Information is required by law or professional standards, the Recipient and its professional advisors shall notify KPMG promptly prior to making such disclosure unless prohibited from doing so under applicable law.</w:t>
+        <w:t>in the event that disclosure of the Information is required by law or professional standards, the Recipient and its professional advisors shall notify KPMG promptly prior to making such disclosure unless prohibited from doing so under applicable law.</w:t>
       </w:r>
     </w:p>
     <w:p>
@@ -15011,17 +13775,8 @@
           <w:rFonts w:ascii="Arial" w:hAnsi="Arial" w:cs="Arial"/>
           <w:sz w:val="20"/>
         </w:rPr>
-        <w:t xml:space="preserve">Procedures performed by KPMG LLP were limited in nature and extent to those which we believed would best fit our analysis, and, as such, may not necessarily disclose all significant matters about or reveal errors or instances of fraud, if any, in the underlying </w:t>
-      </w:r>
-      <w:proofErr w:type="gramStart"/>
-      <w:r>
-        <w:rPr>
-          <w:rFonts w:ascii="Arial" w:hAnsi="Arial" w:cs="Arial"/>
-          <w:sz w:val="20"/>
-        </w:rPr>
-        <w:t>information;</w:t>
-      </w:r>
-      <w:proofErr w:type="gramEnd"/>
+        <w:t>Procedures performed by KPMG LLP were limited in nature and extent to those which we believed would best fit our analysis, and, as such, may not necessarily disclose all significant matters about or reveal errors or instances of fraud, if any, in the underlying information;</w:t>
+      </w:r>
     </w:p>
     <w:p>
       <w:pPr>
@@ -15065,17 +13820,8 @@
           <w:rFonts w:ascii="Arial" w:hAnsi="Arial" w:cs="Arial"/>
           <w:sz w:val="20"/>
         </w:rPr>
-        <w:t xml:space="preserve">in our possession that we believe are relevant to your </w:t>
-      </w:r>
-      <w:proofErr w:type="gramStart"/>
-      <w:r>
-        <w:rPr>
-          <w:rFonts w:ascii="Arial" w:hAnsi="Arial" w:cs="Arial"/>
-          <w:sz w:val="20"/>
-        </w:rPr>
-        <w:t>procedures;</w:t>
-      </w:r>
-      <w:proofErr w:type="gramEnd"/>
+        <w:t>in our possession that we believe are relevant to your procedures;</w:t>
+      </w:r>
     </w:p>
     <w:p>
       <w:pPr>
@@ -15098,17 +13844,8 @@
           <w:rFonts w:ascii="Arial" w:hAnsi="Arial" w:cs="Arial"/>
           <w:sz w:val="20"/>
         </w:rPr>
-        <w:t xml:space="preserve">We are not aware of any material factual inaccuracies within the </w:t>
-      </w:r>
-      <w:proofErr w:type="gramStart"/>
-      <w:r>
-        <w:rPr>
-          <w:rFonts w:ascii="Arial" w:hAnsi="Arial" w:cs="Arial"/>
-          <w:sz w:val="20"/>
-        </w:rPr>
-        <w:t>report;</w:t>
-      </w:r>
-      <w:proofErr w:type="gramEnd"/>
+        <w:t>We are not aware of any material factual inaccuracies within the report;</w:t>
+      </w:r>
     </w:p>
     <w:p>
       <w:pPr>
@@ -15131,23 +13868,7 @@
           <w:rFonts w:ascii="Arial" w:hAnsi="Arial" w:cs="Arial"/>
           <w:sz w:val="20"/>
         </w:rPr>
-        <w:t xml:space="preserve">Opinions and representations which have been attributed to persons referred to in the report/named individuals are properly attributed to those </w:t>
-      </w:r>
-      <w:proofErr w:type="gramStart"/>
-      <w:r>
-        <w:rPr>
-          <w:rFonts w:ascii="Arial" w:hAnsi="Arial" w:cs="Arial"/>
-          <w:sz w:val="20"/>
-        </w:rPr>
-        <w:t>persons;</w:t>
-      </w:r>
-      <w:proofErr w:type="gramEnd"/>
-      <w:r>
-        <w:rPr>
-          <w:rFonts w:ascii="Arial" w:hAnsi="Arial" w:cs="Arial"/>
-          <w:sz w:val="20"/>
-        </w:rPr>
-        <w:t xml:space="preserve"> </w:t>
+        <w:t xml:space="preserve">Opinions and representations which have been attributed to persons referred to in the report/named individuals are properly attributed to those persons; </w:t>
       </w:r>
     </w:p>
     <w:p>
@@ -15925,7 +14646,7 @@
       </w:r>
     </w:p>
   </w:comment>
-  <w:comment w:id="2" w:author="Author" w:initials="A">
+  <w:comment w:id="3" w:author="Author" w:initials="A">
     <w:p>
       <w:pPr>
         <w:pStyle w:val="CommentText"/>
@@ -16485,7 +15206,7 @@
     <w:pPr>
       <w:framePr w:w="1644" w:wrap="around" w:vAnchor="page" w:hAnchor="page" w:x="1192" w:y="1305"/>
     </w:pPr>
-    <w:bookmarkStart w:id="3" w:name="FollowLogo"/>
+    <w:bookmarkStart w:id="4" w:name="FollowLogo"/>
     <w:r>
       <w:rPr>
         <w:noProof/>
@@ -16534,7 +15255,7 @@
       </w:drawing>
     </w:r>
   </w:p>
-  <w:bookmarkEnd w:id="3"/>
+  <w:bookmarkEnd w:id="4"/>
   <w:p>
     <w:pPr>
       <w:pStyle w:val="Header"/>
@@ -17152,21 +15873,7 @@
       <w:rPr>
         <w:sz w:val="20"/>
       </w:rPr>
-      <w:t xml:space="preserve">Toronto </w:t>
-    </w:r>
-    <w:proofErr w:type="gramStart"/>
-    <w:r>
-      <w:rPr>
-        <w:sz w:val="20"/>
-      </w:rPr>
-      <w:t>ON  M</w:t>
-    </w:r>
-    <w:proofErr w:type="gramEnd"/>
-    <w:r>
-      <w:rPr>
-        <w:sz w:val="20"/>
-      </w:rPr>
-      <w:t>5H 2S5</w:t>
+      <w:t>Toronto ON  M5H 2S5</w:t>
     </w:r>
   </w:p>
   <w:p>
@@ -17219,9 +15926,9 @@
         <w:sz w:val="20"/>
       </w:rPr>
     </w:pPr>
-    <w:bookmarkStart w:id="4" w:name="MainLogoHere"/>
-    <w:bookmarkStart w:id="5" w:name="MainLogo"/>
-    <w:bookmarkEnd w:id="4"/>
+    <w:bookmarkStart w:id="5" w:name="MainLogoHere"/>
+    <w:bookmarkStart w:id="6" w:name="MainLogo"/>
+    <w:bookmarkEnd w:id="5"/>
     <w:r>
       <w:rPr>
         <w:rFonts w:ascii="Univers for KPMG" w:hAnsi="Univers for KPMG"/>
@@ -17271,7 +15978,7 @@
         </wp:inline>
       </w:drawing>
     </w:r>
-    <w:bookmarkEnd w:id="5"/>
+    <w:bookmarkEnd w:id="6"/>
   </w:p>
   <w:p>
     <w:pPr>

</xml_diff>